<commit_message>
renaming table templates and refactoring ppc.docx
</commit_message>
<xml_diff>
--- a/src/main/resources/ppc.docx
+++ b/src/main/resources/ppc.docx
@@ -2631,7 +2631,7 @@
         <w:pStyle w:val="Heading1"/>
         <w:numPr>
           <w:ilvl w:val="0"/>
-          <w:numId w:val="2"/>
+          <w:numId w:val="1"/>
         </w:numPr>
         <w:spacing w:before="0" w:after="120"/>
         <w:rPr/>
@@ -2648,7 +2648,7 @@
         <w:pStyle w:val="Heading1"/>
         <w:numPr>
           <w:ilvl w:val="0"/>
-          <w:numId w:val="2"/>
+          <w:numId w:val="1"/>
         </w:numPr>
         <w:rPr/>
       </w:pPr>
@@ -2664,7 +2664,7 @@
         <w:pStyle w:val="Heading2"/>
         <w:numPr>
           <w:ilvl w:val="1"/>
-          <w:numId w:val="2"/>
+          <w:numId w:val="1"/>
         </w:numPr>
         <w:rPr/>
       </w:pPr>
@@ -3915,7 +3915,7 @@
         <w:pStyle w:val="Heading2"/>
         <w:numPr>
           <w:ilvl w:val="1"/>
-          <w:numId w:val="2"/>
+          <w:numId w:val="1"/>
         </w:numPr>
         <w:rPr/>
       </w:pPr>
@@ -5274,7 +5274,7 @@
         <w:pStyle w:val="Heading2"/>
         <w:numPr>
           <w:ilvl w:val="1"/>
-          <w:numId w:val="2"/>
+          <w:numId w:val="1"/>
         </w:numPr>
         <w:rPr/>
       </w:pPr>
@@ -11221,7 +11221,7 @@
         <w:pStyle w:val="Heading1"/>
         <w:numPr>
           <w:ilvl w:val="0"/>
-          <w:numId w:val="2"/>
+          <w:numId w:val="1"/>
         </w:numPr>
         <w:ind w:hanging="0" w:left="0"/>
         <w:rPr/>
@@ -11493,7 +11493,7 @@
         <w:pStyle w:val="Heading1"/>
         <w:numPr>
           <w:ilvl w:val="0"/>
-          <w:numId w:val="2"/>
+          <w:numId w:val="1"/>
         </w:numPr>
         <w:ind w:hanging="0" w:left="0"/>
         <w:rPr/>
@@ -11722,7 +11722,7 @@
         <w:pStyle w:val="Heading1"/>
         <w:numPr>
           <w:ilvl w:val="0"/>
-          <w:numId w:val="2"/>
+          <w:numId w:val="1"/>
         </w:numPr>
         <w:ind w:hanging="0" w:left="0"/>
         <w:rPr/>
@@ -11749,7 +11749,7 @@
         <w:pStyle w:val="BodyText"/>
         <w:rPr/>
       </w:pPr>
-      <w:bookmarkStart w:id="16" w:name="docs-internal-guid-8b205685-7fff-7ec9-4d"/>
+      <w:bookmarkStart w:id="16" w:name="docs-internal-guid-8b205685-7fff-7ec9-41"/>
       <w:bookmarkEnd w:id="16"/>
       <w:r>
         <w:rPr>
@@ -11837,7 +11837,7 @@
         <w:pStyle w:val="Heading1"/>
         <w:numPr>
           <w:ilvl w:val="0"/>
-          <w:numId w:val="2"/>
+          <w:numId w:val="1"/>
         </w:numPr>
         <w:ind w:hanging="0" w:left="0"/>
         <w:rPr/>
@@ -11938,7 +11938,7 @@
         <w:pStyle w:val="Heading2"/>
         <w:numPr>
           <w:ilvl w:val="1"/>
-          <w:numId w:val="2"/>
+          <w:numId w:val="1"/>
         </w:numPr>
         <w:rPr/>
       </w:pPr>
@@ -12029,7 +12029,7 @@
         <w:pStyle w:val="Heading3"/>
         <w:numPr>
           <w:ilvl w:val="2"/>
-          <w:numId w:val="2"/>
+          <w:numId w:val="1"/>
         </w:numPr>
         <w:rPr>
           <w:b w:val="false"/>
@@ -12098,7 +12098,7 @@
         <w:pStyle w:val="Heading3"/>
         <w:numPr>
           <w:ilvl w:val="2"/>
-          <w:numId w:val="2"/>
+          <w:numId w:val="1"/>
         </w:numPr>
         <w:rPr>
           <w:b w:val="false"/>
@@ -12256,7 +12256,7 @@
         <w:pStyle w:val="Heading3"/>
         <w:numPr>
           <w:ilvl w:val="2"/>
-          <w:numId w:val="2"/>
+          <w:numId w:val="1"/>
         </w:numPr>
         <w:rPr>
           <w:b w:val="false"/>
@@ -12329,7 +12329,7 @@
         <w:pStyle w:val="Heading3"/>
         <w:numPr>
           <w:ilvl w:val="2"/>
-          <w:numId w:val="2"/>
+          <w:numId w:val="1"/>
         </w:numPr>
         <w:rPr>
           <w:b w:val="false"/>
@@ -12366,7 +12366,7 @@
         <w:pStyle w:val="Heading1"/>
         <w:numPr>
           <w:ilvl w:val="0"/>
-          <w:numId w:val="2"/>
+          <w:numId w:val="1"/>
         </w:numPr>
         <w:rPr/>
       </w:pPr>
@@ -12472,7 +12472,7 @@
         <w:pStyle w:val="Heading2"/>
         <w:numPr>
           <w:ilvl w:val="1"/>
-          <w:numId w:val="2"/>
+          <w:numId w:val="1"/>
         </w:numPr>
         <w:ind w:hanging="0" w:left="0"/>
         <w:rPr/>
@@ -12595,7 +12595,7 @@
         <w:pStyle w:val="Heading2"/>
         <w:numPr>
           <w:ilvl w:val="1"/>
-          <w:numId w:val="2"/>
+          <w:numId w:val="1"/>
         </w:numPr>
         <w:ind w:hanging="0" w:left="0"/>
         <w:rPr/>
@@ -12724,7 +12724,7 @@
         <w:pStyle w:val="Heading1"/>
         <w:numPr>
           <w:ilvl w:val="0"/>
-          <w:numId w:val="2"/>
+          <w:numId w:val="1"/>
         </w:numPr>
         <w:rPr/>
       </w:pPr>
@@ -12740,7 +12740,7 @@
         <w:pStyle w:val="Heading2"/>
         <w:numPr>
           <w:ilvl w:val="1"/>
-          <w:numId w:val="2"/>
+          <w:numId w:val="1"/>
         </w:numPr>
         <w:rPr/>
       </w:pPr>
@@ -13415,7 +13415,7 @@
         <w:pStyle w:val="Heading2"/>
         <w:numPr>
           <w:ilvl w:val="1"/>
-          <w:numId w:val="2"/>
+          <w:numId w:val="1"/>
         </w:numPr>
         <w:rPr/>
       </w:pPr>
@@ -13810,7 +13810,7 @@
         <w:pStyle w:val="Heading2"/>
         <w:numPr>
           <w:ilvl w:val="1"/>
-          <w:numId w:val="2"/>
+          <w:numId w:val="1"/>
         </w:numPr>
         <w:rPr/>
       </w:pPr>
@@ -14165,7 +14165,7 @@
         <w:pStyle w:val="Heading2"/>
         <w:numPr>
           <w:ilvl w:val="1"/>
-          <w:numId w:val="2"/>
+          <w:numId w:val="1"/>
         </w:numPr>
         <w:rPr/>
       </w:pPr>
@@ -14368,7 +14368,7 @@
         <w:pStyle w:val="Heading2"/>
         <w:numPr>
           <w:ilvl w:val="1"/>
-          <w:numId w:val="2"/>
+          <w:numId w:val="1"/>
         </w:numPr>
         <w:rPr/>
       </w:pPr>
@@ -14971,7 +14971,7 @@
         <w:pStyle w:val="Heading2"/>
         <w:numPr>
           <w:ilvl w:val="1"/>
-          <w:numId w:val="2"/>
+          <w:numId w:val="1"/>
         </w:numPr>
         <w:rPr/>
       </w:pPr>
@@ -15529,7 +15529,7 @@
         <w:pStyle w:val="Heading2"/>
         <w:numPr>
           <w:ilvl w:val="1"/>
-          <w:numId w:val="2"/>
+          <w:numId w:val="1"/>
         </w:numPr>
         <w:rPr/>
       </w:pPr>
@@ -15835,7 +15835,7 @@
         <w:pStyle w:val="Heading1"/>
         <w:numPr>
           <w:ilvl w:val="0"/>
-          <w:numId w:val="2"/>
+          <w:numId w:val="1"/>
         </w:numPr>
         <w:rPr/>
       </w:pPr>
@@ -16220,7 +16220,7 @@
         <w:pStyle w:val="Heading1"/>
         <w:numPr>
           <w:ilvl w:val="0"/>
-          <w:numId w:val="2"/>
+          <w:numId w:val="1"/>
         </w:numPr>
         <w:rPr/>
       </w:pPr>
@@ -16370,7 +16370,7 @@
         <w:pStyle w:val="Heading1"/>
         <w:numPr>
           <w:ilvl w:val="0"/>
-          <w:numId w:val="2"/>
+          <w:numId w:val="1"/>
         </w:numPr>
         <w:rPr/>
       </w:pPr>
@@ -16386,7 +16386,7 @@
         <w:pStyle w:val="Heading2"/>
         <w:numPr>
           <w:ilvl w:val="1"/>
-          <w:numId w:val="2"/>
+          <w:numId w:val="1"/>
         </w:numPr>
         <w:rPr/>
       </w:pPr>
@@ -16589,7 +16589,7 @@
         <w:pStyle w:val="Heading1"/>
         <w:numPr>
           <w:ilvl w:val="0"/>
-          <w:numId w:val="2"/>
+          <w:numId w:val="1"/>
         </w:numPr>
         <w:rPr/>
       </w:pPr>
@@ -16697,7 +16697,7 @@
         <w:pStyle w:val="Heading2"/>
         <w:numPr>
           <w:ilvl w:val="1"/>
-          <w:numId w:val="2"/>
+          <w:numId w:val="1"/>
         </w:numPr>
         <w:rPr/>
       </w:pPr>
@@ -16822,7 +16822,7 @@
         <w:pStyle w:val="Heading2"/>
         <w:numPr>
           <w:ilvl w:val="1"/>
-          <w:numId w:val="2"/>
+          <w:numId w:val="1"/>
         </w:numPr>
         <w:rPr/>
       </w:pPr>
@@ -17044,7 +17044,7 @@
         <w:pStyle w:val="Heading2"/>
         <w:numPr>
           <w:ilvl w:val="1"/>
-          <w:numId w:val="2"/>
+          <w:numId w:val="1"/>
         </w:numPr>
         <w:rPr/>
       </w:pPr>
@@ -17168,146 +17168,6 @@
         <w:t>: Desenho Curricular</w:t>
       </w:r>
     </w:p>
-    <w:tbl>
-      <w:tblPr>
-        <w:tblW w:w="9645" w:type="dxa"/>
-        <w:jc w:val="left"/>
-        <w:tblInd w:w="99" w:type="dxa"/>
-        <w:tblLayout w:type="fixed"/>
-        <w:tblCellMar>
-          <w:top w:w="100" w:type="dxa"/>
-          <w:left w:w="100" w:type="dxa"/>
-          <w:bottom w:w="100" w:type="dxa"/>
-          <w:right w:w="100" w:type="dxa"/>
-        </w:tblCellMar>
-      </w:tblPr>
-      <w:tblGrid>
-        <w:gridCol w:w="1738"/>
-        <w:gridCol w:w="1739"/>
-        <w:gridCol w:w="1739"/>
-        <w:gridCol w:w="1739"/>
-        <w:gridCol w:w="2690"/>
-      </w:tblGrid>
-      <w:tr>
-        <w:trPr/>
-        <w:tc>
-          <w:tcPr>
-            <w:tcW w:w="1738" w:type="dxa"/>
-            <w:tcBorders>
-              <w:top w:val="single" w:sz="8" w:space="0" w:color="000000"/>
-              <w:left w:val="single" w:sz="8" w:space="0" w:color="000000"/>
-              <w:right w:val="single" w:sz="8" w:space="0" w:color="000000"/>
-            </w:tcBorders>
-            <w:vAlign w:val="center"/>
-          </w:tcPr>
-          <w:p>
-            <w:pPr>
-              <w:pStyle w:val="TableHeading"/>
-              <w:rPr/>
-            </w:pPr>
-            <w:r>
-              <w:rPr/>
-              <w:t>Componente Curricular</w:t>
-            </w:r>
-          </w:p>
-        </w:tc>
-        <w:tc>
-          <w:tcPr>
-            <w:tcW w:w="1739" w:type="dxa"/>
-            <w:tcBorders>
-              <w:top w:val="single" w:sz="8" w:space="0" w:color="000000"/>
-              <w:left w:val="single" w:sz="8" w:space="0" w:color="000000"/>
-              <w:right w:val="single" w:sz="8" w:space="0" w:color="000000"/>
-            </w:tcBorders>
-            <w:vAlign w:val="center"/>
-          </w:tcPr>
-          <w:p>
-            <w:pPr>
-              <w:pStyle w:val="TableHeading"/>
-              <w:rPr/>
-            </w:pPr>
-            <w:r>
-              <w:rPr/>
-              <w:t>Carga Horária (h/a)</w:t>
-            </w:r>
-          </w:p>
-        </w:tc>
-        <w:tc>
-          <w:tcPr>
-            <w:tcW w:w="1739" w:type="dxa"/>
-            <w:tcBorders>
-              <w:top w:val="single" w:sz="8" w:space="0" w:color="000000"/>
-              <w:left w:val="single" w:sz="8" w:space="0" w:color="000000"/>
-              <w:right w:val="single" w:sz="8" w:space="0" w:color="000000"/>
-            </w:tcBorders>
-            <w:vAlign w:val="center"/>
-          </w:tcPr>
-          <w:p>
-            <w:pPr>
-              <w:pStyle w:val="TableHeading"/>
-              <w:rPr/>
-            </w:pPr>
-            <w:r>
-              <w:rPr/>
-              <w:t>Período</w:t>
-            </w:r>
-          </w:p>
-        </w:tc>
-        <w:tc>
-          <w:tcPr>
-            <w:tcW w:w="1739" w:type="dxa"/>
-            <w:tcBorders>
-              <w:top w:val="single" w:sz="8" w:space="0" w:color="000000"/>
-              <w:left w:val="single" w:sz="8" w:space="0" w:color="000000"/>
-              <w:right w:val="single" w:sz="8" w:space="0" w:color="000000"/>
-            </w:tcBorders>
-            <w:vAlign w:val="center"/>
-          </w:tcPr>
-          <w:p>
-            <w:pPr>
-              <w:pStyle w:val="TableHeading"/>
-              <w:rPr/>
-            </w:pPr>
-            <w:r>
-              <w:rPr/>
-              <w:t>Pré-Requisito</w:t>
-            </w:r>
-          </w:p>
-        </w:tc>
-        <w:tc>
-          <w:tcPr>
-            <w:tcW w:w="2690" w:type="dxa"/>
-            <w:tcBorders>
-              <w:top w:val="single" w:sz="8" w:space="0" w:color="000000"/>
-              <w:left w:val="single" w:sz="8" w:space="0" w:color="000000"/>
-              <w:right w:val="single" w:sz="8" w:space="0" w:color="000000"/>
-            </w:tcBorders>
-            <w:vAlign w:val="center"/>
-          </w:tcPr>
-          <w:p>
-            <w:pPr>
-              <w:pStyle w:val="TableHeading"/>
-              <w:rPr/>
-            </w:pPr>
-            <w:r>
-              <w:rPr/>
-              <w:t>Co-Requisito</w:t>
-            </w:r>
-          </w:p>
-        </w:tc>
-      </w:tr>
-    </w:tbl>
-    <w:p>
-      <w:pPr>
-        <w:pStyle w:val="BodyText"/>
-        <w:spacing w:lineRule="auto" w:line="288" w:before="0" w:after="0"/>
-        <w:jc w:val="both"/>
-        <w:rPr/>
-      </w:pPr>
-      <w:r>
-        <w:rPr/>
-      </w:r>
-    </w:p>
     <w:p>
       <w:pPr>
         <w:sectPr>
@@ -17333,6 +17193,7 @@
       </w:pPr>
       <w:r>
         <w:rPr/>
+        <w:t>@@desenho_curricular@@</w:t>
       </w:r>
     </w:p>
     <w:p>
@@ -17340,7 +17201,7 @@
         <w:pStyle w:val="Heading2"/>
         <w:numPr>
           <w:ilvl w:val="1"/>
-          <w:numId w:val="2"/>
+          <w:numId w:val="1"/>
         </w:numPr>
         <w:rPr/>
       </w:pPr>
@@ -17454,7 +17315,7 @@
         <w:pStyle w:val="Heading2"/>
         <w:numPr>
           <w:ilvl w:val="1"/>
-          <w:numId w:val="2"/>
+          <w:numId w:val="1"/>
         </w:numPr>
         <w:rPr/>
       </w:pPr>
@@ -17562,7 +17423,211 @@
           <w:effect w:val="none"/>
           <w:shd w:fill="FFFFFF" w:val="clear"/>
         </w:rPr>
-        <w:t>@@matriz@@</w:t>
+        <w:t>@@matriz</w:t>
+      </w:r>
+      <w:r>
+        <w:rPr>
+          <w:rFonts w:ascii="Times New Roman;serif" w:hAnsi="Times New Roman;serif"/>
+          <w:b w:val="false"/>
+          <w:i w:val="false"/>
+          <w:caps w:val="false"/>
+          <w:smallCaps w:val="false"/>
+          <w:strike w:val="false"/>
+          <w:dstrike w:val="false"/>
+          <w:color w:val="000000"/>
+          <w:sz w:val="22"/>
+          <w:u w:val="none"/>
+          <w:effect w:val="none"/>
+          <w:shd w:fill="FFFFFF" w:val="clear"/>
+        </w:rPr>
+        <w:t>_</w:t>
+      </w:r>
+      <w:r>
+        <w:rPr>
+          <w:rFonts w:ascii="Times New Roman;serif" w:hAnsi="Times New Roman;serif"/>
+          <w:b w:val="false"/>
+          <w:i w:val="false"/>
+          <w:caps w:val="false"/>
+          <w:smallCaps w:val="false"/>
+          <w:strike w:val="false"/>
+          <w:dstrike w:val="false"/>
+          <w:color w:val="000000"/>
+          <w:sz w:val="22"/>
+          <w:u w:val="none"/>
+          <w:effect w:val="none"/>
+          <w:shd w:fill="FFFFFF" w:val="clear"/>
+        </w:rPr>
+        <w:t>c</w:t>
+      </w:r>
+      <w:r>
+        <w:rPr>
+          <w:rFonts w:ascii="Times New Roman;serif" w:hAnsi="Times New Roman;serif"/>
+          <w:b w:val="false"/>
+          <w:i w:val="false"/>
+          <w:caps w:val="false"/>
+          <w:smallCaps w:val="false"/>
+          <w:strike w:val="false"/>
+          <w:dstrike w:val="false"/>
+          <w:color w:val="000000"/>
+          <w:sz w:val="22"/>
+          <w:u w:val="none"/>
+          <w:effect w:val="none"/>
+          <w:shd w:fill="FFFFFF" w:val="clear"/>
+        </w:rPr>
+        <w:t>u</w:t>
+      </w:r>
+      <w:r>
+        <w:rPr>
+          <w:rFonts w:ascii="Times New Roman;serif" w:hAnsi="Times New Roman;serif"/>
+          <w:b w:val="false"/>
+          <w:i w:val="false"/>
+          <w:caps w:val="false"/>
+          <w:smallCaps w:val="false"/>
+          <w:strike w:val="false"/>
+          <w:dstrike w:val="false"/>
+          <w:color w:val="000000"/>
+          <w:sz w:val="22"/>
+          <w:u w:val="none"/>
+          <w:effect w:val="none"/>
+          <w:shd w:fill="FFFFFF" w:val="clear"/>
+        </w:rPr>
+        <w:t>r</w:t>
+      </w:r>
+      <w:r>
+        <w:rPr>
+          <w:rFonts w:ascii="Times New Roman;serif" w:hAnsi="Times New Roman;serif"/>
+          <w:b w:val="false"/>
+          <w:i w:val="false"/>
+          <w:caps w:val="false"/>
+          <w:smallCaps w:val="false"/>
+          <w:strike w:val="false"/>
+          <w:dstrike w:val="false"/>
+          <w:color w:val="000000"/>
+          <w:sz w:val="22"/>
+          <w:u w:val="none"/>
+          <w:effect w:val="none"/>
+          <w:shd w:fill="FFFFFF" w:val="clear"/>
+        </w:rPr>
+        <w:t>r</w:t>
+      </w:r>
+      <w:r>
+        <w:rPr>
+          <w:rFonts w:ascii="Times New Roman;serif" w:hAnsi="Times New Roman;serif"/>
+          <w:b w:val="false"/>
+          <w:i w:val="false"/>
+          <w:caps w:val="false"/>
+          <w:smallCaps w:val="false"/>
+          <w:strike w:val="false"/>
+          <w:dstrike w:val="false"/>
+          <w:color w:val="000000"/>
+          <w:sz w:val="22"/>
+          <w:u w:val="none"/>
+          <w:effect w:val="none"/>
+          <w:shd w:fill="FFFFFF" w:val="clear"/>
+        </w:rPr>
+        <w:t>i</w:t>
+      </w:r>
+      <w:r>
+        <w:rPr>
+          <w:rFonts w:ascii="Times New Roman;serif" w:hAnsi="Times New Roman;serif"/>
+          <w:b w:val="false"/>
+          <w:i w:val="false"/>
+          <w:caps w:val="false"/>
+          <w:smallCaps w:val="false"/>
+          <w:strike w:val="false"/>
+          <w:dstrike w:val="false"/>
+          <w:color w:val="000000"/>
+          <w:sz w:val="22"/>
+          <w:u w:val="none"/>
+          <w:effect w:val="none"/>
+          <w:shd w:fill="FFFFFF" w:val="clear"/>
+        </w:rPr>
+        <w:t>c</w:t>
+      </w:r>
+      <w:r>
+        <w:rPr>
+          <w:rFonts w:ascii="Times New Roman;serif" w:hAnsi="Times New Roman;serif"/>
+          <w:b w:val="false"/>
+          <w:i w:val="false"/>
+          <w:caps w:val="false"/>
+          <w:smallCaps w:val="false"/>
+          <w:strike w:val="false"/>
+          <w:dstrike w:val="false"/>
+          <w:color w:val="000000"/>
+          <w:sz w:val="22"/>
+          <w:u w:val="none"/>
+          <w:effect w:val="none"/>
+          <w:shd w:fill="FFFFFF" w:val="clear"/>
+        </w:rPr>
+        <w:t>u</w:t>
+      </w:r>
+      <w:r>
+        <w:rPr>
+          <w:rFonts w:ascii="Times New Roman;serif" w:hAnsi="Times New Roman;serif"/>
+          <w:b w:val="false"/>
+          <w:i w:val="false"/>
+          <w:caps w:val="false"/>
+          <w:smallCaps w:val="false"/>
+          <w:strike w:val="false"/>
+          <w:dstrike w:val="false"/>
+          <w:color w:val="000000"/>
+          <w:sz w:val="22"/>
+          <w:u w:val="none"/>
+          <w:effect w:val="none"/>
+          <w:shd w:fill="FFFFFF" w:val="clear"/>
+        </w:rPr>
+        <w:t>l</w:t>
+      </w:r>
+      <w:r>
+        <w:rPr>
+          <w:rFonts w:ascii="Times New Roman;serif" w:hAnsi="Times New Roman;serif"/>
+          <w:b w:val="false"/>
+          <w:i w:val="false"/>
+          <w:caps w:val="false"/>
+          <w:smallCaps w:val="false"/>
+          <w:strike w:val="false"/>
+          <w:dstrike w:val="false"/>
+          <w:color w:val="000000"/>
+          <w:sz w:val="22"/>
+          <w:u w:val="none"/>
+          <w:effect w:val="none"/>
+          <w:shd w:fill="FFFFFF" w:val="clear"/>
+        </w:rPr>
+        <w:t>a</w:t>
+      </w:r>
+      <w:r>
+        <w:rPr>
+          <w:rFonts w:ascii="Times New Roman;serif" w:hAnsi="Times New Roman;serif"/>
+          <w:b w:val="false"/>
+          <w:i w:val="false"/>
+          <w:caps w:val="false"/>
+          <w:smallCaps w:val="false"/>
+          <w:strike w:val="false"/>
+          <w:dstrike w:val="false"/>
+          <w:color w:val="000000"/>
+          <w:sz w:val="22"/>
+          <w:u w:val="none"/>
+          <w:effect w:val="none"/>
+          <w:shd w:fill="FFFFFF" w:val="clear"/>
+        </w:rPr>
+        <w:t>r</w:t>
+      </w:r>
+      <w:r>
+        <w:rPr>
+          <w:rFonts w:ascii="Times New Roman;serif" w:hAnsi="Times New Roman;serif"/>
+          <w:b w:val="false"/>
+          <w:i w:val="false"/>
+          <w:caps w:val="false"/>
+          <w:smallCaps w:val="false"/>
+          <w:strike w:val="false"/>
+          <w:dstrike w:val="false"/>
+          <w:color w:val="000000"/>
+          <w:sz w:val="22"/>
+          <w:u w:val="none"/>
+          <w:effect w:val="none"/>
+          <w:shd w:fill="FFFFFF" w:val="clear"/>
+        </w:rPr>
+        <w:t>@@</w:t>
       </w:r>
     </w:p>
     <w:p>
@@ -17570,7 +17635,7 @@
         <w:pStyle w:val="Heading3"/>
         <w:numPr>
           <w:ilvl w:val="2"/>
-          <w:numId w:val="2"/>
+          <w:numId w:val="1"/>
         </w:numPr>
         <w:rPr>
           <w:b w:val="false"/>
@@ -17768,635 +17833,6 @@
         <w:t>: Componentes Optativos</w:t>
       </w:r>
     </w:p>
-    <w:tbl>
-      <w:tblPr>
-        <w:tblW w:w="9645" w:type="dxa"/>
-        <w:jc w:val="left"/>
-        <w:tblInd w:w="99" w:type="dxa"/>
-        <w:tblLayout w:type="fixed"/>
-        <w:tblCellMar>
-          <w:top w:w="100" w:type="dxa"/>
-          <w:left w:w="100" w:type="dxa"/>
-          <w:bottom w:w="100" w:type="dxa"/>
-          <w:right w:w="100" w:type="dxa"/>
-        </w:tblCellMar>
-      </w:tblPr>
-      <w:tblGrid>
-        <w:gridCol w:w="1454"/>
-        <w:gridCol w:w="1605"/>
-        <w:gridCol w:w="1277"/>
-        <w:gridCol w:w="717"/>
-        <w:gridCol w:w="543"/>
-        <w:gridCol w:w="1713"/>
-        <w:gridCol w:w="2336"/>
-      </w:tblGrid>
-      <w:tr>
-        <w:trPr/>
-        <w:tc>
-          <w:tcPr>
-            <w:tcW w:w="1454" w:type="dxa"/>
-            <w:vMerge w:val="restart"/>
-            <w:tcBorders>
-              <w:top w:val="single" w:sz="8" w:space="0" w:color="000000"/>
-              <w:left w:val="single" w:sz="8" w:space="0" w:color="000000"/>
-              <w:right w:val="single" w:sz="8" w:space="0" w:color="000000"/>
-            </w:tcBorders>
-            <w:vAlign w:val="center"/>
-          </w:tcPr>
-          <w:p>
-            <w:pPr>
-              <w:pStyle w:val="TableContents"/>
-              <w:widowControl/>
-              <w:bidi w:val="0"/>
-              <w:spacing w:lineRule="auto" w:line="288" w:before="0" w:after="0"/>
-              <w:ind w:hanging="0" w:left="0" w:right="0"/>
-              <w:jc w:val="both"/>
-              <w:rPr>
-                <w:rFonts w:ascii="Times New Roman;serif" w:hAnsi="Times New Roman;serif"/>
-                <w:b/>
-                <w:i w:val="false"/>
-                <w:i w:val="false"/>
-                <w:caps w:val="false"/>
-                <w:smallCaps w:val="false"/>
-                <w:strike w:val="false"/>
-                <w:dstrike w:val="false"/>
-                <w:color w:val="000000"/>
-                <w:sz w:val="22"/>
-                <w:u w:val="none"/>
-                <w:effect w:val="none"/>
-                <w:shd w:fill="auto" w:val="clear"/>
-              </w:rPr>
-            </w:pPr>
-            <w:r>
-              <w:rPr>
-                <w:rFonts w:ascii="Times New Roman;serif" w:hAnsi="Times New Roman;serif"/>
-                <w:b/>
-                <w:i w:val="false"/>
-                <w:caps w:val="false"/>
-                <w:smallCaps w:val="false"/>
-                <w:strike w:val="false"/>
-                <w:dstrike w:val="false"/>
-                <w:color w:val="000000"/>
-                <w:sz w:val="22"/>
-                <w:u w:val="none"/>
-                <w:effect w:val="none"/>
-                <w:shd w:fill="auto" w:val="clear"/>
-              </w:rPr>
-            </w:r>
-          </w:p>
-          <w:p>
-            <w:pPr>
-              <w:pStyle w:val="TableHeading"/>
-              <w:rPr/>
-            </w:pPr>
-            <w:r>
-              <w:rPr/>
-              <w:t>Código</w:t>
-            </w:r>
-          </w:p>
-        </w:tc>
-        <w:tc>
-          <w:tcPr>
-            <w:tcW w:w="1605" w:type="dxa"/>
-            <w:vMerge w:val="restart"/>
-            <w:tcBorders>
-              <w:top w:val="single" w:sz="8" w:space="0" w:color="000000"/>
-              <w:left w:val="single" w:sz="8" w:space="0" w:color="000000"/>
-              <w:right w:val="single" w:sz="8" w:space="0" w:color="000000"/>
-            </w:tcBorders>
-            <w:vAlign w:val="center"/>
-          </w:tcPr>
-          <w:p>
-            <w:pPr>
-              <w:pStyle w:val="TableContents"/>
-              <w:widowControl/>
-              <w:bidi w:val="0"/>
-              <w:spacing w:lineRule="auto" w:line="288" w:before="0" w:after="0"/>
-              <w:ind w:hanging="0" w:left="0" w:right="0"/>
-              <w:jc w:val="both"/>
-              <w:rPr>
-                <w:rFonts w:ascii="Times New Roman;serif" w:hAnsi="Times New Roman;serif"/>
-                <w:b/>
-                <w:i w:val="false"/>
-                <w:i w:val="false"/>
-                <w:caps w:val="false"/>
-                <w:smallCaps w:val="false"/>
-                <w:strike w:val="false"/>
-                <w:dstrike w:val="false"/>
-                <w:color w:val="000000"/>
-                <w:sz w:val="22"/>
-                <w:u w:val="none"/>
-                <w:effect w:val="none"/>
-                <w:shd w:fill="auto" w:val="clear"/>
-              </w:rPr>
-            </w:pPr>
-            <w:r>
-              <w:rPr>
-                <w:rFonts w:ascii="Times New Roman;serif" w:hAnsi="Times New Roman;serif"/>
-                <w:b/>
-                <w:i w:val="false"/>
-                <w:caps w:val="false"/>
-                <w:smallCaps w:val="false"/>
-                <w:strike w:val="false"/>
-                <w:dstrike w:val="false"/>
-                <w:color w:val="000000"/>
-                <w:sz w:val="22"/>
-                <w:u w:val="none"/>
-                <w:effect w:val="none"/>
-                <w:shd w:fill="auto" w:val="clear"/>
-              </w:rPr>
-            </w:r>
-          </w:p>
-          <w:p>
-            <w:pPr>
-              <w:pStyle w:val="TableHeading"/>
-              <w:rPr/>
-            </w:pPr>
-            <w:r>
-              <w:rPr/>
-              <w:t>Componentes</w:t>
-              <w:br/>
-              <w:t>Curriculares</w:t>
-            </w:r>
-          </w:p>
-        </w:tc>
-        <w:tc>
-          <w:tcPr>
-            <w:tcW w:w="1277" w:type="dxa"/>
-            <w:vMerge w:val="restart"/>
-            <w:tcBorders>
-              <w:top w:val="single" w:sz="8" w:space="0" w:color="000000"/>
-              <w:left w:val="single" w:sz="8" w:space="0" w:color="000000"/>
-              <w:right w:val="single" w:sz="8" w:space="0" w:color="000000"/>
-            </w:tcBorders>
-            <w:vAlign w:val="center"/>
-          </w:tcPr>
-          <w:p>
-            <w:pPr>
-              <w:pStyle w:val="TableContents"/>
-              <w:widowControl/>
-              <w:bidi w:val="0"/>
-              <w:spacing w:lineRule="auto" w:line="288" w:before="0" w:after="0"/>
-              <w:ind w:hanging="0" w:left="0" w:right="0"/>
-              <w:jc w:val="both"/>
-              <w:rPr>
-                <w:rFonts w:ascii="Times New Roman;serif" w:hAnsi="Times New Roman;serif"/>
-                <w:b/>
-                <w:i w:val="false"/>
-                <w:i w:val="false"/>
-                <w:caps w:val="false"/>
-                <w:smallCaps w:val="false"/>
-                <w:strike w:val="false"/>
-                <w:dstrike w:val="false"/>
-                <w:color w:val="000000"/>
-                <w:sz w:val="22"/>
-                <w:u w:val="none"/>
-                <w:effect w:val="none"/>
-                <w:shd w:fill="auto" w:val="clear"/>
-              </w:rPr>
-            </w:pPr>
-            <w:r>
-              <w:rPr>
-                <w:rFonts w:ascii="Times New Roman;serif" w:hAnsi="Times New Roman;serif"/>
-                <w:b/>
-                <w:i w:val="false"/>
-                <w:caps w:val="false"/>
-                <w:smallCaps w:val="false"/>
-                <w:strike w:val="false"/>
-                <w:dstrike w:val="false"/>
-                <w:color w:val="000000"/>
-                <w:sz w:val="22"/>
-                <w:u w:val="none"/>
-                <w:effect w:val="none"/>
-                <w:shd w:fill="auto" w:val="clear"/>
-              </w:rPr>
-            </w:r>
-          </w:p>
-          <w:p>
-            <w:pPr>
-              <w:pStyle w:val="TableHeading"/>
-              <w:rPr/>
-            </w:pPr>
-            <w:r>
-              <w:rPr/>
-              <w:t>Créditos</w:t>
-            </w:r>
-          </w:p>
-        </w:tc>
-        <w:tc>
-          <w:tcPr>
-            <w:tcW w:w="1260" w:type="dxa"/>
-            <w:gridSpan w:val="2"/>
-            <w:tcBorders>
-              <w:top w:val="single" w:sz="8" w:space="0" w:color="000000"/>
-              <w:left w:val="single" w:sz="8" w:space="0" w:color="000000"/>
-              <w:right w:val="single" w:sz="8" w:space="0" w:color="000000"/>
-            </w:tcBorders>
-            <w:vAlign w:val="center"/>
-          </w:tcPr>
-          <w:p>
-            <w:pPr>
-              <w:pStyle w:val="TableHeading"/>
-              <w:rPr/>
-            </w:pPr>
-            <w:r>
-              <w:rPr/>
-              <w:t>Total de Horas</w:t>
-            </w:r>
-          </w:p>
-        </w:tc>
-        <w:tc>
-          <w:tcPr>
-            <w:tcW w:w="1713" w:type="dxa"/>
-            <w:vMerge w:val="restart"/>
-            <w:tcBorders>
-              <w:top w:val="single" w:sz="8" w:space="0" w:color="000000"/>
-              <w:left w:val="single" w:sz="8" w:space="0" w:color="000000"/>
-            </w:tcBorders>
-            <w:vAlign w:val="center"/>
-          </w:tcPr>
-          <w:p>
-            <w:pPr>
-              <w:pStyle w:val="TableContents"/>
-              <w:widowControl/>
-              <w:bidi w:val="0"/>
-              <w:spacing w:lineRule="auto" w:line="288" w:before="0" w:after="0"/>
-              <w:ind w:hanging="0" w:left="0" w:right="0"/>
-              <w:jc w:val="both"/>
-              <w:rPr>
-                <w:rFonts w:ascii="Times New Roman;serif" w:hAnsi="Times New Roman;serif"/>
-                <w:b/>
-                <w:i w:val="false"/>
-                <w:i w:val="false"/>
-                <w:caps w:val="false"/>
-                <w:smallCaps w:val="false"/>
-                <w:strike w:val="false"/>
-                <w:dstrike w:val="false"/>
-                <w:color w:val="000000"/>
-                <w:sz w:val="22"/>
-                <w:u w:val="none"/>
-                <w:effect w:val="none"/>
-                <w:shd w:fill="auto" w:val="clear"/>
-              </w:rPr>
-            </w:pPr>
-            <w:r>
-              <w:rPr>
-                <w:rFonts w:ascii="Times New Roman;serif" w:hAnsi="Times New Roman;serif"/>
-                <w:b/>
-                <w:i w:val="false"/>
-                <w:caps w:val="false"/>
-                <w:smallCaps w:val="false"/>
-                <w:strike w:val="false"/>
-                <w:dstrike w:val="false"/>
-                <w:color w:val="000000"/>
-                <w:sz w:val="22"/>
-                <w:u w:val="none"/>
-                <w:effect w:val="none"/>
-                <w:shd w:fill="auto" w:val="clear"/>
-              </w:rPr>
-            </w:r>
-          </w:p>
-          <w:p>
-            <w:pPr>
-              <w:pStyle w:val="TableHeading"/>
-              <w:rPr/>
-            </w:pPr>
-            <w:r>
-              <w:rPr/>
-              <w:t>Pré-requisitos</w:t>
-            </w:r>
-          </w:p>
-        </w:tc>
-        <w:tc>
-          <w:tcPr>
-            <w:tcW w:w="2336" w:type="dxa"/>
-            <w:vMerge w:val="restart"/>
-            <w:tcBorders>
-              <w:top w:val="single" w:sz="8" w:space="0" w:color="000000"/>
-              <w:left w:val="single" w:sz="8" w:space="0" w:color="000000"/>
-              <w:right w:val="single" w:sz="8" w:space="0" w:color="000000"/>
-            </w:tcBorders>
-            <w:vAlign w:val="center"/>
-          </w:tcPr>
-          <w:p>
-            <w:pPr>
-              <w:pStyle w:val="TableHeading"/>
-              <w:rPr/>
-            </w:pPr>
-            <w:r>
-              <w:rPr/>
-              <w:t>Correquisitos</w:t>
-            </w:r>
-          </w:p>
-        </w:tc>
-      </w:tr>
-      <w:tr>
-        <w:trPr/>
-        <w:tc>
-          <w:tcPr>
-            <w:tcW w:w="1454" w:type="dxa"/>
-            <w:vMerge w:val="continue"/>
-            <w:tcBorders>
-              <w:top w:val="single" w:sz="8" w:space="0" w:color="000000"/>
-              <w:left w:val="single" w:sz="8" w:space="0" w:color="000000"/>
-              <w:right w:val="single" w:sz="8" w:space="0" w:color="000000"/>
-            </w:tcBorders>
-            <w:vAlign w:val="center"/>
-          </w:tcPr>
-          <w:p>
-            <w:pPr>
-              <w:pStyle w:val="TableContents"/>
-              <w:widowControl/>
-              <w:bidi w:val="0"/>
-              <w:spacing w:lineRule="auto" w:line="288" w:before="0" w:after="0"/>
-              <w:ind w:hanging="0" w:left="0" w:right="0"/>
-              <w:jc w:val="both"/>
-              <w:rPr>
-                <w:rFonts w:ascii="Times New Roman;serif" w:hAnsi="Times New Roman;serif"/>
-                <w:b/>
-                <w:i w:val="false"/>
-                <w:i w:val="false"/>
-                <w:caps w:val="false"/>
-                <w:smallCaps w:val="false"/>
-                <w:strike w:val="false"/>
-                <w:dstrike w:val="false"/>
-                <w:color w:val="000000"/>
-                <w:sz w:val="22"/>
-                <w:u w:val="none"/>
-                <w:effect w:val="none"/>
-                <w:shd w:fill="auto" w:val="clear"/>
-              </w:rPr>
-            </w:pPr>
-            <w:r>
-              <w:rPr>
-                <w:rFonts w:ascii="Times New Roman;serif" w:hAnsi="Times New Roman;serif"/>
-                <w:b/>
-                <w:i w:val="false"/>
-                <w:caps w:val="false"/>
-                <w:smallCaps w:val="false"/>
-                <w:strike w:val="false"/>
-                <w:dstrike w:val="false"/>
-                <w:color w:val="000000"/>
-                <w:sz w:val="22"/>
-                <w:u w:val="none"/>
-                <w:effect w:val="none"/>
-                <w:shd w:fill="auto" w:val="clear"/>
-              </w:rPr>
-            </w:r>
-          </w:p>
-        </w:tc>
-        <w:tc>
-          <w:tcPr>
-            <w:tcW w:w="1605" w:type="dxa"/>
-            <w:vMerge w:val="continue"/>
-            <w:tcBorders>
-              <w:top w:val="single" w:sz="8" w:space="0" w:color="000000"/>
-              <w:left w:val="single" w:sz="8" w:space="0" w:color="000000"/>
-              <w:right w:val="single" w:sz="8" w:space="0" w:color="000000"/>
-            </w:tcBorders>
-            <w:vAlign w:val="center"/>
-          </w:tcPr>
-          <w:p>
-            <w:pPr>
-              <w:pStyle w:val="TableContents"/>
-              <w:widowControl/>
-              <w:bidi w:val="0"/>
-              <w:spacing w:lineRule="auto" w:line="288" w:before="0" w:after="0"/>
-              <w:ind w:hanging="0" w:left="0" w:right="0"/>
-              <w:jc w:val="both"/>
-              <w:rPr>
-                <w:rFonts w:ascii="Times New Roman;serif" w:hAnsi="Times New Roman;serif"/>
-                <w:b/>
-                <w:i w:val="false"/>
-                <w:i w:val="false"/>
-                <w:caps w:val="false"/>
-                <w:smallCaps w:val="false"/>
-                <w:strike w:val="false"/>
-                <w:dstrike w:val="false"/>
-                <w:color w:val="000000"/>
-                <w:sz w:val="22"/>
-                <w:u w:val="none"/>
-                <w:effect w:val="none"/>
-                <w:shd w:fill="auto" w:val="clear"/>
-              </w:rPr>
-            </w:pPr>
-            <w:r>
-              <w:rPr>
-                <w:rFonts w:ascii="Times New Roman;serif" w:hAnsi="Times New Roman;serif"/>
-                <w:b/>
-                <w:i w:val="false"/>
-                <w:caps w:val="false"/>
-                <w:smallCaps w:val="false"/>
-                <w:strike w:val="false"/>
-                <w:dstrike w:val="false"/>
-                <w:color w:val="000000"/>
-                <w:sz w:val="22"/>
-                <w:u w:val="none"/>
-                <w:effect w:val="none"/>
-                <w:shd w:fill="auto" w:val="clear"/>
-              </w:rPr>
-            </w:r>
-          </w:p>
-        </w:tc>
-        <w:tc>
-          <w:tcPr>
-            <w:tcW w:w="1277" w:type="dxa"/>
-            <w:vMerge w:val="continue"/>
-            <w:tcBorders>
-              <w:top w:val="single" w:sz="8" w:space="0" w:color="000000"/>
-              <w:left w:val="single" w:sz="8" w:space="0" w:color="000000"/>
-              <w:right w:val="single" w:sz="8" w:space="0" w:color="000000"/>
-            </w:tcBorders>
-            <w:vAlign w:val="center"/>
-          </w:tcPr>
-          <w:p>
-            <w:pPr>
-              <w:pStyle w:val="TableContents"/>
-              <w:widowControl/>
-              <w:bidi w:val="0"/>
-              <w:spacing w:lineRule="auto" w:line="288" w:before="0" w:after="0"/>
-              <w:ind w:hanging="0" w:left="0" w:right="0"/>
-              <w:jc w:val="both"/>
-              <w:rPr>
-                <w:rFonts w:ascii="Times New Roman;serif" w:hAnsi="Times New Roman;serif"/>
-                <w:b/>
-                <w:i w:val="false"/>
-                <w:i w:val="false"/>
-                <w:caps w:val="false"/>
-                <w:smallCaps w:val="false"/>
-                <w:strike w:val="false"/>
-                <w:dstrike w:val="false"/>
-                <w:color w:val="000000"/>
-                <w:sz w:val="22"/>
-                <w:u w:val="none"/>
-                <w:effect w:val="none"/>
-                <w:shd w:fill="auto" w:val="clear"/>
-              </w:rPr>
-            </w:pPr>
-            <w:r>
-              <w:rPr>
-                <w:rFonts w:ascii="Times New Roman;serif" w:hAnsi="Times New Roman;serif"/>
-                <w:b/>
-                <w:i w:val="false"/>
-                <w:caps w:val="false"/>
-                <w:smallCaps w:val="false"/>
-                <w:strike w:val="false"/>
-                <w:dstrike w:val="false"/>
-                <w:color w:val="000000"/>
-                <w:sz w:val="22"/>
-                <w:u w:val="none"/>
-                <w:effect w:val="none"/>
-                <w:shd w:fill="auto" w:val="clear"/>
-              </w:rPr>
-            </w:r>
-          </w:p>
-        </w:tc>
-        <w:tc>
-          <w:tcPr>
-            <w:tcW w:w="717" w:type="dxa"/>
-            <w:tcBorders>
-              <w:left w:val="single" w:sz="8" w:space="0" w:color="000000"/>
-            </w:tcBorders>
-            <w:vAlign w:val="center"/>
-          </w:tcPr>
-          <w:p>
-            <w:pPr>
-              <w:pStyle w:val="TableHeading"/>
-              <w:rPr/>
-            </w:pPr>
-            <w:r>
-              <w:rPr/>
-              <w:t>h/a</w:t>
-            </w:r>
-          </w:p>
-        </w:tc>
-        <w:tc>
-          <w:tcPr>
-            <w:tcW w:w="543" w:type="dxa"/>
-            <w:tcBorders>
-              <w:left w:val="single" w:sz="8" w:space="0" w:color="000000"/>
-              <w:right w:val="single" w:sz="8" w:space="0" w:color="000000"/>
-            </w:tcBorders>
-            <w:vAlign w:val="center"/>
-          </w:tcPr>
-          <w:p>
-            <w:pPr>
-              <w:pStyle w:val="TableHeading"/>
-              <w:rPr/>
-            </w:pPr>
-            <w:r>
-              <w:rPr/>
-              <w:t>h/r</w:t>
-            </w:r>
-          </w:p>
-        </w:tc>
-        <w:tc>
-          <w:tcPr>
-            <w:tcW w:w="1713" w:type="dxa"/>
-            <w:vMerge w:val="continue"/>
-            <w:tcBorders>
-              <w:top w:val="single" w:sz="8" w:space="0" w:color="000000"/>
-              <w:left w:val="single" w:sz="8" w:space="0" w:color="000000"/>
-            </w:tcBorders>
-            <w:vAlign w:val="center"/>
-          </w:tcPr>
-          <w:p>
-            <w:pPr>
-              <w:pStyle w:val="TableContents"/>
-              <w:widowControl/>
-              <w:bidi w:val="0"/>
-              <w:spacing w:lineRule="auto" w:line="288" w:before="0" w:after="0"/>
-              <w:ind w:hanging="0" w:left="0" w:right="0"/>
-              <w:jc w:val="both"/>
-              <w:rPr>
-                <w:rFonts w:ascii="Times New Roman;serif" w:hAnsi="Times New Roman;serif"/>
-                <w:b/>
-                <w:i w:val="false"/>
-                <w:i w:val="false"/>
-                <w:caps w:val="false"/>
-                <w:smallCaps w:val="false"/>
-                <w:strike w:val="false"/>
-                <w:dstrike w:val="false"/>
-                <w:color w:val="000000"/>
-                <w:sz w:val="22"/>
-                <w:u w:val="none"/>
-                <w:effect w:val="none"/>
-                <w:shd w:fill="auto" w:val="clear"/>
-              </w:rPr>
-            </w:pPr>
-            <w:r>
-              <w:rPr>
-                <w:rFonts w:ascii="Times New Roman;serif" w:hAnsi="Times New Roman;serif"/>
-                <w:b/>
-                <w:i w:val="false"/>
-                <w:caps w:val="false"/>
-                <w:smallCaps w:val="false"/>
-                <w:strike w:val="false"/>
-                <w:dstrike w:val="false"/>
-                <w:color w:val="000000"/>
-                <w:sz w:val="22"/>
-                <w:u w:val="none"/>
-                <w:effect w:val="none"/>
-                <w:shd w:fill="auto" w:val="clear"/>
-              </w:rPr>
-            </w:r>
-          </w:p>
-        </w:tc>
-        <w:tc>
-          <w:tcPr>
-            <w:tcW w:w="2336" w:type="dxa"/>
-            <w:vMerge w:val="continue"/>
-            <w:tcBorders>
-              <w:top w:val="single" w:sz="8" w:space="0" w:color="000000"/>
-              <w:left w:val="single" w:sz="8" w:space="0" w:color="000000"/>
-              <w:right w:val="single" w:sz="8" w:space="0" w:color="000000"/>
-            </w:tcBorders>
-            <w:vAlign w:val="center"/>
-          </w:tcPr>
-          <w:p>
-            <w:pPr>
-              <w:pStyle w:val="TableContents"/>
-              <w:widowControl/>
-              <w:bidi w:val="0"/>
-              <w:spacing w:lineRule="auto" w:line="288" w:before="0" w:after="0"/>
-              <w:ind w:hanging="0" w:left="0" w:right="0"/>
-              <w:jc w:val="both"/>
-              <w:rPr>
-                <w:rFonts w:ascii="Times New Roman;serif" w:hAnsi="Times New Roman;serif"/>
-                <w:b/>
-                <w:i w:val="false"/>
-                <w:i w:val="false"/>
-                <w:caps w:val="false"/>
-                <w:smallCaps w:val="false"/>
-                <w:strike w:val="false"/>
-                <w:dstrike w:val="false"/>
-                <w:color w:val="000000"/>
-                <w:sz w:val="22"/>
-                <w:u w:val="none"/>
-                <w:effect w:val="none"/>
-                <w:shd w:fill="auto" w:val="clear"/>
-              </w:rPr>
-            </w:pPr>
-            <w:r>
-              <w:rPr>
-                <w:rFonts w:ascii="Times New Roman;serif" w:hAnsi="Times New Roman;serif"/>
-                <w:b/>
-                <w:i w:val="false"/>
-                <w:caps w:val="false"/>
-                <w:smallCaps w:val="false"/>
-                <w:strike w:val="false"/>
-                <w:dstrike w:val="false"/>
-                <w:color w:val="000000"/>
-                <w:sz w:val="22"/>
-                <w:u w:val="none"/>
-                <w:effect w:val="none"/>
-                <w:shd w:fill="auto" w:val="clear"/>
-              </w:rPr>
-            </w:r>
-          </w:p>
-        </w:tc>
-      </w:tr>
-    </w:tbl>
     <w:p>
       <w:pPr>
         <w:pStyle w:val="BodyText"/>
@@ -18406,6 +17842,7 @@
       </w:pPr>
       <w:r>
         <w:rPr/>
+        <w:t>@@componentes_optativos@@</w:t>
       </w:r>
     </w:p>
     <w:p>
@@ -18413,7 +17850,7 @@
         <w:pStyle w:val="Heading3"/>
         <w:numPr>
           <w:ilvl w:val="2"/>
-          <w:numId w:val="2"/>
+          <w:numId w:val="1"/>
         </w:numPr>
         <w:rPr>
           <w:b w:val="false"/>
@@ -18492,7 +17929,7 @@
         <w:pStyle w:val="Heading3"/>
         <w:numPr>
           <w:ilvl w:val="2"/>
-          <w:numId w:val="2"/>
+          <w:numId w:val="1"/>
         </w:numPr>
         <w:rPr>
           <w:b w:val="false"/>
@@ -18573,7 +18010,7 @@
         <w:pStyle w:val="Heading1"/>
         <w:numPr>
           <w:ilvl w:val="0"/>
-          <w:numId w:val="2"/>
+          <w:numId w:val="1"/>
         </w:numPr>
         <w:rPr/>
       </w:pPr>
@@ -18656,7 +18093,7 @@
         <w:pStyle w:val="Heading2"/>
         <w:numPr>
           <w:ilvl w:val="1"/>
-          <w:numId w:val="2"/>
+          <w:numId w:val="1"/>
         </w:numPr>
         <w:rPr/>
       </w:pPr>
@@ -19660,7 +19097,7 @@
         <w:pStyle w:val="Heading1"/>
         <w:numPr>
           <w:ilvl w:val="0"/>
-          <w:numId w:val="2"/>
+          <w:numId w:val="1"/>
         </w:numPr>
         <w:rPr/>
       </w:pPr>
@@ -19750,7 +19187,7 @@
         <w:pStyle w:val="Heading1"/>
         <w:numPr>
           <w:ilvl w:val="0"/>
-          <w:numId w:val="2"/>
+          <w:numId w:val="1"/>
         </w:numPr>
         <w:rPr/>
       </w:pPr>
@@ -19794,7 +19231,7 @@
         <w:pStyle w:val="Heading2"/>
         <w:numPr>
           <w:ilvl w:val="1"/>
-          <w:numId w:val="2"/>
+          <w:numId w:val="1"/>
         </w:numPr>
         <w:rPr/>
       </w:pPr>
@@ -21878,7 +21315,7 @@
         <w:pStyle w:val="Heading1"/>
         <w:numPr>
           <w:ilvl w:val="0"/>
-          <w:numId w:val="2"/>
+          <w:numId w:val="1"/>
         </w:numPr>
         <w:rPr/>
       </w:pPr>
@@ -21946,7 +21383,7 @@
         <w:pStyle w:val="Heading1"/>
         <w:numPr>
           <w:ilvl w:val="0"/>
-          <w:numId w:val="2"/>
+          <w:numId w:val="1"/>
         </w:numPr>
         <w:rPr/>
       </w:pPr>
@@ -22228,7 +21665,7 @@
         <w:pStyle w:val="Heading1"/>
         <w:numPr>
           <w:ilvl w:val="0"/>
-          <w:numId w:val="2"/>
+          <w:numId w:val="1"/>
         </w:numPr>
         <w:rPr/>
       </w:pPr>
@@ -22435,7 +21872,7 @@
         <w:pStyle w:val="Heading1"/>
         <w:numPr>
           <w:ilvl w:val="0"/>
-          <w:numId w:val="2"/>
+          <w:numId w:val="1"/>
         </w:numPr>
         <w:rPr/>
       </w:pPr>
@@ -22634,7 +22071,7 @@
         <w:pStyle w:val="Heading1"/>
         <w:numPr>
           <w:ilvl w:val="0"/>
-          <w:numId w:val="2"/>
+          <w:numId w:val="1"/>
         </w:numPr>
         <w:rPr/>
       </w:pPr>
@@ -22760,7 +22197,7 @@
         <w:pStyle w:val="Heading1"/>
         <w:numPr>
           <w:ilvl w:val="0"/>
-          <w:numId w:val="2"/>
+          <w:numId w:val="1"/>
         </w:numPr>
         <w:rPr/>
       </w:pPr>
@@ -22963,7 +22400,7 @@
         <w:pStyle w:val="Heading1"/>
         <w:numPr>
           <w:ilvl w:val="0"/>
-          <w:numId w:val="2"/>
+          <w:numId w:val="1"/>
         </w:numPr>
         <w:rPr/>
       </w:pPr>
@@ -22979,7 +22416,7 @@
         <w:pStyle w:val="Heading2"/>
         <w:numPr>
           <w:ilvl w:val="1"/>
-          <w:numId w:val="2"/>
+          <w:numId w:val="1"/>
         </w:numPr>
         <w:rPr/>
       </w:pPr>
@@ -23227,7 +22664,7 @@
         <w:pStyle w:val="Heading2"/>
         <w:numPr>
           <w:ilvl w:val="1"/>
-          <w:numId w:val="2"/>
+          <w:numId w:val="1"/>
         </w:numPr>
         <w:rPr/>
       </w:pPr>
@@ -23276,7 +22713,7 @@
         <w:pStyle w:val="Heading2"/>
         <w:numPr>
           <w:ilvl w:val="1"/>
-          <w:numId w:val="2"/>
+          <w:numId w:val="1"/>
         </w:numPr>
         <w:rPr/>
       </w:pPr>
@@ -23544,7 +22981,7 @@
         <w:pStyle w:val="Heading2"/>
         <w:numPr>
           <w:ilvl w:val="1"/>
-          <w:numId w:val="2"/>
+          <w:numId w:val="1"/>
         </w:numPr>
         <w:rPr/>
       </w:pPr>
@@ -23958,7 +23395,7 @@
         <w:pStyle w:val="Heading1"/>
         <w:numPr>
           <w:ilvl w:val="0"/>
-          <w:numId w:val="2"/>
+          <w:numId w:val="1"/>
         </w:numPr>
         <w:rPr/>
       </w:pPr>
@@ -24142,7 +23579,7 @@
         <w:pStyle w:val="Heading1"/>
         <w:numPr>
           <w:ilvl w:val="0"/>
-          <w:numId w:val="2"/>
+          <w:numId w:val="1"/>
         </w:numPr>
         <w:rPr/>
       </w:pPr>
@@ -24345,7 +23782,7 @@
         <w:pStyle w:val="Heading1"/>
         <w:numPr>
           <w:ilvl w:val="0"/>
-          <w:numId w:val="2"/>
+          <w:numId w:val="1"/>
         </w:numPr>
         <w:rPr/>
       </w:pPr>
@@ -24472,7 +23909,7 @@
         <w:pStyle w:val="Heading2"/>
         <w:numPr>
           <w:ilvl w:val="1"/>
-          <w:numId w:val="2"/>
+          <w:numId w:val="1"/>
         </w:numPr>
         <w:spacing w:before="200" w:after="120"/>
         <w:rPr/>
@@ -25855,7 +25292,7 @@
         <w:pStyle w:val="Heading2"/>
         <w:numPr>
           <w:ilvl w:val="1"/>
-          <w:numId w:val="2"/>
+          <w:numId w:val="1"/>
         </w:numPr>
         <w:rPr/>
       </w:pPr>
@@ -25984,7 +25421,7 @@
         <w:pStyle w:val="Heading1"/>
         <w:numPr>
           <w:ilvl w:val="0"/>
-          <w:numId w:val="2"/>
+          <w:numId w:val="1"/>
         </w:numPr>
         <w:rPr/>
       </w:pPr>
@@ -26009,19 +25446,19 @@
         </w:tblCellMar>
       </w:tblPr>
       <w:tblGrid>
-        <w:gridCol w:w="379"/>
-        <w:gridCol w:w="1421"/>
+        <w:gridCol w:w="378"/>
+        <w:gridCol w:w="1422"/>
         <w:gridCol w:w="1700"/>
         <w:gridCol w:w="1595"/>
         <w:gridCol w:w="1531"/>
-        <w:gridCol w:w="1973"/>
-        <w:gridCol w:w="1091"/>
+        <w:gridCol w:w="1972"/>
+        <w:gridCol w:w="1092"/>
       </w:tblGrid>
       <w:tr>
         <w:trPr/>
         <w:tc>
           <w:tcPr>
-            <w:tcW w:w="379" w:type="dxa"/>
+            <w:tcW w:w="378" w:type="dxa"/>
             <w:tcBorders>
               <w:top w:val="single" w:sz="8" w:space="0" w:color="000000"/>
               <w:left w:val="single" w:sz="8" w:space="0" w:color="000000"/>
@@ -26047,7 +25484,7 @@
         </w:tc>
         <w:tc>
           <w:tcPr>
-            <w:tcW w:w="1421" w:type="dxa"/>
+            <w:tcW w:w="1422" w:type="dxa"/>
             <w:tcBorders>
               <w:top w:val="single" w:sz="8" w:space="0" w:color="000000"/>
               <w:left w:val="single" w:sz="8" w:space="0" w:color="000000"/>
@@ -26152,7 +25589,7 @@
         </w:tc>
         <w:tc>
           <w:tcPr>
-            <w:tcW w:w="1973" w:type="dxa"/>
+            <w:tcW w:w="1972" w:type="dxa"/>
             <w:tcBorders>
               <w:top w:val="single" w:sz="8" w:space="0" w:color="000000"/>
               <w:left w:val="single" w:sz="8" w:space="0" w:color="000000"/>
@@ -26178,7 +25615,7 @@
         </w:tc>
         <w:tc>
           <w:tcPr>
-            <w:tcW w:w="1091" w:type="dxa"/>
+            <w:tcW w:w="1092" w:type="dxa"/>
             <w:tcBorders>
               <w:top w:val="single" w:sz="8" w:space="0" w:color="000000"/>
               <w:left w:val="single" w:sz="8" w:space="0" w:color="000000"/>
@@ -26208,7 +25645,7 @@
         <w:trPr/>
         <w:tc>
           <w:tcPr>
-            <w:tcW w:w="379" w:type="dxa"/>
+            <w:tcW w:w="378" w:type="dxa"/>
             <w:tcBorders>
               <w:left w:val="single" w:sz="8" w:space="0" w:color="000000"/>
             </w:tcBorders>
@@ -26226,7 +25663,7 @@
         </w:tc>
         <w:tc>
           <w:tcPr>
-            <w:tcW w:w="1421" w:type="dxa"/>
+            <w:tcW w:w="1422" w:type="dxa"/>
             <w:tcBorders>
               <w:left w:val="single" w:sz="8" w:space="0" w:color="000000"/>
               <w:right w:val="single" w:sz="8" w:space="0" w:color="000000"/>
@@ -26299,7 +25736,7 @@
         </w:tc>
         <w:tc>
           <w:tcPr>
-            <w:tcW w:w="1973" w:type="dxa"/>
+            <w:tcW w:w="1972" w:type="dxa"/>
             <w:tcBorders>
               <w:left w:val="single" w:sz="8" w:space="0" w:color="000000"/>
             </w:tcBorders>
@@ -26317,7 +25754,7 @@
         </w:tc>
         <w:tc>
           <w:tcPr>
-            <w:tcW w:w="1091" w:type="dxa"/>
+            <w:tcW w:w="1092" w:type="dxa"/>
             <w:tcBorders>
               <w:left w:val="single" w:sz="8" w:space="0" w:color="000000"/>
               <w:right w:val="single" w:sz="8" w:space="0" w:color="000000"/>
@@ -26339,7 +25776,7 @@
         <w:trPr/>
         <w:tc>
           <w:tcPr>
-            <w:tcW w:w="379" w:type="dxa"/>
+            <w:tcW w:w="378" w:type="dxa"/>
             <w:tcBorders>
               <w:left w:val="single" w:sz="8" w:space="0" w:color="000000"/>
             </w:tcBorders>
@@ -26357,7 +25794,7 @@
         </w:tc>
         <w:tc>
           <w:tcPr>
-            <w:tcW w:w="1421" w:type="dxa"/>
+            <w:tcW w:w="1422" w:type="dxa"/>
             <w:tcBorders>
               <w:left w:val="single" w:sz="8" w:space="0" w:color="000000"/>
               <w:right w:val="single" w:sz="8" w:space="0" w:color="000000"/>
@@ -26430,7 +25867,7 @@
         </w:tc>
         <w:tc>
           <w:tcPr>
-            <w:tcW w:w="1973" w:type="dxa"/>
+            <w:tcW w:w="1972" w:type="dxa"/>
             <w:tcBorders>
               <w:left w:val="single" w:sz="8" w:space="0" w:color="000000"/>
             </w:tcBorders>
@@ -26448,7 +25885,7 @@
         </w:tc>
         <w:tc>
           <w:tcPr>
-            <w:tcW w:w="1091" w:type="dxa"/>
+            <w:tcW w:w="1092" w:type="dxa"/>
             <w:tcBorders>
               <w:left w:val="single" w:sz="8" w:space="0" w:color="000000"/>
               <w:right w:val="single" w:sz="8" w:space="0" w:color="000000"/>
@@ -26490,7 +25927,7 @@
         <w:pStyle w:val="Heading1"/>
         <w:numPr>
           <w:ilvl w:val="0"/>
-          <w:numId w:val="2"/>
+          <w:numId w:val="1"/>
         </w:numPr>
         <w:rPr/>
       </w:pPr>
@@ -26516,7 +25953,7 @@
         <w:pStyle w:val="Heading1"/>
         <w:numPr>
           <w:ilvl w:val="0"/>
-          <w:numId w:val="2"/>
+          <w:numId w:val="1"/>
         </w:numPr>
         <w:rPr/>
       </w:pPr>
@@ -26588,8 +26025,8 @@
       </w:tblPr>
       <w:tblGrid>
         <w:gridCol w:w="780"/>
-        <w:gridCol w:w="1406"/>
-        <w:gridCol w:w="1789"/>
+        <w:gridCol w:w="1405"/>
+        <w:gridCol w:w="1790"/>
         <w:gridCol w:w="1678"/>
         <w:gridCol w:w="2420"/>
         <w:gridCol w:w="1677"/>
@@ -26657,7 +26094,7 @@
         </w:tc>
         <w:tc>
           <w:tcPr>
-            <w:tcW w:w="1406" w:type="dxa"/>
+            <w:tcW w:w="1405" w:type="dxa"/>
             <w:tcBorders>
               <w:top w:val="single" w:sz="8" w:space="0" w:color="000000"/>
               <w:left w:val="single" w:sz="8" w:space="0" w:color="000000"/>
@@ -26714,7 +26151,7 @@
         </w:tc>
         <w:tc>
           <w:tcPr>
-            <w:tcW w:w="1789" w:type="dxa"/>
+            <w:tcW w:w="1790" w:type="dxa"/>
             <w:tcBorders>
               <w:top w:val="single" w:sz="8" w:space="0" w:color="000000"/>
               <w:left w:val="single" w:sz="8" w:space="0" w:color="000000"/>
@@ -26966,27 +26403,27 @@
         </w:tc>
         <w:tc>
           <w:tcPr>
-            <w:tcW w:w="1406" w:type="dxa"/>
-            <w:tcBorders>
-              <w:top w:val="single" w:sz="8" w:space="0" w:color="000000"/>
-              <w:left w:val="single" w:sz="8" w:space="0" w:color="000000"/>
-              <w:bottom w:val="single" w:sz="8" w:space="0" w:color="000000"/>
-            </w:tcBorders>
-            <w:vAlign w:val="center"/>
-          </w:tcPr>
-          <w:p>
-            <w:pPr>
-              <w:pStyle w:val="TableContents"/>
-              <w:rPr/>
-            </w:pPr>
-            <w:r>
-              <w:rPr/>
-            </w:r>
-          </w:p>
-        </w:tc>
-        <w:tc>
-          <w:tcPr>
-            <w:tcW w:w="1789" w:type="dxa"/>
+            <w:tcW w:w="1405" w:type="dxa"/>
+            <w:tcBorders>
+              <w:top w:val="single" w:sz="8" w:space="0" w:color="000000"/>
+              <w:left w:val="single" w:sz="8" w:space="0" w:color="000000"/>
+              <w:bottom w:val="single" w:sz="8" w:space="0" w:color="000000"/>
+            </w:tcBorders>
+            <w:vAlign w:val="center"/>
+          </w:tcPr>
+          <w:p>
+            <w:pPr>
+              <w:pStyle w:val="TableContents"/>
+              <w:rPr/>
+            </w:pPr>
+            <w:r>
+              <w:rPr/>
+            </w:r>
+          </w:p>
+        </w:tc>
+        <w:tc>
+          <w:tcPr>
+            <w:tcW w:w="1790" w:type="dxa"/>
             <w:tcBorders>
               <w:top w:val="single" w:sz="8" w:space="0" w:color="000000"/>
               <w:left w:val="single" w:sz="8" w:space="0" w:color="000000"/>
@@ -27089,26 +26526,26 @@
         </w:tc>
         <w:tc>
           <w:tcPr>
-            <w:tcW w:w="1406" w:type="dxa"/>
-            <w:tcBorders>
-              <w:left w:val="single" w:sz="8" w:space="0" w:color="000000"/>
-              <w:bottom w:val="single" w:sz="8" w:space="0" w:color="000000"/>
-            </w:tcBorders>
-            <w:vAlign w:val="center"/>
-          </w:tcPr>
-          <w:p>
-            <w:pPr>
-              <w:pStyle w:val="TableContents"/>
-              <w:rPr/>
-            </w:pPr>
-            <w:r>
-              <w:rPr/>
-            </w:r>
-          </w:p>
-        </w:tc>
-        <w:tc>
-          <w:tcPr>
-            <w:tcW w:w="1789" w:type="dxa"/>
+            <w:tcW w:w="1405" w:type="dxa"/>
+            <w:tcBorders>
+              <w:left w:val="single" w:sz="8" w:space="0" w:color="000000"/>
+              <w:bottom w:val="single" w:sz="8" w:space="0" w:color="000000"/>
+            </w:tcBorders>
+            <w:vAlign w:val="center"/>
+          </w:tcPr>
+          <w:p>
+            <w:pPr>
+              <w:pStyle w:val="TableContents"/>
+              <w:rPr/>
+            </w:pPr>
+            <w:r>
+              <w:rPr/>
+            </w:r>
+          </w:p>
+        </w:tc>
+        <w:tc>
+          <w:tcPr>
+            <w:tcW w:w="1790" w:type="dxa"/>
             <w:tcBorders>
               <w:left w:val="single" w:sz="8" w:space="0" w:color="000000"/>
               <w:bottom w:val="single" w:sz="8" w:space="0" w:color="000000"/>
@@ -27203,7 +26640,7 @@
         <w:pStyle w:val="Heading2"/>
         <w:numPr>
           <w:ilvl w:val="1"/>
-          <w:numId w:val="2"/>
+          <w:numId w:val="1"/>
         </w:numPr>
         <w:rPr/>
       </w:pPr>
@@ -27781,7 +27218,7 @@
         <w:pStyle w:val="Heading1"/>
         <w:numPr>
           <w:ilvl w:val="0"/>
-          <w:numId w:val="2"/>
+          <w:numId w:val="1"/>
         </w:numPr>
         <w:rPr/>
       </w:pPr>
@@ -27807,7 +27244,7 @@
         <w:pStyle w:val="Heading2"/>
         <w:numPr>
           <w:ilvl w:val="1"/>
-          <w:numId w:val="2"/>
+          <w:numId w:val="1"/>
         </w:numPr>
         <w:rPr/>
       </w:pPr>
@@ -30663,7 +30100,7 @@
         <w:pStyle w:val="Heading2"/>
         <w:numPr>
           <w:ilvl w:val="1"/>
-          <w:numId w:val="2"/>
+          <w:numId w:val="1"/>
         </w:numPr>
         <w:rPr/>
       </w:pPr>
@@ -32661,7 +32098,7 @@
         <w:pStyle w:val="Heading2"/>
         <w:numPr>
           <w:ilvl w:val="1"/>
-          <w:numId w:val="2"/>
+          <w:numId w:val="1"/>
         </w:numPr>
         <w:rPr/>
       </w:pPr>
@@ -34522,7 +33959,7 @@
         <w:pStyle w:val="Heading1"/>
         <w:numPr>
           <w:ilvl w:val="0"/>
-          <w:numId w:val="2"/>
+          <w:numId w:val="1"/>
         </w:numPr>
         <w:rPr/>
       </w:pPr>
@@ -34899,7 +34336,7 @@
         <w:pStyle w:val="Heading1"/>
         <w:numPr>
           <w:ilvl w:val="0"/>
-          <w:numId w:val="2"/>
+          <w:numId w:val="1"/>
         </w:numPr>
         <w:rPr/>
       </w:pPr>
@@ -35049,7 +34486,7 @@
         <w:pStyle w:val="Heading2"/>
         <w:numPr>
           <w:ilvl w:val="1"/>
-          <w:numId w:val="2"/>
+          <w:numId w:val="1"/>
         </w:numPr>
         <w:rPr/>
       </w:pPr>
@@ -36311,7 +35748,7 @@
         <w:pStyle w:val="Heading3"/>
         <w:numPr>
           <w:ilvl w:val="2"/>
-          <w:numId w:val="2"/>
+          <w:numId w:val="1"/>
         </w:numPr>
         <w:rPr/>
       </w:pPr>
@@ -37034,7 +36471,7 @@
         <w:pStyle w:val="Heading3"/>
         <w:numPr>
           <w:ilvl w:val="2"/>
-          <w:numId w:val="2"/>
+          <w:numId w:val="1"/>
         </w:numPr>
         <w:rPr/>
       </w:pPr>
@@ -37796,7 +37233,7 @@
         <w:pStyle w:val="Heading3"/>
         <w:numPr>
           <w:ilvl w:val="2"/>
-          <w:numId w:val="2"/>
+          <w:numId w:val="1"/>
         </w:numPr>
         <w:rPr/>
       </w:pPr>
@@ -38958,7 +38395,7 @@
         <w:pStyle w:val="Heading1"/>
         <w:numPr>
           <w:ilvl w:val="0"/>
-          <w:numId w:val="2"/>
+          <w:numId w:val="1"/>
         </w:numPr>
         <w:rPr/>
       </w:pPr>
@@ -39698,6 +39135,125 @@
   <w:abstractNum w:abstractNumId="1">
     <w:lvl w:ilvl="0">
       <w:start w:val="1"/>
+      <w:numFmt w:val="decimal"/>
+      <w:lvlText w:val="%1"/>
+      <w:lvlJc w:val="left"/>
+      <w:pPr>
+        <w:tabs>
+          <w:tab w:val="num" w:pos="720"/>
+        </w:tabs>
+        <w:ind w:left="720" w:hanging="360"/>
+      </w:pPr>
+      <w:rPr/>
+    </w:lvl>
+    <w:lvl w:ilvl="1">
+      <w:start w:val="1"/>
+      <w:numFmt w:val="decimal"/>
+      <w:lvlText w:val="%1.%2"/>
+      <w:lvlJc w:val="left"/>
+      <w:pPr>
+        <w:tabs>
+          <w:tab w:val="num" w:pos="1080"/>
+        </w:tabs>
+        <w:ind w:left="1080" w:hanging="360"/>
+      </w:pPr>
+      <w:rPr/>
+    </w:lvl>
+    <w:lvl w:ilvl="2">
+      <w:start w:val="1"/>
+      <w:numFmt w:val="decimal"/>
+      <w:lvlText w:val="%1.%2.%3"/>
+      <w:lvlJc w:val="left"/>
+      <w:pPr>
+        <w:tabs>
+          <w:tab w:val="num" w:pos="1440"/>
+        </w:tabs>
+        <w:ind w:left="1440" w:hanging="360"/>
+      </w:pPr>
+      <w:rPr/>
+    </w:lvl>
+    <w:lvl w:ilvl="3">
+      <w:start w:val="1"/>
+      <w:numFmt w:val="decimal"/>
+      <w:lvlText w:val="%1.%2.%3.%4"/>
+      <w:lvlJc w:val="left"/>
+      <w:pPr>
+        <w:tabs>
+          <w:tab w:val="num" w:pos="1800"/>
+        </w:tabs>
+        <w:ind w:left="1800" w:hanging="360"/>
+      </w:pPr>
+      <w:rPr/>
+    </w:lvl>
+    <w:lvl w:ilvl="4">
+      <w:start w:val="1"/>
+      <w:numFmt w:val="decimal"/>
+      <w:lvlText w:val="%1.%2.%3.%4.%5"/>
+      <w:lvlJc w:val="left"/>
+      <w:pPr>
+        <w:tabs>
+          <w:tab w:val="num" w:pos="2160"/>
+        </w:tabs>
+        <w:ind w:left="2160" w:hanging="360"/>
+      </w:pPr>
+      <w:rPr/>
+    </w:lvl>
+    <w:lvl w:ilvl="5">
+      <w:start w:val="1"/>
+      <w:numFmt w:val="decimal"/>
+      <w:lvlText w:val="%1.%2.%3.%4.%5.%6"/>
+      <w:lvlJc w:val="left"/>
+      <w:pPr>
+        <w:tabs>
+          <w:tab w:val="num" w:pos="2520"/>
+        </w:tabs>
+        <w:ind w:left="2520" w:hanging="360"/>
+      </w:pPr>
+      <w:rPr/>
+    </w:lvl>
+    <w:lvl w:ilvl="6">
+      <w:start w:val="1"/>
+      <w:numFmt w:val="decimal"/>
+      <w:lvlText w:val="%1.%2.%3.%4.%5.%6.%7"/>
+      <w:lvlJc w:val="left"/>
+      <w:pPr>
+        <w:tabs>
+          <w:tab w:val="num" w:pos="2880"/>
+        </w:tabs>
+        <w:ind w:left="2880" w:hanging="360"/>
+      </w:pPr>
+      <w:rPr/>
+    </w:lvl>
+    <w:lvl w:ilvl="7">
+      <w:start w:val="1"/>
+      <w:numFmt w:val="decimal"/>
+      <w:lvlText w:val="%1.%2.%3.%4.%5.%6.%7.%8"/>
+      <w:lvlJc w:val="left"/>
+      <w:pPr>
+        <w:tabs>
+          <w:tab w:val="num" w:pos="3240"/>
+        </w:tabs>
+        <w:ind w:left="3240" w:hanging="360"/>
+      </w:pPr>
+      <w:rPr/>
+    </w:lvl>
+    <w:lvl w:ilvl="8">
+      <w:start w:val="1"/>
+      <w:numFmt w:val="decimal"/>
+      <w:lvlText w:val="%1.%2.%3.%4.%5.%6.%7.%8.%9"/>
+      <w:lvlJc w:val="left"/>
+      <w:pPr>
+        <w:tabs>
+          <w:tab w:val="num" w:pos="3600"/>
+        </w:tabs>
+        <w:ind w:left="3600" w:hanging="360"/>
+      </w:pPr>
+      <w:rPr/>
+    </w:lvl>
+  </w:abstractNum>
+  <w:abstractNum w:abstractNumId="2">
+    <w:lvl w:ilvl="0">
+      <w:start w:val="1"/>
       <w:numFmt w:val="none"/>
       <w:suff w:val="nothing"/>
       <w:lvlText w:val=""/>
@@ -39812,125 +39368,6 @@
         </w:tabs>
         <w:ind w:left="0" w:hanging="0"/>
       </w:pPr>
-    </w:lvl>
-  </w:abstractNum>
-  <w:abstractNum w:abstractNumId="2">
-    <w:lvl w:ilvl="0">
-      <w:start w:val="1"/>
-      <w:numFmt w:val="decimal"/>
-      <w:lvlText w:val="%1"/>
-      <w:lvlJc w:val="left"/>
-      <w:pPr>
-        <w:tabs>
-          <w:tab w:val="num" w:pos="720"/>
-        </w:tabs>
-        <w:ind w:left="720" w:hanging="360"/>
-      </w:pPr>
-      <w:rPr/>
-    </w:lvl>
-    <w:lvl w:ilvl="1">
-      <w:start w:val="1"/>
-      <w:numFmt w:val="decimal"/>
-      <w:lvlText w:val="%1.%2"/>
-      <w:lvlJc w:val="left"/>
-      <w:pPr>
-        <w:tabs>
-          <w:tab w:val="num" w:pos="1080"/>
-        </w:tabs>
-        <w:ind w:left="1080" w:hanging="360"/>
-      </w:pPr>
-      <w:rPr/>
-    </w:lvl>
-    <w:lvl w:ilvl="2">
-      <w:start w:val="1"/>
-      <w:numFmt w:val="decimal"/>
-      <w:lvlText w:val="%1.%2.%3"/>
-      <w:lvlJc w:val="left"/>
-      <w:pPr>
-        <w:tabs>
-          <w:tab w:val="num" w:pos="1440"/>
-        </w:tabs>
-        <w:ind w:left="1440" w:hanging="360"/>
-      </w:pPr>
-      <w:rPr/>
-    </w:lvl>
-    <w:lvl w:ilvl="3">
-      <w:start w:val="1"/>
-      <w:numFmt w:val="decimal"/>
-      <w:lvlText w:val="%1.%2.%3.%4"/>
-      <w:lvlJc w:val="left"/>
-      <w:pPr>
-        <w:tabs>
-          <w:tab w:val="num" w:pos="1800"/>
-        </w:tabs>
-        <w:ind w:left="1800" w:hanging="360"/>
-      </w:pPr>
-      <w:rPr/>
-    </w:lvl>
-    <w:lvl w:ilvl="4">
-      <w:start w:val="1"/>
-      <w:numFmt w:val="decimal"/>
-      <w:lvlText w:val="%1.%2.%3.%4.%5"/>
-      <w:lvlJc w:val="left"/>
-      <w:pPr>
-        <w:tabs>
-          <w:tab w:val="num" w:pos="2160"/>
-        </w:tabs>
-        <w:ind w:left="2160" w:hanging="360"/>
-      </w:pPr>
-      <w:rPr/>
-    </w:lvl>
-    <w:lvl w:ilvl="5">
-      <w:start w:val="1"/>
-      <w:numFmt w:val="decimal"/>
-      <w:lvlText w:val="%1.%2.%3.%4.%5.%6"/>
-      <w:lvlJc w:val="left"/>
-      <w:pPr>
-        <w:tabs>
-          <w:tab w:val="num" w:pos="2520"/>
-        </w:tabs>
-        <w:ind w:left="2520" w:hanging="360"/>
-      </w:pPr>
-      <w:rPr/>
-    </w:lvl>
-    <w:lvl w:ilvl="6">
-      <w:start w:val="1"/>
-      <w:numFmt w:val="decimal"/>
-      <w:lvlText w:val="%1.%2.%3.%4.%5.%6.%7"/>
-      <w:lvlJc w:val="left"/>
-      <w:pPr>
-        <w:tabs>
-          <w:tab w:val="num" w:pos="2880"/>
-        </w:tabs>
-        <w:ind w:left="2880" w:hanging="360"/>
-      </w:pPr>
-      <w:rPr/>
-    </w:lvl>
-    <w:lvl w:ilvl="7">
-      <w:start w:val="1"/>
-      <w:numFmt w:val="decimal"/>
-      <w:lvlText w:val="%1.%2.%3.%4.%5.%6.%7.%8"/>
-      <w:lvlJc w:val="left"/>
-      <w:pPr>
-        <w:tabs>
-          <w:tab w:val="num" w:pos="3240"/>
-        </w:tabs>
-        <w:ind w:left="3240" w:hanging="360"/>
-      </w:pPr>
-      <w:rPr/>
-    </w:lvl>
-    <w:lvl w:ilvl="8">
-      <w:start w:val="1"/>
-      <w:numFmt w:val="decimal"/>
-      <w:lvlText w:val="%1.%2.%3.%4.%5.%6.%7.%8.%9"/>
-      <w:lvlJc w:val="left"/>
-      <w:pPr>
-        <w:tabs>
-          <w:tab w:val="num" w:pos="3600"/>
-        </w:tabs>
-        <w:ind w:left="3600" w:hanging="360"/>
-      </w:pPr>
-      <w:rPr/>
     </w:lvl>
   </w:abstractNum>
   <w:num w:numId="1">
@@ -39988,7 +39425,7 @@
     <w:pPr>
       <w:numPr>
         <w:ilvl w:val="0"/>
-        <w:numId w:val="2"/>
+        <w:numId w:val="1"/>
       </w:numPr>
       <w:spacing w:before="240" w:after="120"/>
       <w:outlineLvl w:val="0"/>
@@ -40008,7 +39445,7 @@
     <w:pPr>
       <w:numPr>
         <w:ilvl w:val="1"/>
-        <w:numId w:val="2"/>
+        <w:numId w:val="1"/>
       </w:numPr>
       <w:spacing w:before="200" w:after="120"/>
       <w:outlineLvl w:val="1"/>
@@ -40030,7 +39467,7 @@
     <w:pPr>
       <w:numPr>
         <w:ilvl w:val="2"/>
-        <w:numId w:val="2"/>
+        <w:numId w:val="1"/>
       </w:numPr>
       <w:spacing w:before="140" w:after="120"/>
       <w:outlineLvl w:val="2"/>
@@ -40052,7 +39489,7 @@
     <w:pPr>
       <w:numPr>
         <w:ilvl w:val="3"/>
-        <w:numId w:val="2"/>
+        <w:numId w:val="1"/>
       </w:numPr>
       <w:spacing w:before="120" w:after="120"/>
       <w:outlineLvl w:val="3"/>
@@ -40074,7 +39511,7 @@
     <w:pPr>
       <w:numPr>
         <w:ilvl w:val="4"/>
-        <w:numId w:val="2"/>
+        <w:numId w:val="1"/>
       </w:numPr>
       <w:spacing w:before="120" w:after="60"/>
       <w:outlineLvl w:val="4"/>
@@ -40094,7 +39531,7 @@
     <w:pPr>
       <w:numPr>
         <w:ilvl w:val="5"/>
-        <w:numId w:val="2"/>
+        <w:numId w:val="1"/>
       </w:numPr>
       <w:spacing w:before="60" w:after="60"/>
       <w:outlineLvl w:val="5"/>
@@ -40116,7 +39553,7 @@
     <w:pPr>
       <w:numPr>
         <w:ilvl w:val="6"/>
-        <w:numId w:val="2"/>
+        <w:numId w:val="1"/>
       </w:numPr>
       <w:spacing w:before="60" w:after="60"/>
       <w:outlineLvl w:val="6"/>
@@ -40145,8 +39582,8 @@
     <w:qFormat/>
     <w:rPr/>
   </w:style>
-  <w:style w:type="character" w:styleId="Bullets">
-    <w:name w:val="Bullets"/>
+  <w:style w:type="character" w:styleId="Bulletsuser">
+    <w:name w:val="Bullets (user)"/>
     <w:qFormat/>
     <w:rPr>
       <w:rFonts w:ascii="OpenSymbol" w:hAnsi="OpenSymbol" w:eastAsia="OpenSymbol" w:cs="OpenSymbol"/>
@@ -40404,8 +39841,8 @@
     <w:pPr/>
     <w:rPr/>
   </w:style>
-  <w:style w:type="paragraph" w:styleId="TableIndexHeadinguser">
-    <w:name w:val="Table Index Heading (user)"/>
+  <w:style w:type="paragraph" w:styleId="TableIndexHeading">
+    <w:name w:val="Table Index Heading"/>
     <w:basedOn w:val="IndexHeading"/>
     <w:qFormat/>
     <w:pPr>
@@ -40460,8 +39897,8 @@
     </w:pPr>
     <w:rPr/>
   </w:style>
-  <w:style w:type="paragraph" w:styleId="FooterLeft">
-    <w:name w:val="Footer Left"/>
+  <w:style w:type="paragraph" w:styleId="FooterLeftuser">
+    <w:name w:val="Footer Left (user)"/>
     <w:basedOn w:val="Footer"/>
     <w:qFormat/>
     <w:pPr>
@@ -40469,8 +39906,8 @@
     </w:pPr>
     <w:rPr/>
   </w:style>
-  <w:style w:type="paragraph" w:styleId="FooterRight">
-    <w:name w:val="Footer Right"/>
+  <w:style w:type="paragraph" w:styleId="FooterRightuser">
+    <w:name w:val="Footer Right (user)"/>
     <w:basedOn w:val="Footer"/>
     <w:qFormat/>
     <w:pPr>
@@ -40513,8 +39950,8 @@
       <w:bCs/>
     </w:rPr>
   </w:style>
-  <w:style w:type="paragraph" w:styleId="FrameContents">
-    <w:name w:val="Frame Contents"/>
+  <w:style w:type="paragraph" w:styleId="FrameContentsuser">
+    <w:name w:val="Frame Contents (user)"/>
     <w:basedOn w:val="Normal"/>
     <w:qFormat/>
     <w:pPr/>

</xml_diff>

<commit_message>
onSubmit curricularComponent form improvement
</commit_message>
<xml_diff>
--- a/src/main/resources/ppc.docx
+++ b/src/main/resources/ppc.docx
@@ -17636,10 +17636,14 @@
         <w:jc w:val="both"/>
         <w:rPr/>
       </w:pPr>
+      <w:bookmarkStart w:id="64" w:name="__DdeLink__6479_642834953"/>
+      <w:bookmarkStart w:id="65" w:name="__DdeLink__3036_642834953"/>
       <w:r>
         <w:rPr/>
         <w:t>@@componentes_optativos@@</w:t>
       </w:r>
+      <w:bookmarkEnd w:id="64"/>
+      <w:bookmarkEnd w:id="65"/>
     </w:p>
     <w:p>
       <w:pPr>
@@ -17653,8 +17657,8 @@
           <w:bCs w:val="false"/>
         </w:rPr>
       </w:pPr>
-      <w:bookmarkStart w:id="64" w:name="__RefHeading___Toc8349_1736451874"/>
-      <w:bookmarkEnd w:id="64"/>
+      <w:bookmarkStart w:id="66" w:name="__RefHeading___Toc8349_1736451874"/>
+      <w:bookmarkEnd w:id="66"/>
       <w:r>
         <w:rPr>
           <w:b w:val="false"/>
@@ -17684,8 +17688,8 @@
           <w:shd w:fill="auto" w:val="clear"/>
         </w:rPr>
       </w:pPr>
-      <w:bookmarkStart w:id="65" w:name="docs-internal-guid-44011d92-7fff-174c-5b"/>
-      <w:bookmarkEnd w:id="65"/>
+      <w:bookmarkStart w:id="67" w:name="docs-internal-guid-44011d92-7fff-174c-5b"/>
+      <w:bookmarkEnd w:id="67"/>
       <w:r>
         <w:rPr>
           <w:rFonts w:ascii="Times New Roman;serif" w:hAnsi="Times New Roman;serif"/>
@@ -17718,6 +17722,53 @@
           <w:b w:val="false"/>
           <w:bCs w:val="false"/>
         </w:rPr>
+      </w:r>
+    </w:p>
+    <w:p>
+      <w:pPr>
+        <w:pStyle w:val="Quadro"/>
+        <w:keepNext w:val="true"/>
+        <w:rPr/>
+      </w:pPr>
+      <w:r>
+        <w:rPr/>
+        <w:t xml:space="preserve">Quadro </w:t>
+      </w:r>
+      <w:r>
+        <w:rPr/>
+        <w:fldChar w:fldCharType="begin"/>
+      </w:r>
+      <w:r>
+        <w:rPr/>
+        <w:instrText xml:space="preserve"> SEQ Quadro \* ARABIC </w:instrText>
+      </w:r>
+      <w:r>
+        <w:rPr/>
+        <w:fldChar w:fldCharType="separate"/>
+      </w:r>
+      <w:r>
+        <w:rPr/>
+        <w:t>11</w:t>
+      </w:r>
+      <w:r>
+        <w:rPr/>
+        <w:fldChar w:fldCharType="end"/>
+      </w:r>
+      <w:r>
+        <w:rPr/>
+        <w:t>: Componentes eletivos</w:t>
+      </w:r>
+    </w:p>
+    <w:p>
+      <w:pPr>
+        <w:pStyle w:val="BodyText"/>
+        <w:spacing w:lineRule="auto" w:line="288" w:before="0" w:after="0"/>
+        <w:jc w:val="both"/>
+        <w:rPr/>
+      </w:pPr>
+      <w:r>
+        <w:rPr/>
+        <w:t>@@componentes_optativos@@</w:t>
       </w:r>
     </w:p>
     <w:p>
@@ -17732,8 +17783,8 @@
           <w:bCs w:val="false"/>
         </w:rPr>
       </w:pPr>
-      <w:bookmarkStart w:id="66" w:name="__RefHeading___Toc8351_1736451874"/>
-      <w:bookmarkEnd w:id="66"/>
+      <w:bookmarkStart w:id="68" w:name="__RefHeading___Toc8351_1736451874"/>
+      <w:bookmarkEnd w:id="68"/>
       <w:r>
         <w:rPr>
           <w:b w:val="false"/>
@@ -17750,8 +17801,8 @@
           <w:bCs w:val="false"/>
         </w:rPr>
       </w:pPr>
-      <w:bookmarkStart w:id="67" w:name="docs-internal-guid-80826a8e-7fff-db4d-c5"/>
-      <w:bookmarkEnd w:id="67"/>
+      <w:bookmarkStart w:id="69" w:name="docs-internal-guid-80826a8e-7fff-db4d-c5"/>
+      <w:bookmarkEnd w:id="69"/>
       <w:r>
         <w:rPr>
           <w:rFonts w:ascii="Times New Roman;serif" w:hAnsi="Times New Roman;serif"/>
@@ -17810,8 +17861,8 @@
         </w:numPr>
         <w:rPr/>
       </w:pPr>
-      <w:bookmarkStart w:id="68" w:name="__RefHeading___Toc8353_1736451874"/>
-      <w:bookmarkEnd w:id="68"/>
+      <w:bookmarkStart w:id="70" w:name="__RefHeading___Toc8353_1736451874"/>
+      <w:bookmarkEnd w:id="70"/>
       <w:r>
         <w:rPr/>
         <w:t>DINÂMICA CURRICULAR</w:t>
@@ -17840,8 +17891,8 @@
           <w:shd w:fill="FFFFFF" w:val="clear"/>
         </w:rPr>
       </w:pPr>
-      <w:bookmarkStart w:id="69" w:name="docs-internal-guid-1632cf23-7fff-0ef9-b8"/>
-      <w:bookmarkEnd w:id="69"/>
+      <w:bookmarkStart w:id="71" w:name="docs-internal-guid-1632cf23-7fff-0ef9-b8"/>
+      <w:bookmarkEnd w:id="71"/>
       <w:r>
         <w:rPr>
           <w:rFonts w:ascii="Times New Roman;serif" w:hAnsi="Times New Roman;serif"/>
@@ -17893,8 +17944,8 @@
         </w:numPr>
         <w:rPr/>
       </w:pPr>
-      <w:bookmarkStart w:id="70" w:name="__RefHeading___Toc8355_1736451874"/>
-      <w:bookmarkEnd w:id="70"/>
+      <w:bookmarkStart w:id="72" w:name="__RefHeading___Toc8355_1736451874"/>
+      <w:bookmarkEnd w:id="72"/>
       <w:r>
         <w:rPr/>
         <w:t>Distribuição Percentual da Carga Horária do Desenho Curricular</w:t>
@@ -17933,7 +17984,7 @@
       </w:r>
       <w:r>
         <w:rPr/>
-        <w:t>11</w:t>
+        <w:t>12</w:t>
       </w:r>
       <w:r>
         <w:rPr/>
@@ -17959,8 +18010,8 @@
       </w:tblPr>
       <w:tblGrid>
         <w:gridCol w:w="4292"/>
-        <w:gridCol w:w="2337"/>
-        <w:gridCol w:w="3016"/>
+        <w:gridCol w:w="2443"/>
+        <w:gridCol w:w="2910"/>
       </w:tblGrid>
       <w:tr>
         <w:trPr/>
@@ -18001,7 +18052,7 @@
         </w:tc>
         <w:tc>
           <w:tcPr>
-            <w:tcW w:w="2337" w:type="dxa"/>
+            <w:tcW w:w="2443" w:type="dxa"/>
             <w:tcBorders>
               <w:top w:val="single" w:sz="8" w:space="0" w:color="000000"/>
               <w:left w:val="single" w:sz="8" w:space="0" w:color="000000"/>
@@ -18036,7 +18087,7 @@
         </w:tc>
         <w:tc>
           <w:tcPr>
-            <w:tcW w:w="3016" w:type="dxa"/>
+            <w:tcW w:w="2910" w:type="dxa"/>
             <w:tcBorders>
               <w:top w:val="single" w:sz="8" w:space="0" w:color="000000"/>
               <w:left w:val="single" w:sz="8" w:space="0" w:color="000000"/>
@@ -18128,7 +18179,90 @@
         </w:tc>
         <w:tc>
           <w:tcPr>
-            <w:tcW w:w="2337" w:type="dxa"/>
+            <w:tcW w:w="2443" w:type="dxa"/>
+            <w:tcBorders>
+              <w:left w:val="single" w:sz="8" w:space="0" w:color="000000"/>
+              <w:right w:val="single" w:sz="8" w:space="0" w:color="000000"/>
+            </w:tcBorders>
+            <w:vAlign w:val="center"/>
+          </w:tcPr>
+          <w:p>
+            <w:pPr>
+              <w:pStyle w:val="BodyText"/>
+              <w:widowControl/>
+              <w:suppressAutoHyphens w:val="true"/>
+              <w:bidi w:val="0"/>
+              <w:spacing w:lineRule="auto" w:line="288" w:before="0" w:after="0"/>
+              <w:ind w:hanging="0" w:left="0" w:right="121"/>
+              <w:jc w:val="both"/>
+              <w:rPr>
+                <w:rFonts w:ascii="Liberation Serif" w:hAnsi="Liberation Serif" w:eastAsia="Noto Serif CJK SC" w:cs="FreeSans"/>
+                <w:color w:val="auto"/>
+                <w:kern w:val="2"/>
+                <w:sz w:val="24"/>
+                <w:szCs w:val="24"/>
+                <w:lang w:val="pt-BR" w:eastAsia="zh-CN" w:bidi="hi-IN"/>
+              </w:rPr>
+            </w:pPr>
+            <w:r>
+              <w:rPr>
+                <w:rFonts w:eastAsia="Noto Serif CJK SC" w:cs="FreeSans"/>
+                <w:color w:val="auto"/>
+                <w:kern w:val="2"/>
+                <w:sz w:val="24"/>
+                <w:szCs w:val="24"/>
+                <w:lang w:val="pt-BR" w:eastAsia="zh-CN" w:bidi="hi-IN"/>
+              </w:rPr>
+              <w:t>{{ch_obrigatorios_hr}}</w:t>
+            </w:r>
+          </w:p>
+        </w:tc>
+        <w:tc>
+          <w:tcPr>
+            <w:tcW w:w="2910" w:type="dxa"/>
+            <w:tcBorders>
+              <w:left w:val="single" w:sz="8" w:space="0" w:color="000000"/>
+              <w:right w:val="single" w:sz="8" w:space="0" w:color="000000"/>
+            </w:tcBorders>
+            <w:vAlign w:val="center"/>
+          </w:tcPr>
+          <w:p>
+            <w:pPr>
+              <w:pStyle w:val="BodyText"/>
+              <w:widowControl/>
+              <w:suppressAutoHyphens w:val="true"/>
+              <w:bidi w:val="0"/>
+              <w:spacing w:lineRule="auto" w:line="288" w:before="0" w:after="0"/>
+              <w:ind w:hanging="0" w:left="0" w:right="121"/>
+              <w:jc w:val="both"/>
+              <w:rPr>
+                <w:rFonts w:ascii="Liberation Serif" w:hAnsi="Liberation Serif" w:eastAsia="Noto Serif CJK SC" w:cs="FreeSans"/>
+                <w:color w:val="auto"/>
+                <w:kern w:val="2"/>
+                <w:sz w:val="24"/>
+                <w:szCs w:val="24"/>
+                <w:lang w:val="pt-BR" w:eastAsia="zh-CN" w:bidi="hi-IN"/>
+              </w:rPr>
+            </w:pPr>
+            <w:r>
+              <w:rPr>
+                <w:rFonts w:eastAsia="Noto Serif CJK SC" w:cs="FreeSans"/>
+                <w:color w:val="auto"/>
+                <w:kern w:val="2"/>
+                <w:sz w:val="24"/>
+                <w:szCs w:val="24"/>
+                <w:lang w:val="pt-BR" w:eastAsia="zh-CN" w:bidi="hi-IN"/>
+              </w:rPr>
+              <w:t>{{ch_obrigatorios_per}}</w:t>
+            </w:r>
+          </w:p>
+        </w:tc>
+      </w:tr>
+      <w:tr>
+        <w:trPr/>
+        <w:tc>
+          <w:tcPr>
+            <w:tcW w:w="4292" w:type="dxa"/>
             <w:tcBorders>
               <w:left w:val="single" w:sz="8" w:space="0" w:color="000000"/>
               <w:right w:val="single" w:sz="8" w:space="0" w:color="000000"/>
@@ -18145,7 +18279,8 @@
               <w:jc w:val="both"/>
               <w:rPr>
                 <w:rFonts w:ascii="Times New Roman;serif" w:hAnsi="Times New Roman;serif"/>
-                <w:b/>
+                <w:b w:val="false"/>
+                <w:bCs w:val="false"/>
                 <w:i w:val="false"/>
                 <w:i w:val="false"/>
                 <w:caps w:val="false"/>
@@ -18162,7 +18297,8 @@
             <w:r>
               <w:rPr>
                 <w:rFonts w:ascii="Times New Roman;serif" w:hAnsi="Times New Roman;serif"/>
-                <w:b/>
+                <w:b w:val="false"/>
+                <w:bCs w:val="false"/>
                 <w:i w:val="false"/>
                 <w:caps w:val="false"/>
                 <w:smallCaps w:val="false"/>
@@ -18174,12 +18310,96 @@
                 <w:effect w:val="none"/>
                 <w:shd w:fill="auto" w:val="clear"/>
               </w:rPr>
-            </w:r>
-          </w:p>
-        </w:tc>
-        <w:tc>
-          <w:tcPr>
-            <w:tcW w:w="3016" w:type="dxa"/>
+              <w:t>Componentes Curriculares Optativos</w:t>
+            </w:r>
+          </w:p>
+        </w:tc>
+        <w:tc>
+          <w:tcPr>
+            <w:tcW w:w="2443" w:type="dxa"/>
+            <w:tcBorders>
+              <w:left w:val="single" w:sz="8" w:space="0" w:color="000000"/>
+              <w:right w:val="single" w:sz="8" w:space="0" w:color="000000"/>
+            </w:tcBorders>
+            <w:vAlign w:val="center"/>
+          </w:tcPr>
+          <w:p>
+            <w:pPr>
+              <w:pStyle w:val="BodyText"/>
+              <w:widowControl/>
+              <w:suppressAutoHyphens w:val="true"/>
+              <w:bidi w:val="0"/>
+              <w:spacing w:lineRule="auto" w:line="288" w:before="0" w:after="0"/>
+              <w:ind w:hanging="0" w:left="0" w:right="121"/>
+              <w:jc w:val="both"/>
+              <w:rPr>
+                <w:rFonts w:ascii="Liberation Serif" w:hAnsi="Liberation Serif" w:eastAsia="Noto Serif CJK SC" w:cs="FreeSans"/>
+                <w:color w:val="auto"/>
+                <w:kern w:val="2"/>
+                <w:sz w:val="24"/>
+                <w:szCs w:val="24"/>
+                <w:lang w:val="pt-BR" w:eastAsia="zh-CN" w:bidi="hi-IN"/>
+              </w:rPr>
+            </w:pPr>
+            <w:r>
+              <w:rPr>
+                <w:rFonts w:eastAsia="Noto Serif CJK SC" w:cs="FreeSans"/>
+                <w:color w:val="auto"/>
+                <w:kern w:val="2"/>
+                <w:sz w:val="24"/>
+                <w:szCs w:val="24"/>
+                <w:lang w:val="pt-BR" w:eastAsia="zh-CN" w:bidi="hi-IN"/>
+              </w:rPr>
+              <w:t>{{ch_optativos_hr}}</w:t>
+            </w:r>
+          </w:p>
+        </w:tc>
+        <w:tc>
+          <w:tcPr>
+            <w:tcW w:w="2910" w:type="dxa"/>
+            <w:tcBorders>
+              <w:left w:val="single" w:sz="8" w:space="0" w:color="000000"/>
+              <w:right w:val="single" w:sz="8" w:space="0" w:color="000000"/>
+            </w:tcBorders>
+            <w:vAlign w:val="center"/>
+          </w:tcPr>
+          <w:p>
+            <w:pPr>
+              <w:pStyle w:val="BodyText"/>
+              <w:widowControl/>
+              <w:suppressAutoHyphens w:val="true"/>
+              <w:bidi w:val="0"/>
+              <w:spacing w:lineRule="auto" w:line="288" w:before="0" w:after="0"/>
+              <w:ind w:hanging="0" w:left="0" w:right="121"/>
+              <w:jc w:val="both"/>
+              <w:rPr>
+                <w:rFonts w:ascii="Liberation Serif" w:hAnsi="Liberation Serif" w:eastAsia="Noto Serif CJK SC" w:cs="FreeSans"/>
+                <w:color w:val="auto"/>
+                <w:kern w:val="2"/>
+                <w:sz w:val="24"/>
+                <w:szCs w:val="24"/>
+                <w:lang w:val="pt-BR" w:eastAsia="zh-CN" w:bidi="hi-IN"/>
+              </w:rPr>
+            </w:pPr>
+            <w:r>
+              <w:rPr>
+                <w:rFonts w:eastAsia="Noto Serif CJK SC" w:cs="FreeSans"/>
+                <w:color w:val="auto"/>
+                <w:kern w:val="2"/>
+                <w:sz w:val="24"/>
+                <w:szCs w:val="24"/>
+                <w:lang w:val="pt-BR" w:eastAsia="zh-CN" w:bidi="hi-IN"/>
+              </w:rPr>
+              <w:t>{{ch_optativos_per}}</w:t>
+            </w:r>
+          </w:p>
+        </w:tc>
+      </w:tr>
+      <w:tr>
+        <w:trPr/>
+        <w:tc>
+          <w:tcPr>
+            <w:tcW w:w="4292" w:type="dxa"/>
             <w:tcBorders>
               <w:left w:val="single" w:sz="8" w:space="0" w:color="000000"/>
               <w:right w:val="single" w:sz="8" w:space="0" w:color="000000"/>
@@ -18196,7 +18416,8 @@
               <w:jc w:val="both"/>
               <w:rPr>
                 <w:rFonts w:ascii="Times New Roman;serif" w:hAnsi="Times New Roman;serif"/>
-                <w:b/>
+                <w:b w:val="false"/>
+                <w:bCs w:val="false"/>
                 <w:i w:val="false"/>
                 <w:i w:val="false"/>
                 <w:caps w:val="false"/>
@@ -18213,7 +18434,8 @@
             <w:r>
               <w:rPr>
                 <w:rFonts w:ascii="Times New Roman;serif" w:hAnsi="Times New Roman;serif"/>
-                <w:b/>
+                <w:b w:val="false"/>
+                <w:bCs w:val="false"/>
                 <w:i w:val="false"/>
                 <w:caps w:val="false"/>
                 <w:smallCaps w:val="false"/>
@@ -18225,6 +18447,89 @@
                 <w:effect w:val="none"/>
                 <w:shd w:fill="auto" w:val="clear"/>
               </w:rPr>
+              <w:t>Componentes Curriculares de Extensão</w:t>
+            </w:r>
+          </w:p>
+        </w:tc>
+        <w:tc>
+          <w:tcPr>
+            <w:tcW w:w="2443" w:type="dxa"/>
+            <w:tcBorders>
+              <w:left w:val="single" w:sz="8" w:space="0" w:color="000000"/>
+              <w:right w:val="single" w:sz="8" w:space="0" w:color="000000"/>
+            </w:tcBorders>
+            <w:vAlign w:val="center"/>
+          </w:tcPr>
+          <w:p>
+            <w:pPr>
+              <w:pStyle w:val="TableContents"/>
+              <w:widowControl/>
+              <w:bidi w:val="0"/>
+              <w:spacing w:lineRule="auto" w:line="288" w:before="0" w:after="0"/>
+              <w:ind w:hanging="0" w:left="0" w:right="0"/>
+              <w:jc w:val="left"/>
+              <w:rPr>
+                <w:b w:val="false"/>
+                <w:bCs w:val="false"/>
+              </w:rPr>
+            </w:pPr>
+            <w:r>
+              <w:rPr>
+                <w:rFonts w:ascii="Times New Roman;serif" w:hAnsi="Times New Roman;serif"/>
+                <w:b w:val="false"/>
+                <w:bCs w:val="false"/>
+                <w:i w:val="false"/>
+                <w:caps w:val="false"/>
+                <w:smallCaps w:val="false"/>
+                <w:strike w:val="false"/>
+                <w:dstrike w:val="false"/>
+                <w:color w:val="000000"/>
+                <w:sz w:val="22"/>
+                <w:u w:val="none"/>
+                <w:effect w:val="none"/>
+                <w:shd w:fill="auto" w:val="clear"/>
+              </w:rPr>
+              <w:t>0</w:t>
+            </w:r>
+          </w:p>
+        </w:tc>
+        <w:tc>
+          <w:tcPr>
+            <w:tcW w:w="2910" w:type="dxa"/>
+            <w:tcBorders>
+              <w:left w:val="single" w:sz="8" w:space="0" w:color="000000"/>
+              <w:right w:val="single" w:sz="8" w:space="0" w:color="000000"/>
+            </w:tcBorders>
+            <w:vAlign w:val="center"/>
+          </w:tcPr>
+          <w:p>
+            <w:pPr>
+              <w:pStyle w:val="BodyText"/>
+              <w:widowControl/>
+              <w:suppressAutoHyphens w:val="true"/>
+              <w:bidi w:val="0"/>
+              <w:spacing w:lineRule="auto" w:line="288" w:before="0" w:after="0"/>
+              <w:ind w:hanging="0" w:left="0" w:right="121"/>
+              <w:jc w:val="both"/>
+              <w:rPr>
+                <w:rFonts w:ascii="Liberation Serif" w:hAnsi="Liberation Serif" w:eastAsia="Noto Serif CJK SC" w:cs="FreeSans"/>
+                <w:color w:val="auto"/>
+                <w:kern w:val="2"/>
+                <w:sz w:val="24"/>
+                <w:szCs w:val="24"/>
+                <w:lang w:val="pt-BR" w:eastAsia="zh-CN" w:bidi="hi-IN"/>
+              </w:rPr>
+            </w:pPr>
+            <w:r>
+              <w:rPr>
+                <w:rFonts w:eastAsia="Noto Serif CJK SC" w:cs="FreeSans"/>
+                <w:color w:val="auto"/>
+                <w:kern w:val="2"/>
+                <w:sz w:val="24"/>
+                <w:szCs w:val="24"/>
+                <w:lang w:val="pt-BR" w:eastAsia="zh-CN" w:bidi="hi-IN"/>
+              </w:rPr>
+              <w:t>0%</w:t>
             </w:r>
           </w:p>
         </w:tc>
@@ -18281,13 +18586,97 @@
                 <w:effect w:val="none"/>
                 <w:shd w:fill="auto" w:val="clear"/>
               </w:rPr>
-              <w:t>Componentes Curriculares Optativos</w:t>
-            </w:r>
-          </w:p>
-        </w:tc>
-        <w:tc>
-          <w:tcPr>
-            <w:tcW w:w="2337" w:type="dxa"/>
+              <w:t>Prática Profissional – Estágio Supervisionado</w:t>
+            </w:r>
+          </w:p>
+        </w:tc>
+        <w:tc>
+          <w:tcPr>
+            <w:tcW w:w="2443" w:type="dxa"/>
+            <w:tcBorders>
+              <w:left w:val="single" w:sz="8" w:space="0" w:color="000000"/>
+              <w:right w:val="single" w:sz="8" w:space="0" w:color="000000"/>
+            </w:tcBorders>
+            <w:vAlign w:val="center"/>
+          </w:tcPr>
+          <w:p>
+            <w:pPr>
+              <w:pStyle w:val="BodyText"/>
+              <w:widowControl/>
+              <w:suppressAutoHyphens w:val="true"/>
+              <w:bidi w:val="0"/>
+              <w:spacing w:lineRule="auto" w:line="288" w:before="0" w:after="0"/>
+              <w:ind w:hanging="0" w:left="0" w:right="121"/>
+              <w:jc w:val="both"/>
+              <w:rPr>
+                <w:rFonts w:ascii="Liberation Serif" w:hAnsi="Liberation Serif" w:eastAsia="Noto Serif CJK SC" w:cs="FreeSans"/>
+                <w:color w:val="auto"/>
+                <w:kern w:val="2"/>
+                <w:sz w:val="24"/>
+                <w:szCs w:val="24"/>
+                <w:lang w:val="pt-BR" w:eastAsia="zh-CN" w:bidi="hi-IN"/>
+              </w:rPr>
+            </w:pPr>
+            <w:r>
+              <w:rPr>
+                <w:rFonts w:eastAsia="Noto Serif CJK SC" w:cs="FreeSans"/>
+                <w:color w:val="auto"/>
+                <w:kern w:val="2"/>
+                <w:sz w:val="24"/>
+                <w:szCs w:val="24"/>
+                <w:lang w:val="pt-BR" w:eastAsia="zh-CN" w:bidi="hi-IN"/>
+              </w:rPr>
+              <w:t>{{carga_horaria_estagio_supervisionado_hr}}</w:t>
+            </w:r>
+          </w:p>
+        </w:tc>
+        <w:tc>
+          <w:tcPr>
+            <w:tcW w:w="2910" w:type="dxa"/>
+            <w:tcBorders>
+              <w:left w:val="single" w:sz="8" w:space="0" w:color="000000"/>
+              <w:right w:val="single" w:sz="8" w:space="0" w:color="000000"/>
+            </w:tcBorders>
+            <w:vAlign w:val="center"/>
+          </w:tcPr>
+          <w:p>
+            <w:pPr>
+              <w:pStyle w:val="BodyText"/>
+              <w:widowControl/>
+              <w:suppressAutoHyphens w:val="true"/>
+              <w:bidi w:val="0"/>
+              <w:spacing w:lineRule="auto" w:line="288" w:before="0" w:after="0"/>
+              <w:ind w:hanging="0" w:left="0" w:right="121"/>
+              <w:jc w:val="both"/>
+              <w:rPr>
+                <w:rFonts w:ascii="Liberation Serif" w:hAnsi="Liberation Serif" w:eastAsia="Noto Serif CJK SC" w:cs="FreeSans"/>
+                <w:color w:val="auto"/>
+                <w:kern w:val="2"/>
+                <w:sz w:val="24"/>
+                <w:szCs w:val="24"/>
+                <w:lang w:val="pt-BR" w:eastAsia="zh-CN" w:bidi="hi-IN"/>
+              </w:rPr>
+            </w:pPr>
+            <w:r>
+              <w:rPr>
+                <w:rFonts w:eastAsia="Noto Serif CJK SC" w:cs="FreeSans"/>
+                <w:color w:val="auto"/>
+                <w:kern w:val="2"/>
+                <w:sz w:val="24"/>
+                <w:szCs w:val="24"/>
+                <w:lang w:val="pt-BR" w:eastAsia="zh-CN" w:bidi="hi-IN"/>
+              </w:rPr>
+              <w:t>{{carga_horaria_estagio_supervisionado_per}}</w:t>
+              <w:br/>
+            </w:r>
+          </w:p>
+        </w:tc>
+      </w:tr>
+      <w:tr>
+        <w:trPr/>
+        <w:tc>
+          <w:tcPr>
+            <w:tcW w:w="4292" w:type="dxa"/>
             <w:tcBorders>
               <w:left w:val="single" w:sz="8" w:space="0" w:color="000000"/>
               <w:right w:val="single" w:sz="8" w:space="0" w:color="000000"/>
@@ -18304,41 +18693,171 @@
               <w:jc w:val="both"/>
               <w:rPr>
                 <w:rFonts w:ascii="Times New Roman;serif" w:hAnsi="Times New Roman;serif"/>
+                <w:b w:val="false"/>
+                <w:bCs w:val="false"/>
+                <w:i w:val="false"/>
+                <w:i w:val="false"/>
+                <w:caps w:val="false"/>
+                <w:smallCaps w:val="false"/>
+                <w:strike w:val="false"/>
+                <w:dstrike w:val="false"/>
+                <w:color w:val="000000"/>
+                <w:sz w:val="22"/>
+                <w:u w:val="none"/>
+                <w:effect w:val="none"/>
+                <w:shd w:fill="auto" w:val="clear"/>
+              </w:rPr>
+            </w:pPr>
+            <w:r>
+              <w:rPr>
+                <w:rFonts w:ascii="Times New Roman;serif" w:hAnsi="Times New Roman;serif"/>
+                <w:b w:val="false"/>
+                <w:bCs w:val="false"/>
+                <w:i w:val="false"/>
+                <w:caps w:val="false"/>
+                <w:smallCaps w:val="false"/>
+                <w:strike w:val="false"/>
+                <w:dstrike w:val="false"/>
+                <w:color w:val="000000"/>
+                <w:sz w:val="22"/>
+                <w:u w:val="none"/>
+                <w:effect w:val="none"/>
+                <w:shd w:fill="auto" w:val="clear"/>
+              </w:rPr>
+              <w:t>Atividades Complementares</w:t>
+            </w:r>
+          </w:p>
+        </w:tc>
+        <w:tc>
+          <w:tcPr>
+            <w:tcW w:w="2443" w:type="dxa"/>
+            <w:tcBorders>
+              <w:left w:val="single" w:sz="8" w:space="0" w:color="000000"/>
+              <w:right w:val="single" w:sz="8" w:space="0" w:color="000000"/>
+            </w:tcBorders>
+            <w:vAlign w:val="center"/>
+          </w:tcPr>
+          <w:p>
+            <w:pPr>
+              <w:pStyle w:val="TableContents"/>
+              <w:widowControl/>
+              <w:suppressAutoHyphens w:val="true"/>
+              <w:bidi w:val="0"/>
+              <w:spacing w:lineRule="auto" w:line="288" w:before="0" w:after="0"/>
+              <w:ind w:hanging="0" w:left="0" w:right="0"/>
+              <w:jc w:val="center"/>
+              <w:rPr>
+                <w:rFonts w:ascii="Times New Roman;serif" w:hAnsi="Times New Roman;serif" w:eastAsia="Noto Serif CJK SC" w:cs="FreeSans"/>
                 <w:b/>
                 <w:i w:val="false"/>
                 <w:i w:val="false"/>
-                <w:caps w:val="false"/>
-                <w:smallCaps w:val="false"/>
-                <w:strike w:val="false"/>
-                <w:dstrike w:val="false"/>
-                <w:color w:val="000000"/>
-                <w:sz w:val="22"/>
+                <w:strike w:val="false"/>
+                <w:dstrike w:val="false"/>
+                <w:color w:val="000000"/>
+                <w:kern w:val="2"/>
+                <w:sz w:val="22"/>
+                <w:szCs w:val="24"/>
                 <w:u w:val="none"/>
                 <w:effect w:val="none"/>
                 <w:shd w:fill="auto" w:val="clear"/>
-              </w:rPr>
-            </w:pPr>
-            <w:r>
-              <w:rPr>
-                <w:rFonts w:ascii="Times New Roman;serif" w:hAnsi="Times New Roman;serif"/>
+                <w:lang w:val="pt-BR" w:eastAsia="zh-CN" w:bidi="hi-IN"/>
+              </w:rPr>
+            </w:pPr>
+            <w:r>
+              <w:rPr>
+                <w:rFonts w:eastAsia="Noto Serif CJK SC" w:cs="FreeSans" w:ascii="Times New Roman;serif" w:hAnsi="Times New Roman;serif"/>
                 <w:b/>
                 <w:i w:val="false"/>
-                <w:caps w:val="false"/>
-                <w:smallCaps w:val="false"/>
-                <w:strike w:val="false"/>
-                <w:dstrike w:val="false"/>
-                <w:color w:val="000000"/>
-                <w:sz w:val="22"/>
+                <w:strike w:val="false"/>
+                <w:dstrike w:val="false"/>
+                <w:color w:val="000000"/>
+                <w:kern w:val="2"/>
+                <w:sz w:val="22"/>
+                <w:szCs w:val="24"/>
                 <w:u w:val="none"/>
                 <w:effect w:val="none"/>
                 <w:shd w:fill="auto" w:val="clear"/>
-              </w:rPr>
-            </w:r>
-          </w:p>
-        </w:tc>
-        <w:tc>
-          <w:tcPr>
-            <w:tcW w:w="3016" w:type="dxa"/>
+                <w:lang w:val="pt-BR" w:eastAsia="zh-CN" w:bidi="hi-IN"/>
+              </w:rPr>
+            </w:r>
+          </w:p>
+          <w:p>
+            <w:pPr>
+              <w:pStyle w:val="BodyText"/>
+              <w:widowControl/>
+              <w:suppressAutoHyphens w:val="true"/>
+              <w:bidi w:val="0"/>
+              <w:spacing w:lineRule="auto" w:line="288" w:before="0" w:after="0"/>
+              <w:ind w:hanging="0" w:left="0" w:right="121"/>
+              <w:jc w:val="both"/>
+              <w:rPr>
+                <w:rFonts w:ascii="Liberation Serif" w:hAnsi="Liberation Serif" w:eastAsia="Noto Serif CJK SC" w:cs="FreeSans"/>
+                <w:color w:val="auto"/>
+                <w:kern w:val="2"/>
+                <w:sz w:val="24"/>
+                <w:szCs w:val="24"/>
+                <w:lang w:val="pt-BR" w:eastAsia="zh-CN" w:bidi="hi-IN"/>
+              </w:rPr>
+            </w:pPr>
+            <w:r>
+              <w:rPr>
+                <w:rFonts w:eastAsia="Noto Serif CJK SC" w:cs="FreeSans"/>
+                <w:color w:val="auto"/>
+                <w:kern w:val="2"/>
+                <w:sz w:val="24"/>
+                <w:szCs w:val="24"/>
+                <w:lang w:val="pt-BR" w:eastAsia="zh-CN" w:bidi="hi-IN"/>
+              </w:rPr>
+              <w:t>{{carga_horaria_atividades_complementares_hr}}</w:t>
+            </w:r>
+          </w:p>
+        </w:tc>
+        <w:tc>
+          <w:tcPr>
+            <w:tcW w:w="2910" w:type="dxa"/>
+            <w:tcBorders>
+              <w:left w:val="single" w:sz="8" w:space="0" w:color="000000"/>
+              <w:right w:val="single" w:sz="8" w:space="0" w:color="000000"/>
+            </w:tcBorders>
+            <w:vAlign w:val="center"/>
+          </w:tcPr>
+          <w:p>
+            <w:pPr>
+              <w:pStyle w:val="BodyText"/>
+              <w:widowControl/>
+              <w:suppressAutoHyphens w:val="true"/>
+              <w:bidi w:val="0"/>
+              <w:spacing w:lineRule="auto" w:line="288" w:before="0" w:after="0"/>
+              <w:ind w:hanging="0" w:left="0" w:right="121"/>
+              <w:jc w:val="both"/>
+              <w:rPr>
+                <w:rFonts w:ascii="Liberation Serif" w:hAnsi="Liberation Serif" w:eastAsia="Noto Serif CJK SC" w:cs="FreeSans"/>
+                <w:color w:val="auto"/>
+                <w:kern w:val="2"/>
+                <w:sz w:val="24"/>
+                <w:szCs w:val="24"/>
+                <w:lang w:val="pt-BR" w:eastAsia="zh-CN" w:bidi="hi-IN"/>
+              </w:rPr>
+            </w:pPr>
+            <w:r>
+              <w:rPr>
+                <w:rFonts w:eastAsia="Noto Serif CJK SC" w:cs="FreeSans"/>
+                <w:color w:val="auto"/>
+                <w:kern w:val="2"/>
+                <w:sz w:val="24"/>
+                <w:szCs w:val="24"/>
+                <w:lang w:val="pt-BR" w:eastAsia="zh-CN" w:bidi="hi-IN"/>
+              </w:rPr>
+              <w:t>{{carga_horaria_atividades_complementares_per}}</w:t>
+            </w:r>
+          </w:p>
+        </w:tc>
+      </w:tr>
+      <w:tr>
+        <w:trPr/>
+        <w:tc>
+          <w:tcPr>
+            <w:tcW w:w="4292" w:type="dxa"/>
             <w:tcBorders>
               <w:left w:val="single" w:sz="8" w:space="0" w:color="000000"/>
               <w:right w:val="single" w:sz="8" w:space="0" w:color="000000"/>
@@ -18356,6 +18875,7 @@
               <w:rPr>
                 <w:rFonts w:ascii="Times New Roman;serif" w:hAnsi="Times New Roman;serif"/>
                 <w:b/>
+                <w:bCs/>
                 <w:i w:val="false"/>
                 <w:i w:val="false"/>
                 <w:caps w:val="false"/>
@@ -18373,6 +18893,7 @@
               <w:rPr>
                 <w:rFonts w:ascii="Times New Roman;serif" w:hAnsi="Times New Roman;serif"/>
                 <w:b/>
+                <w:bCs/>
                 <w:i w:val="false"/>
                 <w:caps w:val="false"/>
                 <w:smallCaps w:val="false"/>
@@ -18384,15 +18905,13 @@
                 <w:effect w:val="none"/>
                 <w:shd w:fill="auto" w:val="clear"/>
               </w:rPr>
-            </w:r>
-          </w:p>
-        </w:tc>
-      </w:tr>
-      <w:tr>
-        <w:trPr/>
-        <w:tc>
-          <w:tcPr>
-            <w:tcW w:w="4292" w:type="dxa"/>
+              <w:t>CARGA HORÁRIA TOTAL (CHT)</w:t>
+            </w:r>
+          </w:p>
+        </w:tc>
+        <w:tc>
+          <w:tcPr>
+            <w:tcW w:w="2443" w:type="dxa"/>
             <w:tcBorders>
               <w:left w:val="single" w:sz="8" w:space="0" w:color="000000"/>
               <w:right w:val="single" w:sz="8" w:space="0" w:color="000000"/>
@@ -18406,11 +18925,10 @@
               <w:bidi w:val="0"/>
               <w:spacing w:lineRule="auto" w:line="288" w:before="0" w:after="0"/>
               <w:ind w:hanging="0" w:left="0" w:right="0"/>
-              <w:jc w:val="both"/>
-              <w:rPr>
-                <w:rFonts w:ascii="Times New Roman;serif" w:hAnsi="Times New Roman;serif"/>
-                <w:b w:val="false"/>
-                <w:bCs w:val="false"/>
+              <w:jc w:val="center"/>
+              <w:rPr>
+                <w:rFonts w:ascii="Times New Roman;serif" w:hAnsi="Times New Roman;serif"/>
+                <w:b/>
                 <w:i w:val="false"/>
                 <w:i w:val="false"/>
                 <w:caps w:val="false"/>
@@ -18427,8 +18945,7 @@
             <w:r>
               <w:rPr>
                 <w:rFonts w:ascii="Times New Roman;serif" w:hAnsi="Times New Roman;serif"/>
-                <w:b w:val="false"/>
-                <w:bCs w:val="false"/>
+                <w:b/>
                 <w:i w:val="false"/>
                 <w:caps w:val="false"/>
                 <w:smallCaps w:val="false"/>
@@ -18440,13 +18957,13 @@
                 <w:effect w:val="none"/>
                 <w:shd w:fill="auto" w:val="clear"/>
               </w:rPr>
-              <w:t>Componentes Curriculares de Extensão</w:t>
-            </w:r>
-          </w:p>
-        </w:tc>
-        <w:tc>
-          <w:tcPr>
-            <w:tcW w:w="2337" w:type="dxa"/>
+              <w:t>{{cht}}</w:t>
+            </w:r>
+          </w:p>
+        </w:tc>
+        <w:tc>
+          <w:tcPr>
+            <w:tcW w:w="2910" w:type="dxa"/>
             <w:tcBorders>
               <w:left w:val="single" w:sz="8" w:space="0" w:color="000000"/>
               <w:right w:val="single" w:sz="8" w:space="0" w:color="000000"/>
@@ -18460,7 +18977,7 @@
               <w:bidi w:val="0"/>
               <w:spacing w:lineRule="auto" w:line="288" w:before="0" w:after="0"/>
               <w:ind w:hanging="0" w:left="0" w:right="0"/>
-              <w:jc w:val="both"/>
+              <w:jc w:val="center"/>
               <w:rPr>
                 <w:rFonts w:ascii="Times New Roman;serif" w:hAnsi="Times New Roman;serif"/>
                 <w:b/>
@@ -18492,375 +19009,7 @@
                 <w:effect w:val="none"/>
                 <w:shd w:fill="auto" w:val="clear"/>
               </w:rPr>
-            </w:r>
-          </w:p>
-        </w:tc>
-        <w:tc>
-          <w:tcPr>
-            <w:tcW w:w="3016" w:type="dxa"/>
-            <w:tcBorders>
-              <w:left w:val="single" w:sz="8" w:space="0" w:color="000000"/>
-              <w:right w:val="single" w:sz="8" w:space="0" w:color="000000"/>
-            </w:tcBorders>
-            <w:vAlign w:val="center"/>
-          </w:tcPr>
-          <w:p>
-            <w:pPr>
-              <w:pStyle w:val="TableContents"/>
-              <w:widowControl/>
-              <w:bidi w:val="0"/>
-              <w:spacing w:lineRule="auto" w:line="288" w:before="0" w:after="0"/>
-              <w:ind w:hanging="0" w:left="0" w:right="0"/>
-              <w:jc w:val="both"/>
-              <w:rPr>
-                <w:rFonts w:ascii="Times New Roman;serif" w:hAnsi="Times New Roman;serif"/>
-                <w:b/>
-                <w:i w:val="false"/>
-                <w:i w:val="false"/>
-                <w:caps w:val="false"/>
-                <w:smallCaps w:val="false"/>
-                <w:strike w:val="false"/>
-                <w:dstrike w:val="false"/>
-                <w:color w:val="000000"/>
-                <w:sz w:val="22"/>
-                <w:u w:val="none"/>
-                <w:effect w:val="none"/>
-                <w:shd w:fill="auto" w:val="clear"/>
-              </w:rPr>
-            </w:pPr>
-            <w:r>
-              <w:rPr>
-                <w:rFonts w:ascii="Times New Roman;serif" w:hAnsi="Times New Roman;serif"/>
-                <w:b/>
-                <w:i w:val="false"/>
-                <w:caps w:val="false"/>
-                <w:smallCaps w:val="false"/>
-                <w:strike w:val="false"/>
-                <w:dstrike w:val="false"/>
-                <w:color w:val="000000"/>
-                <w:sz w:val="22"/>
-                <w:u w:val="none"/>
-                <w:effect w:val="none"/>
-                <w:shd w:fill="auto" w:val="clear"/>
-              </w:rPr>
-            </w:r>
-          </w:p>
-        </w:tc>
-      </w:tr>
-      <w:tr>
-        <w:trPr/>
-        <w:tc>
-          <w:tcPr>
-            <w:tcW w:w="4292" w:type="dxa"/>
-            <w:tcBorders>
-              <w:left w:val="single" w:sz="8" w:space="0" w:color="000000"/>
-              <w:right w:val="single" w:sz="8" w:space="0" w:color="000000"/>
-            </w:tcBorders>
-            <w:vAlign w:val="center"/>
-          </w:tcPr>
-          <w:p>
-            <w:pPr>
-              <w:pStyle w:val="TableContents"/>
-              <w:widowControl/>
-              <w:bidi w:val="0"/>
-              <w:spacing w:lineRule="auto" w:line="288" w:before="0" w:after="0"/>
-              <w:ind w:hanging="0" w:left="0" w:right="0"/>
-              <w:jc w:val="both"/>
-              <w:rPr>
-                <w:rFonts w:ascii="Times New Roman;serif" w:hAnsi="Times New Roman;serif"/>
-                <w:b w:val="false"/>
-                <w:bCs w:val="false"/>
-                <w:i w:val="false"/>
-                <w:i w:val="false"/>
-                <w:caps w:val="false"/>
-                <w:smallCaps w:val="false"/>
-                <w:strike w:val="false"/>
-                <w:dstrike w:val="false"/>
-                <w:color w:val="000000"/>
-                <w:sz w:val="22"/>
-                <w:u w:val="none"/>
-                <w:effect w:val="none"/>
-                <w:shd w:fill="auto" w:val="clear"/>
-              </w:rPr>
-            </w:pPr>
-            <w:r>
-              <w:rPr>
-                <w:rFonts w:ascii="Times New Roman;serif" w:hAnsi="Times New Roman;serif"/>
-                <w:b w:val="false"/>
-                <w:bCs w:val="false"/>
-                <w:i w:val="false"/>
-                <w:caps w:val="false"/>
-                <w:smallCaps w:val="false"/>
-                <w:strike w:val="false"/>
-                <w:dstrike w:val="false"/>
-                <w:color w:val="000000"/>
-                <w:sz w:val="22"/>
-                <w:u w:val="none"/>
-                <w:effect w:val="none"/>
-                <w:shd w:fill="auto" w:val="clear"/>
-              </w:rPr>
-              <w:t>Atividades Complementares</w:t>
-            </w:r>
-          </w:p>
-        </w:tc>
-        <w:tc>
-          <w:tcPr>
-            <w:tcW w:w="2337" w:type="dxa"/>
-            <w:tcBorders>
-              <w:left w:val="single" w:sz="8" w:space="0" w:color="000000"/>
-              <w:right w:val="single" w:sz="8" w:space="0" w:color="000000"/>
-            </w:tcBorders>
-            <w:vAlign w:val="center"/>
-          </w:tcPr>
-          <w:p>
-            <w:pPr>
-              <w:pStyle w:val="TableContents"/>
-              <w:widowControl/>
-              <w:bidi w:val="0"/>
-              <w:spacing w:lineRule="auto" w:line="288" w:before="0" w:after="0"/>
-              <w:ind w:hanging="0" w:left="0" w:right="0"/>
-              <w:jc w:val="both"/>
-              <w:rPr>
-                <w:rFonts w:ascii="Times New Roman;serif" w:hAnsi="Times New Roman;serif"/>
-                <w:b/>
-                <w:i w:val="false"/>
-                <w:i w:val="false"/>
-                <w:caps w:val="false"/>
-                <w:smallCaps w:val="false"/>
-                <w:strike w:val="false"/>
-                <w:dstrike w:val="false"/>
-                <w:color w:val="000000"/>
-                <w:sz w:val="22"/>
-                <w:u w:val="none"/>
-                <w:effect w:val="none"/>
-                <w:shd w:fill="auto" w:val="clear"/>
-              </w:rPr>
-            </w:pPr>
-            <w:r>
-              <w:rPr>
-                <w:rFonts w:ascii="Times New Roman;serif" w:hAnsi="Times New Roman;serif"/>
-                <w:b/>
-                <w:i w:val="false"/>
-                <w:caps w:val="false"/>
-                <w:smallCaps w:val="false"/>
-                <w:strike w:val="false"/>
-                <w:dstrike w:val="false"/>
-                <w:color w:val="000000"/>
-                <w:sz w:val="22"/>
-                <w:u w:val="none"/>
-                <w:effect w:val="none"/>
-                <w:shd w:fill="auto" w:val="clear"/>
-              </w:rPr>
-            </w:r>
-          </w:p>
-        </w:tc>
-        <w:tc>
-          <w:tcPr>
-            <w:tcW w:w="3016" w:type="dxa"/>
-            <w:tcBorders>
-              <w:left w:val="single" w:sz="8" w:space="0" w:color="000000"/>
-              <w:right w:val="single" w:sz="8" w:space="0" w:color="000000"/>
-            </w:tcBorders>
-            <w:vAlign w:val="center"/>
-          </w:tcPr>
-          <w:p>
-            <w:pPr>
-              <w:pStyle w:val="TableContents"/>
-              <w:widowControl/>
-              <w:bidi w:val="0"/>
-              <w:spacing w:lineRule="auto" w:line="288" w:before="0" w:after="0"/>
-              <w:ind w:hanging="0" w:left="0" w:right="0"/>
-              <w:jc w:val="both"/>
-              <w:rPr>
-                <w:rFonts w:ascii="Times New Roman;serif" w:hAnsi="Times New Roman;serif"/>
-                <w:b/>
-                <w:i w:val="false"/>
-                <w:i w:val="false"/>
-                <w:caps w:val="false"/>
-                <w:smallCaps w:val="false"/>
-                <w:strike w:val="false"/>
-                <w:dstrike w:val="false"/>
-                <w:color w:val="000000"/>
-                <w:sz w:val="22"/>
-                <w:u w:val="none"/>
-                <w:effect w:val="none"/>
-                <w:shd w:fill="auto" w:val="clear"/>
-              </w:rPr>
-            </w:pPr>
-            <w:r>
-              <w:rPr>
-                <w:rFonts w:ascii="Times New Roman;serif" w:hAnsi="Times New Roman;serif"/>
-                <w:b/>
-                <w:i w:val="false"/>
-                <w:caps w:val="false"/>
-                <w:smallCaps w:val="false"/>
-                <w:strike w:val="false"/>
-                <w:dstrike w:val="false"/>
-                <w:color w:val="000000"/>
-                <w:sz w:val="22"/>
-                <w:u w:val="none"/>
-                <w:effect w:val="none"/>
-                <w:shd w:fill="auto" w:val="clear"/>
-              </w:rPr>
-            </w:r>
-          </w:p>
-        </w:tc>
-      </w:tr>
-      <w:tr>
-        <w:trPr/>
-        <w:tc>
-          <w:tcPr>
-            <w:tcW w:w="4292" w:type="dxa"/>
-            <w:tcBorders>
-              <w:left w:val="single" w:sz="8" w:space="0" w:color="000000"/>
-              <w:right w:val="single" w:sz="8" w:space="0" w:color="000000"/>
-            </w:tcBorders>
-            <w:vAlign w:val="center"/>
-          </w:tcPr>
-          <w:p>
-            <w:pPr>
-              <w:pStyle w:val="TableContents"/>
-              <w:widowControl/>
-              <w:bidi w:val="0"/>
-              <w:spacing w:lineRule="auto" w:line="288" w:before="0" w:after="0"/>
-              <w:ind w:hanging="0" w:left="0" w:right="0"/>
-              <w:jc w:val="both"/>
-              <w:rPr>
-                <w:rFonts w:ascii="Times New Roman;serif" w:hAnsi="Times New Roman;serif"/>
-                <w:b/>
-                <w:bCs/>
-                <w:i w:val="false"/>
-                <w:i w:val="false"/>
-                <w:caps w:val="false"/>
-                <w:smallCaps w:val="false"/>
-                <w:strike w:val="false"/>
-                <w:dstrike w:val="false"/>
-                <w:color w:val="000000"/>
-                <w:sz w:val="22"/>
-                <w:u w:val="none"/>
-                <w:effect w:val="none"/>
-                <w:shd w:fill="auto" w:val="clear"/>
-              </w:rPr>
-            </w:pPr>
-            <w:r>
-              <w:rPr>
-                <w:rFonts w:ascii="Times New Roman;serif" w:hAnsi="Times New Roman;serif"/>
-                <w:b/>
-                <w:bCs/>
-                <w:i w:val="false"/>
-                <w:caps w:val="false"/>
-                <w:smallCaps w:val="false"/>
-                <w:strike w:val="false"/>
-                <w:dstrike w:val="false"/>
-                <w:color w:val="000000"/>
-                <w:sz w:val="22"/>
-                <w:u w:val="none"/>
-                <w:effect w:val="none"/>
-                <w:shd w:fill="auto" w:val="clear"/>
-              </w:rPr>
-              <w:t>CARGA HORÁRIA TOTAL (CHT)</w:t>
-            </w:r>
-          </w:p>
-        </w:tc>
-        <w:tc>
-          <w:tcPr>
-            <w:tcW w:w="2337" w:type="dxa"/>
-            <w:tcBorders>
-              <w:left w:val="single" w:sz="8" w:space="0" w:color="000000"/>
-              <w:right w:val="single" w:sz="8" w:space="0" w:color="000000"/>
-            </w:tcBorders>
-            <w:vAlign w:val="center"/>
-          </w:tcPr>
-          <w:p>
-            <w:pPr>
-              <w:pStyle w:val="TableContents"/>
-              <w:widowControl/>
-              <w:bidi w:val="0"/>
-              <w:spacing w:lineRule="auto" w:line="288" w:before="0" w:after="0"/>
-              <w:ind w:hanging="0" w:left="0" w:right="0"/>
-              <w:jc w:val="both"/>
-              <w:rPr>
-                <w:rFonts w:ascii="Times New Roman;serif" w:hAnsi="Times New Roman;serif"/>
-                <w:b/>
-                <w:i w:val="false"/>
-                <w:i w:val="false"/>
-                <w:caps w:val="false"/>
-                <w:smallCaps w:val="false"/>
-                <w:strike w:val="false"/>
-                <w:dstrike w:val="false"/>
-                <w:color w:val="000000"/>
-                <w:sz w:val="22"/>
-                <w:u w:val="none"/>
-                <w:effect w:val="none"/>
-                <w:shd w:fill="auto" w:val="clear"/>
-              </w:rPr>
-            </w:pPr>
-            <w:r>
-              <w:rPr>
-                <w:rFonts w:ascii="Times New Roman;serif" w:hAnsi="Times New Roman;serif"/>
-                <w:b/>
-                <w:i w:val="false"/>
-                <w:caps w:val="false"/>
-                <w:smallCaps w:val="false"/>
-                <w:strike w:val="false"/>
-                <w:dstrike w:val="false"/>
-                <w:color w:val="000000"/>
-                <w:sz w:val="22"/>
-                <w:u w:val="none"/>
-                <w:effect w:val="none"/>
-                <w:shd w:fill="auto" w:val="clear"/>
-              </w:rPr>
-            </w:r>
-          </w:p>
-        </w:tc>
-        <w:tc>
-          <w:tcPr>
-            <w:tcW w:w="3016" w:type="dxa"/>
-            <w:tcBorders>
-              <w:left w:val="single" w:sz="8" w:space="0" w:color="000000"/>
-              <w:right w:val="single" w:sz="8" w:space="0" w:color="000000"/>
-            </w:tcBorders>
-            <w:vAlign w:val="center"/>
-          </w:tcPr>
-          <w:p>
-            <w:pPr>
-              <w:pStyle w:val="TableContents"/>
-              <w:widowControl/>
-              <w:bidi w:val="0"/>
-              <w:spacing w:lineRule="auto" w:line="288" w:before="0" w:after="0"/>
-              <w:ind w:hanging="0" w:left="0" w:right="0"/>
-              <w:jc w:val="both"/>
-              <w:rPr>
-                <w:rFonts w:ascii="Times New Roman;serif" w:hAnsi="Times New Roman;serif"/>
-                <w:b/>
-                <w:i w:val="false"/>
-                <w:i w:val="false"/>
-                <w:caps w:val="false"/>
-                <w:smallCaps w:val="false"/>
-                <w:strike w:val="false"/>
-                <w:dstrike w:val="false"/>
-                <w:color w:val="000000"/>
-                <w:sz w:val="22"/>
-                <w:u w:val="none"/>
-                <w:effect w:val="none"/>
-                <w:shd w:fill="auto" w:val="clear"/>
-              </w:rPr>
-            </w:pPr>
-            <w:r>
-              <w:rPr>
-                <w:rFonts w:ascii="Times New Roman;serif" w:hAnsi="Times New Roman;serif"/>
-                <w:b/>
-                <w:i w:val="false"/>
-                <w:caps w:val="false"/>
-                <w:smallCaps w:val="false"/>
-                <w:strike w:val="false"/>
-                <w:dstrike w:val="false"/>
-                <w:color w:val="000000"/>
-                <w:sz w:val="22"/>
-                <w:u w:val="none"/>
-                <w:effect w:val="none"/>
-                <w:shd w:fill="auto" w:val="clear"/>
-              </w:rPr>
+              <w:t>100%</w:t>
             </w:r>
           </w:p>
         </w:tc>
@@ -18897,8 +19046,8 @@
         </w:numPr>
         <w:rPr/>
       </w:pPr>
-      <w:bookmarkStart w:id="71" w:name="__RefHeading___Toc8357_1736451874"/>
-      <w:bookmarkEnd w:id="71"/>
+      <w:bookmarkStart w:id="73" w:name="__RefHeading___Toc8357_1736451874"/>
+      <w:bookmarkEnd w:id="73"/>
       <w:r>
         <w:rPr/>
         <w:t>ORIENTAÇÕES METODOLÓGICAS</w:t>
@@ -18987,8 +19136,8 @@
         </w:numPr>
         <w:rPr/>
       </w:pPr>
-      <w:bookmarkStart w:id="72" w:name="__RefHeading___Toc8359_1736451874"/>
-      <w:bookmarkEnd w:id="72"/>
+      <w:bookmarkStart w:id="74" w:name="__RefHeading___Toc8359_1736451874"/>
+      <w:bookmarkEnd w:id="74"/>
       <w:r>
         <w:rPr/>
         <w:t>ATIVIDADES DE ENSINO, PESQUISA E EXTENSÃO</w:t>
@@ -19031,8 +19180,8 @@
         </w:numPr>
         <w:rPr/>
       </w:pPr>
-      <w:bookmarkStart w:id="73" w:name="__RefHeading___Toc8361_1736451874"/>
-      <w:bookmarkEnd w:id="73"/>
+      <w:bookmarkStart w:id="75" w:name="__RefHeading___Toc8361_1736451874"/>
+      <w:bookmarkEnd w:id="75"/>
       <w:r>
         <w:rPr/>
         <w:t>Atividades complementares</w:t>
@@ -19093,8 +19242,8 @@
           <w:shd w:fill="auto" w:val="clear"/>
         </w:rPr>
       </w:pPr>
-      <w:bookmarkStart w:id="74" w:name="docs-internal-guid-7693cd9c-7fff-b78f-02"/>
-      <w:bookmarkEnd w:id="74"/>
+      <w:bookmarkStart w:id="76" w:name="docs-internal-guid-7693cd9c-7fff-b78f-02"/>
+      <w:bookmarkEnd w:id="76"/>
       <w:r>
         <w:rPr>
           <w:rFonts w:ascii="Times New Roman;serif" w:hAnsi="Times New Roman;serif"/>
@@ -19545,7 +19694,7 @@
       </w:r>
       <w:r>
         <w:rPr/>
-        <w:t>12</w:t>
+        <w:t>13</w:t>
       </w:r>
       <w:r>
         <w:rPr/>
@@ -21115,8 +21264,8 @@
         </w:numPr>
         <w:rPr/>
       </w:pPr>
-      <w:bookmarkStart w:id="75" w:name="__RefHeading___Toc8363_1736451874"/>
-      <w:bookmarkEnd w:id="75"/>
+      <w:bookmarkStart w:id="77" w:name="__RefHeading___Toc8363_1736451874"/>
+      <w:bookmarkEnd w:id="77"/>
       <w:r>
         <w:rPr/>
         <w:t xml:space="preserve">PRÁTICA PROFISSIONAL </w:t>
@@ -21145,8 +21294,8 @@
           <w:shd w:fill="FFFFFF" w:val="clear"/>
         </w:rPr>
       </w:pPr>
-      <w:bookmarkStart w:id="76" w:name="docs-internal-guid-ff4acb18-7fff-99b1-19"/>
-      <w:bookmarkEnd w:id="76"/>
+      <w:bookmarkStart w:id="78" w:name="docs-internal-guid-ff4acb18-7fff-99b1-19"/>
+      <w:bookmarkEnd w:id="78"/>
       <w:r>
         <w:rPr>
           <w:rFonts w:ascii="Times New Roman;serif" w:hAnsi="Times New Roman;serif"/>
@@ -21183,8 +21332,8 @@
         </w:numPr>
         <w:rPr/>
       </w:pPr>
-      <w:bookmarkStart w:id="77" w:name="__RefHeading___Toc8365_1736451874"/>
-      <w:bookmarkEnd w:id="77"/>
+      <w:bookmarkStart w:id="79" w:name="__RefHeading___Toc8365_1736451874"/>
+      <w:bookmarkEnd w:id="79"/>
       <w:r>
         <w:rPr/>
         <w:t>ESTÁGIO SUPERVISIONADO</w:t>
@@ -21213,8 +21362,8 @@
           <w:shd w:fill="auto" w:val="clear"/>
         </w:rPr>
       </w:pPr>
-      <w:bookmarkStart w:id="78" w:name="docs-internal-guid-4fbe0942-7fff-85e6-82"/>
-      <w:bookmarkEnd w:id="78"/>
+      <w:bookmarkStart w:id="80" w:name="docs-internal-guid-4fbe0942-7fff-85e6-82"/>
+      <w:bookmarkEnd w:id="80"/>
       <w:r>
         <w:rPr>
           <w:rFonts w:ascii="Times New Roman;serif" w:hAnsi="Times New Roman;serif"/>
@@ -21465,8 +21614,8 @@
         </w:numPr>
         <w:rPr/>
       </w:pPr>
-      <w:bookmarkStart w:id="79" w:name="__RefHeading___Toc8367_1736451874"/>
-      <w:bookmarkEnd w:id="79"/>
+      <w:bookmarkStart w:id="81" w:name="__RefHeading___Toc8367_1736451874"/>
+      <w:bookmarkEnd w:id="81"/>
       <w:r>
         <w:rPr/>
         <w:t>ESTÁGIO SUPERVISIONADO</w:t>
@@ -21491,8 +21640,8 @@
           <w:shd w:fill="auto" w:val="clear"/>
         </w:rPr>
       </w:pPr>
-      <w:bookmarkStart w:id="80" w:name="docs-internal-guid-6ddbf8c0-7fff-5198-25"/>
-      <w:bookmarkEnd w:id="80"/>
+      <w:bookmarkStart w:id="82" w:name="docs-internal-guid-6ddbf8c0-7fff-5198-25"/>
+      <w:bookmarkEnd w:id="82"/>
       <w:r>
         <w:rPr>
           <w:rFonts w:ascii="Times New Roman;serif" w:hAnsi="Times New Roman;serif"/>
@@ -21672,8 +21821,8 @@
         </w:numPr>
         <w:rPr/>
       </w:pPr>
-      <w:bookmarkStart w:id="81" w:name="__RefHeading___Toc8369_1736451874"/>
-      <w:bookmarkEnd w:id="81"/>
+      <w:bookmarkStart w:id="83" w:name="__RefHeading___Toc8369_1736451874"/>
+      <w:bookmarkEnd w:id="83"/>
       <w:r>
         <w:rPr/>
         <w:t xml:space="preserve">TRABALHO DE CONCLUSÃO DE CURSO - TCC </w:t>
@@ -21688,8 +21837,8 @@
         <w:jc w:val="both"/>
         <w:rPr/>
       </w:pPr>
-      <w:bookmarkStart w:id="82" w:name="docs-internal-guid-0ab6b10c-7fff-f35f-93"/>
-      <w:bookmarkEnd w:id="82"/>
+      <w:bookmarkStart w:id="84" w:name="docs-internal-guid-0ab6b10c-7fff-f35f-93"/>
+      <w:bookmarkEnd w:id="84"/>
       <w:r>
         <w:rPr>
           <w:rFonts w:ascii="Times New Roman;serif" w:hAnsi="Times New Roman;serif"/>
@@ -21871,8 +22020,8 @@
         </w:numPr>
         <w:rPr/>
       </w:pPr>
-      <w:bookmarkStart w:id="83" w:name="__RefHeading___Toc8371_1736451874"/>
-      <w:bookmarkEnd w:id="83"/>
+      <w:bookmarkStart w:id="85" w:name="__RefHeading___Toc8371_1736451874"/>
+      <w:bookmarkEnd w:id="85"/>
       <w:r>
         <w:rPr/>
         <w:t>EMENTÁRIO</w:t>
@@ -21901,8 +22050,8 @@
           <w:shd w:fill="auto" w:val="clear"/>
         </w:rPr>
       </w:pPr>
-      <w:bookmarkStart w:id="84" w:name="docs-internal-guid-bb97c807-7fff-c7fa-00"/>
-      <w:bookmarkEnd w:id="84"/>
+      <w:bookmarkStart w:id="86" w:name="docs-internal-guid-bb97c807-7fff-c7fa-00"/>
+      <w:bookmarkEnd w:id="86"/>
       <w:r>
         <w:rPr>
           <w:rFonts w:ascii="Times New Roman;serif" w:hAnsi="Times New Roman;serif"/>
@@ -21985,75 +22134,7 @@
           <w:effect w:val="none"/>
           <w:shd w:fill="auto" w:val="clear"/>
         </w:rPr>
-        <w:t>@</w:t>
-      </w:r>
-      <w:r>
-        <w:rPr>
-          <w:rFonts w:ascii="Times New Roman;serif" w:hAnsi="Times New Roman;serif"/>
-          <w:b w:val="false"/>
-          <w:i w:val="false"/>
-          <w:caps w:val="false"/>
-          <w:smallCaps w:val="false"/>
-          <w:strike w:val="false"/>
-          <w:dstrike w:val="false"/>
-          <w:color w:val="000000"/>
-          <w:sz w:val="22"/>
-          <w:u w:val="none"/>
-          <w:effect w:val="none"/>
-          <w:shd w:fill="auto" w:val="clear"/>
-        </w:rPr>
-        <w:t>@</w:t>
-      </w:r>
-      <w:r>
-        <w:rPr>
-          <w:rFonts w:ascii="Times New Roman;serif" w:hAnsi="Times New Roman;serif"/>
-          <w:b w:val="false"/>
-          <w:i w:val="false"/>
-          <w:caps w:val="false"/>
-          <w:smallCaps w:val="false"/>
-          <w:strike w:val="false"/>
-          <w:dstrike w:val="false"/>
-          <w:color w:val="000000"/>
-          <w:sz w:val="22"/>
-          <w:u w:val="none"/>
-          <w:effect w:val="none"/>
-          <w:shd w:fill="auto" w:val="clear"/>
-        </w:rPr>
-        <w:t>ementário</w:t>
-      </w:r>
-      <w:r>
-        <w:rPr>
-          <w:rFonts w:ascii="Times New Roman;serif" w:hAnsi="Times New Roman;serif"/>
-          <w:b w:val="false"/>
-          <w:i w:val="false"/>
-          <w:caps w:val="false"/>
-          <w:smallCaps w:val="false"/>
-          <w:strike w:val="false"/>
-          <w:dstrike w:val="false"/>
-          <w:color w:val="000000"/>
-          <w:sz w:val="22"/>
-          <w:u w:val="none"/>
-          <w:effect w:val="none"/>
-          <w:shd w:fill="auto" w:val="clear"/>
-        </w:rPr>
-        <w:t>@</w:t>
-      </w:r>
-      <w:r>
-        <w:rPr>
-          <w:rFonts w:ascii="Times New Roman;serif" w:hAnsi="Times New Roman;serif"/>
-          <w:b w:val="false"/>
-          <w:i w:val="false"/>
-          <w:caps w:val="false"/>
-          <w:smallCaps w:val="false"/>
-          <w:strike w:val="false"/>
-          <w:dstrike w:val="false"/>
-          <w:color w:val="000000"/>
-          <w:sz w:val="22"/>
-          <w:u w:val="none"/>
-          <w:effect w:val="none"/>
-          <w:shd w:fill="auto" w:val="clear"/>
-        </w:rPr>
-        <w:t>@</w:t>
+        <w:t>@@ementário@@</w:t>
       </w:r>
     </w:p>
     <w:p>
@@ -22065,8 +22146,8 @@
         </w:numPr>
         <w:rPr/>
       </w:pPr>
-      <w:bookmarkStart w:id="85" w:name="__RefHeading___Toc8373_1736451874"/>
-      <w:bookmarkEnd w:id="85"/>
+      <w:bookmarkStart w:id="87" w:name="__RefHeading___Toc8373_1736451874"/>
+      <w:bookmarkEnd w:id="87"/>
       <w:r>
         <w:rPr/>
         <w:t>ACESSIBILIDADE</w:t>
@@ -22091,8 +22172,8 @@
           <w:shd w:fill="auto" w:val="clear"/>
         </w:rPr>
       </w:pPr>
-      <w:bookmarkStart w:id="86" w:name="docs-internal-guid-ff4aa051-7fff-aab3-3a"/>
-      <w:bookmarkEnd w:id="86"/>
+      <w:bookmarkStart w:id="88" w:name="docs-internal-guid-ff4aa051-7fff-aab3-3a"/>
+      <w:bookmarkEnd w:id="88"/>
       <w:r>
         <w:rPr>
           <w:rFonts w:ascii="Times New Roman;serif" w:hAnsi="Times New Roman;serif"/>
@@ -22268,8 +22349,8 @@
         </w:numPr>
         <w:rPr/>
       </w:pPr>
-      <w:bookmarkStart w:id="87" w:name="__RefHeading___Toc8375_1736451874"/>
-      <w:bookmarkEnd w:id="87"/>
+      <w:bookmarkStart w:id="89" w:name="__RefHeading___Toc8375_1736451874"/>
+      <w:bookmarkEnd w:id="89"/>
       <w:r>
         <w:rPr/>
         <w:t xml:space="preserve">CRITÉRIOS E PROCEDIMENTOS DE AVALIAÇÃO </w:t>
@@ -22284,8 +22365,8 @@
         </w:numPr>
         <w:rPr/>
       </w:pPr>
-      <w:bookmarkStart w:id="88" w:name="__RefHeading___Toc8377_1736451874"/>
-      <w:bookmarkEnd w:id="88"/>
+      <w:bookmarkStart w:id="90" w:name="__RefHeading___Toc8377_1736451874"/>
+      <w:bookmarkEnd w:id="90"/>
       <w:r>
         <w:rPr/>
         <w:t xml:space="preserve">Avaliação da Aprendizagem </w:t>
@@ -22300,8 +22381,8 @@
         <w:jc w:val="both"/>
         <w:rPr/>
       </w:pPr>
-      <w:bookmarkStart w:id="89" w:name="docs-internal-guid-9ae69078-7fff-7e8f-ef"/>
-      <w:bookmarkEnd w:id="89"/>
+      <w:bookmarkStart w:id="91" w:name="docs-internal-guid-9ae69078-7fff-7e8f-ef"/>
+      <w:bookmarkEnd w:id="91"/>
       <w:r>
         <w:rPr>
           <w:rFonts w:eastAsia="Noto Sans CJK SC" w:ascii="Times New Roman;serif" w:hAnsi="Times New Roman;serif"/>
@@ -22532,8 +22613,8 @@
         </w:numPr>
         <w:rPr/>
       </w:pPr>
-      <w:bookmarkStart w:id="90" w:name="__RefHeading___Toc8379_1736451874"/>
-      <w:bookmarkEnd w:id="90"/>
+      <w:bookmarkStart w:id="92" w:name="__RefHeading___Toc8379_1736451874"/>
+      <w:bookmarkEnd w:id="92"/>
       <w:r>
         <w:rPr/>
         <w:t>Avaliações do Curso</w:t>
@@ -22548,8 +22629,8 @@
         <w:jc w:val="both"/>
         <w:rPr/>
       </w:pPr>
-      <w:bookmarkStart w:id="91" w:name="docs-internal-guid-3bcf7fc9-7fff-5eb0-01"/>
-      <w:bookmarkEnd w:id="91"/>
+      <w:bookmarkStart w:id="93" w:name="docs-internal-guid-3bcf7fc9-7fff-5eb0-01"/>
+      <w:bookmarkEnd w:id="93"/>
       <w:r>
         <w:rPr>
           <w:rFonts w:eastAsia="Noto Sans CJK SC" w:cs="FreeSans" w:ascii="Times New Roman;serif" w:hAnsi="Times New Roman;serif"/>
@@ -22581,8 +22662,8 @@
         </w:numPr>
         <w:rPr/>
       </w:pPr>
-      <w:bookmarkStart w:id="92" w:name="__RefHeading___Toc8381_1736451874"/>
-      <w:bookmarkEnd w:id="92"/>
+      <w:bookmarkStart w:id="94" w:name="__RefHeading___Toc8381_1736451874"/>
+      <w:bookmarkEnd w:id="94"/>
       <w:r>
         <w:rPr/>
         <w:t>Avaliação Externa</w:t>
@@ -22615,8 +22696,8 @@
           <w:lang w:val="pt-BR" w:eastAsia="zh-CN" w:bidi="hi-IN"/>
         </w:rPr>
       </w:pPr>
-      <w:bookmarkStart w:id="93" w:name="docs-internal-guid-bf7e26ad-7fff-e8e1-ae"/>
-      <w:bookmarkEnd w:id="93"/>
+      <w:bookmarkStart w:id="95" w:name="docs-internal-guid-bf7e26ad-7fff-e8e1-ae"/>
+      <w:bookmarkEnd w:id="95"/>
       <w:r>
         <w:rPr>
           <w:rFonts w:eastAsia="Noto Sans CJK SC" w:cs="FreeSans" w:ascii="Times New Roman;serif" w:hAnsi="Times New Roman;serif"/>
@@ -22849,8 +22930,8 @@
         </w:numPr>
         <w:rPr/>
       </w:pPr>
-      <w:bookmarkStart w:id="94" w:name="__RefHeading___Toc8383_1736451874"/>
-      <w:bookmarkEnd w:id="94"/>
+      <w:bookmarkStart w:id="96" w:name="__RefHeading___Toc8383_1736451874"/>
+      <w:bookmarkEnd w:id="96"/>
       <w:r>
         <w:rPr/>
         <w:t>Avaliação Interna</w:t>
@@ -22885,8 +22966,8 @@
           <w:lang w:val="pt-BR" w:eastAsia="zh-CN" w:bidi="hi-IN"/>
         </w:rPr>
       </w:pPr>
-      <w:bookmarkStart w:id="95" w:name="docs-internal-guid-6f8ee45d-7fff-a336-78"/>
-      <w:bookmarkEnd w:id="95"/>
+      <w:bookmarkStart w:id="97" w:name="docs-internal-guid-6f8ee45d-7fff-a336-78"/>
+      <w:bookmarkEnd w:id="97"/>
       <w:r>
         <w:rPr>
           <w:rFonts w:eastAsia="Noto Sans CJK SC" w:cs="FreeSans" w:ascii="Times New Roman;serif" w:hAnsi="Times New Roman;serif"/>
@@ -23263,8 +23344,8 @@
         </w:numPr>
         <w:rPr/>
       </w:pPr>
-      <w:bookmarkStart w:id="96" w:name="__RefHeading___Toc8788_1736451874"/>
-      <w:bookmarkEnd w:id="96"/>
+      <w:bookmarkStart w:id="98" w:name="__RefHeading___Toc8788_1736451874"/>
+      <w:bookmarkEnd w:id="98"/>
       <w:r>
         <w:rPr/>
         <w:t>ACOMPANHAMENTO DE EGRESSOS</w:t>
@@ -23299,8 +23380,8 @@
           <w:lang w:val="pt-BR" w:eastAsia="zh-CN" w:bidi="hi-IN"/>
         </w:rPr>
       </w:pPr>
-      <w:bookmarkStart w:id="97" w:name="docs-internal-guid-c126c193-7fff-b966-c5"/>
-      <w:bookmarkEnd w:id="97"/>
+      <w:bookmarkStart w:id="99" w:name="docs-internal-guid-c126c193-7fff-b966-c5"/>
+      <w:bookmarkEnd w:id="99"/>
       <w:r>
         <w:rPr>
           <w:rFonts w:eastAsia="Noto Sans CJK SC" w:cs="FreeSans" w:ascii="Times New Roman;serif" w:hAnsi="Times New Roman;serif"/>
@@ -23447,8 +23528,8 @@
         </w:numPr>
         <w:rPr/>
       </w:pPr>
-      <w:bookmarkStart w:id="98" w:name="__RefHeading___Toc8790_1736451874"/>
-      <w:bookmarkEnd w:id="98"/>
+      <w:bookmarkStart w:id="100" w:name="__RefHeading___Toc8790_1736451874"/>
+      <w:bookmarkEnd w:id="100"/>
       <w:r>
         <w:rPr/>
         <w:t>DIPLOMAS</w:t>
@@ -23483,8 +23564,8 @@
           <w:lang w:val="pt-BR" w:eastAsia="zh-CN" w:bidi="hi-IN"/>
         </w:rPr>
       </w:pPr>
-      <w:bookmarkStart w:id="99" w:name="docs-internal-guid-a7d25463-7fff-641b-76"/>
-      <w:bookmarkEnd w:id="99"/>
+      <w:bookmarkStart w:id="101" w:name="docs-internal-guid-a7d25463-7fff-641b-76"/>
+      <w:bookmarkEnd w:id="101"/>
       <w:r>
         <w:rPr>
           <w:rFonts w:eastAsia="Noto Sans CJK SC" w:cs="FreeSans" w:ascii="Times New Roman;serif" w:hAnsi="Times New Roman;serif"/>
@@ -23650,8 +23731,8 @@
         </w:numPr>
         <w:rPr/>
       </w:pPr>
-      <w:bookmarkStart w:id="100" w:name="__RefHeading___Toc8792_1736451874"/>
-      <w:bookmarkEnd w:id="100"/>
+      <w:bookmarkStart w:id="102" w:name="__RefHeading___Toc8792_1736451874"/>
+      <w:bookmarkEnd w:id="102"/>
       <w:r>
         <w:rPr/>
         <w:t xml:space="preserve">CORPO DOCENTE E TÉCNICO ADMINISTRATIVO </w:t>
@@ -23684,8 +23765,8 @@
           <w:shd w:fill="FFFFFF" w:val="clear"/>
         </w:rPr>
       </w:pPr>
-      <w:bookmarkStart w:id="101" w:name="docs-internal-guid-b2efdd94-7fff-c6f5-62"/>
-      <w:bookmarkEnd w:id="101"/>
+      <w:bookmarkStart w:id="103" w:name="docs-internal-guid-b2efdd94-7fff-c6f5-62"/>
+      <w:bookmarkEnd w:id="103"/>
       <w:r>
         <w:rPr>
           <w:rFonts w:ascii="Times New Roman;serif" w:hAnsi="Times New Roman;serif"/>
@@ -23778,8 +23859,8 @@
         <w:spacing w:before="200" w:after="120"/>
         <w:rPr/>
       </w:pPr>
-      <w:bookmarkStart w:id="102" w:name="__RefHeading___Toc8794_1736451874"/>
-      <w:bookmarkEnd w:id="102"/>
+      <w:bookmarkStart w:id="104" w:name="__RefHeading___Toc8794_1736451874"/>
+      <w:bookmarkEnd w:id="104"/>
       <w:r>
         <w:rPr/>
         <w:t>Coordenação do Curso</w:t>
@@ -23819,7 +23900,7 @@
       </w:r>
       <w:r>
         <w:rPr/>
-        <w:t>13</w:t>
+        <w:t>14</w:t>
       </w:r>
       <w:r>
         <w:rPr/>
@@ -25160,8 +25241,8 @@
         </w:numPr>
         <w:rPr/>
       </w:pPr>
-      <w:bookmarkStart w:id="103" w:name="__RefHeading___Toc2977_724336694"/>
-      <w:bookmarkEnd w:id="103"/>
+      <w:bookmarkStart w:id="105" w:name="__RefHeading___Toc2977_724336694"/>
+      <w:bookmarkEnd w:id="105"/>
       <w:r>
         <w:rPr/>
         <w:t>Atribuições do Coordenador</w:t>
@@ -25176,8 +25257,8 @@
         <w:jc w:val="both"/>
         <w:rPr/>
       </w:pPr>
-      <w:bookmarkStart w:id="104" w:name="docs-internal-guid-87136094-7fff-8bab-7f"/>
-      <w:bookmarkEnd w:id="104"/>
+      <w:bookmarkStart w:id="106" w:name="docs-internal-guid-87136094-7fff-8bab-7f"/>
+      <w:bookmarkEnd w:id="106"/>
       <w:r>
         <w:rPr>
           <w:rFonts w:ascii="Times New Roman;serif" w:hAnsi="Times New Roman;serif"/>
@@ -25289,8 +25370,8 @@
         </w:numPr>
         <w:rPr/>
       </w:pPr>
-      <w:bookmarkStart w:id="105" w:name="__RefHeading___Toc2979_724336694"/>
-      <w:bookmarkEnd w:id="105"/>
+      <w:bookmarkStart w:id="107" w:name="__RefHeading___Toc2979_724336694"/>
+      <w:bookmarkEnd w:id="107"/>
       <w:r>
         <w:rPr/>
         <w:t>PERFIL DO CORPO DOCENTE</w:t>
@@ -25310,19 +25391,19 @@
         </w:tblCellMar>
       </w:tblPr>
       <w:tblGrid>
-        <w:gridCol w:w="377"/>
-        <w:gridCol w:w="1423"/>
+        <w:gridCol w:w="375"/>
+        <w:gridCol w:w="1425"/>
         <w:gridCol w:w="1700"/>
         <w:gridCol w:w="1595"/>
         <w:gridCol w:w="1531"/>
-        <w:gridCol w:w="1971"/>
-        <w:gridCol w:w="1093"/>
+        <w:gridCol w:w="1969"/>
+        <w:gridCol w:w="1095"/>
       </w:tblGrid>
       <w:tr>
         <w:trPr/>
         <w:tc>
           <w:tcPr>
-            <w:tcW w:w="377" w:type="dxa"/>
+            <w:tcW w:w="375" w:type="dxa"/>
             <w:tcBorders>
               <w:top w:val="single" w:sz="8" w:space="0" w:color="000000"/>
               <w:left w:val="single" w:sz="8" w:space="0" w:color="000000"/>
@@ -25348,7 +25429,7 @@
         </w:tc>
         <w:tc>
           <w:tcPr>
-            <w:tcW w:w="1423" w:type="dxa"/>
+            <w:tcW w:w="1425" w:type="dxa"/>
             <w:tcBorders>
               <w:top w:val="single" w:sz="8" w:space="0" w:color="000000"/>
               <w:left w:val="single" w:sz="8" w:space="0" w:color="000000"/>
@@ -25453,7 +25534,7 @@
         </w:tc>
         <w:tc>
           <w:tcPr>
-            <w:tcW w:w="1971" w:type="dxa"/>
+            <w:tcW w:w="1969" w:type="dxa"/>
             <w:tcBorders>
               <w:top w:val="single" w:sz="8" w:space="0" w:color="000000"/>
               <w:left w:val="single" w:sz="8" w:space="0" w:color="000000"/>
@@ -25479,7 +25560,7 @@
         </w:tc>
         <w:tc>
           <w:tcPr>
-            <w:tcW w:w="1093" w:type="dxa"/>
+            <w:tcW w:w="1095" w:type="dxa"/>
             <w:tcBorders>
               <w:top w:val="single" w:sz="8" w:space="0" w:color="000000"/>
               <w:left w:val="single" w:sz="8" w:space="0" w:color="000000"/>
@@ -25509,7 +25590,7 @@
         <w:trPr/>
         <w:tc>
           <w:tcPr>
-            <w:tcW w:w="377" w:type="dxa"/>
+            <w:tcW w:w="375" w:type="dxa"/>
             <w:tcBorders>
               <w:left w:val="single" w:sz="8" w:space="0" w:color="000000"/>
             </w:tcBorders>
@@ -25527,7 +25608,7 @@
         </w:tc>
         <w:tc>
           <w:tcPr>
-            <w:tcW w:w="1423" w:type="dxa"/>
+            <w:tcW w:w="1425" w:type="dxa"/>
             <w:tcBorders>
               <w:left w:val="single" w:sz="8" w:space="0" w:color="000000"/>
               <w:right w:val="single" w:sz="8" w:space="0" w:color="000000"/>
@@ -25600,7 +25681,7 @@
         </w:tc>
         <w:tc>
           <w:tcPr>
-            <w:tcW w:w="1971" w:type="dxa"/>
+            <w:tcW w:w="1969" w:type="dxa"/>
             <w:tcBorders>
               <w:left w:val="single" w:sz="8" w:space="0" w:color="000000"/>
             </w:tcBorders>
@@ -25618,7 +25699,7 @@
         </w:tc>
         <w:tc>
           <w:tcPr>
-            <w:tcW w:w="1093" w:type="dxa"/>
+            <w:tcW w:w="1095" w:type="dxa"/>
             <w:tcBorders>
               <w:left w:val="single" w:sz="8" w:space="0" w:color="000000"/>
               <w:right w:val="single" w:sz="8" w:space="0" w:color="000000"/>
@@ -25640,7 +25721,7 @@
         <w:trPr/>
         <w:tc>
           <w:tcPr>
-            <w:tcW w:w="377" w:type="dxa"/>
+            <w:tcW w:w="375" w:type="dxa"/>
             <w:tcBorders>
               <w:left w:val="single" w:sz="8" w:space="0" w:color="000000"/>
             </w:tcBorders>
@@ -25658,7 +25739,7 @@
         </w:tc>
         <w:tc>
           <w:tcPr>
-            <w:tcW w:w="1423" w:type="dxa"/>
+            <w:tcW w:w="1425" w:type="dxa"/>
             <w:tcBorders>
               <w:left w:val="single" w:sz="8" w:space="0" w:color="000000"/>
               <w:right w:val="single" w:sz="8" w:space="0" w:color="000000"/>
@@ -25731,7 +25812,7 @@
         </w:tc>
         <w:tc>
           <w:tcPr>
-            <w:tcW w:w="1971" w:type="dxa"/>
+            <w:tcW w:w="1969" w:type="dxa"/>
             <w:tcBorders>
               <w:left w:val="single" w:sz="8" w:space="0" w:color="000000"/>
             </w:tcBorders>
@@ -25749,7 +25830,7 @@
         </w:tc>
         <w:tc>
           <w:tcPr>
-            <w:tcW w:w="1093" w:type="dxa"/>
+            <w:tcW w:w="1095" w:type="dxa"/>
             <w:tcBorders>
               <w:left w:val="single" w:sz="8" w:space="0" w:color="000000"/>
               <w:right w:val="single" w:sz="8" w:space="0" w:color="000000"/>
@@ -25795,8 +25876,8 @@
         </w:numPr>
         <w:rPr/>
       </w:pPr>
-      <w:bookmarkStart w:id="106" w:name="__RefHeading___Toc2981_724336694"/>
-      <w:bookmarkEnd w:id="106"/>
+      <w:bookmarkStart w:id="108" w:name="__RefHeading___Toc2981_724336694"/>
+      <w:bookmarkEnd w:id="108"/>
       <w:r>
         <w:rPr/>
         <w:t>COLEGIADO DO CURSO</w:t>
@@ -25821,8 +25902,8 @@
         </w:numPr>
         <w:rPr/>
       </w:pPr>
-      <w:bookmarkStart w:id="107" w:name="__RefHeading___Toc2983_724336694"/>
-      <w:bookmarkEnd w:id="107"/>
+      <w:bookmarkStart w:id="109" w:name="__RefHeading___Toc2983_724336694"/>
+      <w:bookmarkEnd w:id="109"/>
       <w:r>
         <w:rPr/>
         <w:t>COLEGIADO DO CURSO</w:t>
@@ -25837,8 +25918,8 @@
         <w:jc w:val="both"/>
         <w:rPr/>
       </w:pPr>
-      <w:bookmarkStart w:id="108" w:name="docs-internal-guid-0b707fbe-7fff-99ad-37"/>
-      <w:bookmarkEnd w:id="108"/>
+      <w:bookmarkStart w:id="110" w:name="docs-internal-guid-0b707fbe-7fff-99ad-37"/>
+      <w:bookmarkEnd w:id="110"/>
       <w:r>
         <w:rPr>
           <w:rFonts w:ascii="Times New Roman;serif" w:hAnsi="Times New Roman;serif"/>
@@ -26508,8 +26589,8 @@
         </w:numPr>
         <w:rPr/>
       </w:pPr>
-      <w:bookmarkStart w:id="109" w:name="__RefHeading___Toc2985_724336694"/>
-      <w:bookmarkEnd w:id="109"/>
+      <w:bookmarkStart w:id="111" w:name="__RefHeading___Toc2985_724336694"/>
+      <w:bookmarkEnd w:id="111"/>
       <w:r>
         <w:rPr/>
         <w:t>Atribuições do NDE</w:t>
@@ -27086,8 +27167,8 @@
         </w:numPr>
         <w:rPr/>
       </w:pPr>
-      <w:bookmarkStart w:id="110" w:name="__RefHeading___Toc2987_724336694"/>
-      <w:bookmarkEnd w:id="110"/>
+      <w:bookmarkStart w:id="112" w:name="__RefHeading___Toc2987_724336694"/>
+      <w:bookmarkEnd w:id="112"/>
       <w:r>
         <w:rPr/>
         <w:t>INFRAESTRUTURA</w:t>
@@ -27112,8 +27193,8 @@
         </w:numPr>
         <w:rPr/>
       </w:pPr>
-      <w:bookmarkStart w:id="111" w:name="__RefHeading___Toc2989_724336694"/>
-      <w:bookmarkEnd w:id="111"/>
+      <w:bookmarkStart w:id="113" w:name="__RefHeading___Toc2989_724336694"/>
+      <w:bookmarkEnd w:id="113"/>
       <w:r>
         <w:rPr/>
         <w:t>Instalações de Equipamentos</w:t>
@@ -27127,8 +27208,8 @@
         <w:ind w:hanging="0" w:left="0" w:right="121"/>
         <w:rPr/>
       </w:pPr>
-      <w:bookmarkStart w:id="112" w:name="docs-internal-guid-b32a8770-7fff-9117-7c"/>
-      <w:bookmarkEnd w:id="112"/>
+      <w:bookmarkStart w:id="114" w:name="docs-internal-guid-b32a8770-7fff-9117-7c"/>
+      <w:bookmarkEnd w:id="114"/>
       <w:r>
         <w:rPr>
           <w:rFonts w:ascii="Times New Roman;serif" w:hAnsi="Times New Roman;serif"/>
@@ -27639,7 +27720,7 @@
       </w:r>
       <w:r>
         <w:rPr/>
-        <w:t>14</w:t>
+        <w:t>15</w:t>
       </w:r>
       <w:r>
         <w:rPr/>
@@ -28311,7 +28392,7 @@
       </w:r>
       <w:r>
         <w:rPr/>
-        <w:t>15</w:t>
+        <w:t>16</w:t>
       </w:r>
       <w:r>
         <w:rPr/>
@@ -28800,7 +28881,7 @@
       </w:r>
       <w:r>
         <w:rPr/>
-        <w:t>16</w:t>
+        <w:t>17</w:t>
       </w:r>
       <w:r>
         <w:rPr/>
@@ -29106,7 +29187,7 @@
       </w:r>
       <w:r>
         <w:rPr/>
-        <w:t>17</w:t>
+        <w:t>18</w:t>
       </w:r>
       <w:r>
         <w:rPr/>
@@ -29549,7 +29630,7 @@
       </w:r>
       <w:r>
         <w:rPr/>
-        <w:t>18</w:t>
+        <w:t>19</w:t>
       </w:r>
       <w:r>
         <w:rPr/>
@@ -29968,8 +30049,8 @@
         </w:numPr>
         <w:rPr/>
       </w:pPr>
-      <w:bookmarkStart w:id="113" w:name="__RefHeading___Toc2991_724336694"/>
-      <w:bookmarkEnd w:id="113"/>
+      <w:bookmarkStart w:id="115" w:name="__RefHeading___Toc2991_724336694"/>
+      <w:bookmarkEnd w:id="115"/>
       <w:r>
         <w:rPr/>
         <w:t>Laboratórios</w:t>
@@ -29998,8 +30079,8 @@
           <w:shd w:fill="auto" w:val="clear"/>
         </w:rPr>
       </w:pPr>
-      <w:bookmarkStart w:id="114" w:name="docs-internal-guid-4b63a4ab-7fff-0975-36"/>
-      <w:bookmarkEnd w:id="114"/>
+      <w:bookmarkStart w:id="116" w:name="docs-internal-guid-4b63a4ab-7fff-0975-36"/>
+      <w:bookmarkEnd w:id="116"/>
       <w:r>
         <w:rPr>
           <w:rFonts w:ascii="Times New Roman;serif" w:hAnsi="Times New Roman;serif"/>
@@ -30120,7 +30201,7 @@
       </w:r>
       <w:r>
         <w:rPr/>
-        <w:t>19</w:t>
+        <w:t>20</w:t>
       </w:r>
       <w:r>
         <w:rPr/>
@@ -30476,7 +30557,7 @@
       </w:r>
       <w:r>
         <w:rPr/>
-        <w:t>20</w:t>
+        <w:t>21</w:t>
       </w:r>
       <w:r>
         <w:rPr/>
@@ -30756,7 +30837,7 @@
       </w:r>
       <w:r>
         <w:rPr/>
-        <w:t>21</w:t>
+        <w:t>22</w:t>
       </w:r>
       <w:r>
         <w:rPr/>
@@ -31075,7 +31156,7 @@
       </w:r>
       <w:r>
         <w:rPr/>
-        <w:t>22</w:t>
+        <w:t>23</w:t>
       </w:r>
       <w:r>
         <w:rPr/>
@@ -31355,7 +31436,7 @@
       </w:r>
       <w:r>
         <w:rPr/>
-        <w:t>23</w:t>
+        <w:t>24</w:t>
       </w:r>
       <w:r>
         <w:rPr/>
@@ -31966,8 +32047,8 @@
         </w:numPr>
         <w:rPr/>
       </w:pPr>
-      <w:bookmarkStart w:id="115" w:name="__RefHeading___Toc2993_724336694"/>
-      <w:bookmarkEnd w:id="115"/>
+      <w:bookmarkStart w:id="117" w:name="__RefHeading___Toc2993_724336694"/>
+      <w:bookmarkEnd w:id="117"/>
       <w:r>
         <w:rPr/>
         <w:t>Sala(s) de Aula(s)</w:t>
@@ -31996,8 +32077,8 @@
           <w:shd w:fill="auto" w:val="clear"/>
         </w:rPr>
       </w:pPr>
-      <w:bookmarkStart w:id="116" w:name="docs-internal-guid-458d0a24-7fff-e929-a5"/>
-      <w:bookmarkEnd w:id="116"/>
+      <w:bookmarkStart w:id="118" w:name="docs-internal-guid-458d0a24-7fff-e929-a5"/>
+      <w:bookmarkEnd w:id="118"/>
       <w:r>
         <w:rPr>
           <w:rFonts w:ascii="Times New Roman;serif" w:hAnsi="Times New Roman;serif"/>
@@ -33190,7 +33271,7 @@
       </w:r>
       <w:r>
         <w:rPr/>
-        <w:t>24</w:t>
+        <w:t>25</w:t>
       </w:r>
       <w:r>
         <w:rPr/>
@@ -33827,8 +33908,8 @@
         </w:numPr>
         <w:rPr/>
       </w:pPr>
-      <w:bookmarkStart w:id="117" w:name="__RefHeading___Toc2995_724336694"/>
-      <w:bookmarkEnd w:id="117"/>
+      <w:bookmarkStart w:id="119" w:name="__RefHeading___Toc2995_724336694"/>
+      <w:bookmarkEnd w:id="119"/>
       <w:r>
         <w:rPr/>
         <w:t>SETORES DE APRENDIZAGEM DA FORMAÇÃO NO CAMPO</w:t>
@@ -33839,8 +33920,8 @@
         <w:pStyle w:val="BodyText"/>
         <w:rPr/>
       </w:pPr>
-      <w:bookmarkStart w:id="118" w:name="docs-internal-guid-7e083a9e-7fff-3439-45"/>
-      <w:bookmarkEnd w:id="118"/>
+      <w:bookmarkStart w:id="120" w:name="docs-internal-guid-7e083a9e-7fff-3439-45"/>
+      <w:bookmarkEnd w:id="120"/>
       <w:r>
         <w:rPr>
           <w:rFonts w:eastAsia="Noto Serif CJK SC" w:cs="FreeSans" w:ascii="Times New Roman;serif" w:hAnsi="Times New Roman;serif"/>
@@ -34204,8 +34285,8 @@
         </w:numPr>
         <w:rPr/>
       </w:pPr>
-      <w:bookmarkStart w:id="119" w:name="__RefHeading___Toc2997_724336694"/>
-      <w:bookmarkEnd w:id="119"/>
+      <w:bookmarkStart w:id="121" w:name="__RefHeading___Toc2997_724336694"/>
+      <w:bookmarkEnd w:id="121"/>
       <w:r>
         <w:rPr/>
         <w:t>Biblioteca</w:t>
@@ -34234,8 +34315,8 @@
           <w:shd w:fill="auto" w:val="clear"/>
         </w:rPr>
       </w:pPr>
-      <w:bookmarkStart w:id="120" w:name="docs-internal-guid-8d680f4f-7fff-fc40-ad"/>
-      <w:bookmarkEnd w:id="120"/>
+      <w:bookmarkStart w:id="122" w:name="docs-internal-guid-8d680f4f-7fff-fc40-ad"/>
+      <w:bookmarkEnd w:id="122"/>
       <w:r>
         <w:rPr>
           <w:rFonts w:ascii="Times New Roman;serif" w:hAnsi="Times New Roman;serif"/>
@@ -34354,8 +34435,8 @@
         </w:numPr>
         <w:rPr/>
       </w:pPr>
-      <w:bookmarkStart w:id="121" w:name="__RefHeading___Toc2999_724336694"/>
-      <w:bookmarkEnd w:id="121"/>
+      <w:bookmarkStart w:id="123" w:name="__RefHeading___Toc2999_724336694"/>
+      <w:bookmarkEnd w:id="123"/>
       <w:r>
         <w:rPr/>
         <w:t xml:space="preserve">Infraestrutura da biblioteca: mobiliário e equipamentos </w:t>
@@ -35616,8 +35697,8 @@
         </w:numPr>
         <w:rPr/>
       </w:pPr>
-      <w:bookmarkStart w:id="122" w:name="__RefHeading___Toc3001_724336694"/>
-      <w:bookmarkEnd w:id="122"/>
+      <w:bookmarkStart w:id="124" w:name="__RefHeading___Toc3001_724336694"/>
+      <w:bookmarkEnd w:id="124"/>
       <w:r>
         <w:rPr/>
         <w:t>Acervo da bibliografia básica do curso</w:t>
@@ -36339,8 +36420,8 @@
         </w:numPr>
         <w:rPr/>
       </w:pPr>
-      <w:bookmarkStart w:id="123" w:name="__RefHeading___Toc3003_724336694"/>
-      <w:bookmarkEnd w:id="123"/>
+      <w:bookmarkStart w:id="125" w:name="__RefHeading___Toc3003_724336694"/>
+      <w:bookmarkEnd w:id="125"/>
       <w:r>
         <w:rPr/>
         <w:t>Acervo da bibliografia complementar do curso</w:t>
@@ -37101,8 +37182,8 @@
         </w:numPr>
         <w:rPr/>
       </w:pPr>
-      <w:bookmarkStart w:id="124" w:name="__RefHeading___Toc3005_724336694"/>
-      <w:bookmarkEnd w:id="124"/>
+      <w:bookmarkStart w:id="126" w:name="__RefHeading___Toc3005_724336694"/>
+      <w:bookmarkEnd w:id="126"/>
       <w:r>
         <w:rPr/>
         <w:t xml:space="preserve">Acervo multimídia </w:t>
@@ -38263,8 +38344,8 @@
         </w:numPr>
         <w:rPr/>
       </w:pPr>
-      <w:bookmarkStart w:id="125" w:name="__RefHeading___Toc3007_724336694"/>
-      <w:bookmarkEnd w:id="125"/>
+      <w:bookmarkStart w:id="127" w:name="__RefHeading___Toc3007_724336694"/>
+      <w:bookmarkEnd w:id="127"/>
       <w:r>
         <w:rPr/>
         <w:t>REFERÊNCIAS</w:t>
@@ -38293,8 +38374,8 @@
           <w:shd w:fill="auto" w:val="clear"/>
         </w:rPr>
       </w:pPr>
-      <w:bookmarkStart w:id="126" w:name="docs-internal-guid-e289bde1-7fff-aaaa-77"/>
-      <w:bookmarkEnd w:id="126"/>
+      <w:bookmarkStart w:id="128" w:name="docs-internal-guid-e289bde1-7fff-aaaa-77"/>
+      <w:bookmarkEnd w:id="128"/>
       <w:r>
         <w:rPr>
           <w:rFonts w:ascii="Times New Roman;serif" w:hAnsi="Times New Roman;serif"/>
@@ -38332,8 +38413,8 @@
         <w:ind w:hanging="0" w:left="720"/>
         <w:rPr/>
       </w:pPr>
-      <w:bookmarkStart w:id="127" w:name="__RefHeading___Toc3009_724336694"/>
-      <w:bookmarkEnd w:id="127"/>
+      <w:bookmarkStart w:id="129" w:name="__RefHeading___Toc3009_724336694"/>
+      <w:bookmarkEnd w:id="129"/>
       <w:r>
         <w:rPr/>
         <w:t>APÊNDICE</w:t>
@@ -38362,8 +38443,8 @@
           <w:shd w:fill="auto" w:val="clear"/>
         </w:rPr>
       </w:pPr>
-      <w:bookmarkStart w:id="128" w:name="docs-internal-guid-c178bbc7-7fff-25d2-4c"/>
-      <w:bookmarkEnd w:id="128"/>
+      <w:bookmarkStart w:id="130" w:name="docs-internal-guid-c178bbc7-7fff-25d2-4c"/>
+      <w:bookmarkEnd w:id="130"/>
       <w:r>
         <w:rPr>
           <w:rFonts w:ascii="Times New Roman;serif" w:hAnsi="Times New Roman;serif"/>
@@ -38492,10 +38573,10 @@
         <w:ind w:hanging="0" w:left="720"/>
         <w:rPr/>
       </w:pPr>
-      <w:bookmarkStart w:id="129" w:name="__RefHeading___Toc3011_724336694"/>
-      <w:bookmarkStart w:id="130" w:name="docs-internal-guid-cb6f7ca0-7fff-8df8-8d"/>
-      <w:bookmarkEnd w:id="129"/>
-      <w:bookmarkEnd w:id="130"/>
+      <w:bookmarkStart w:id="131" w:name="__RefHeading___Toc3011_724336694"/>
+      <w:bookmarkStart w:id="132" w:name="docs-internal-guid-cb6f7ca0-7fff-8df8-8d"/>
+      <w:bookmarkEnd w:id="131"/>
+      <w:bookmarkEnd w:id="132"/>
       <w:r>
         <w:rPr/>
         <w:t>ANEXOS</w:t>
@@ -38725,8 +38806,8 @@
         <w:ind w:hanging="0" w:left="720"/>
         <w:rPr/>
       </w:pPr>
-      <w:bookmarkStart w:id="131" w:name="__RefHeading___Toc3013_724336694"/>
-      <w:bookmarkEnd w:id="131"/>
+      <w:bookmarkStart w:id="133" w:name="__RefHeading___Toc3013_724336694"/>
+      <w:bookmarkEnd w:id="133"/>
       <w:r>
         <w:rPr/>
         <w:t>SITES DE REFERÊNCIA</w:t>
@@ -39446,8 +39527,8 @@
     <w:qFormat/>
     <w:rPr/>
   </w:style>
-  <w:style w:type="character" w:styleId="Bullets">
-    <w:name w:val="Bullets"/>
+  <w:style w:type="character" w:styleId="Bulletsuser">
+    <w:name w:val="Bullets (user)"/>
     <w:qFormat/>
     <w:rPr>
       <w:rFonts w:ascii="OpenSymbol" w:hAnsi="OpenSymbol" w:eastAsia="OpenSymbol" w:cs="OpenSymbol"/>
@@ -39705,8 +39786,8 @@
     <w:pPr/>
     <w:rPr/>
   </w:style>
-  <w:style w:type="paragraph" w:styleId="TableIndexHeadinguser">
-    <w:name w:val="Table Index Heading (user)"/>
+  <w:style w:type="paragraph" w:styleId="TableIndexHeading">
+    <w:name w:val="Table Index Heading"/>
     <w:basedOn w:val="IndexHeading"/>
     <w:qFormat/>
     <w:pPr>
@@ -39761,8 +39842,8 @@
     </w:pPr>
     <w:rPr/>
   </w:style>
-  <w:style w:type="paragraph" w:styleId="FooterLeft">
-    <w:name w:val="Footer Left"/>
+  <w:style w:type="paragraph" w:styleId="FooterLeftuser">
+    <w:name w:val="Footer Left (user)"/>
     <w:basedOn w:val="Footer"/>
     <w:qFormat/>
     <w:pPr>
@@ -39770,8 +39851,8 @@
     </w:pPr>
     <w:rPr/>
   </w:style>
-  <w:style w:type="paragraph" w:styleId="FooterRight">
-    <w:name w:val="Footer Right"/>
+  <w:style w:type="paragraph" w:styleId="FooterRightuser">
+    <w:name w:val="Footer Right (user)"/>
     <w:basedOn w:val="Footer"/>
     <w:qFormat/>
     <w:pPr>
@@ -39814,8 +39895,8 @@
       <w:bCs/>
     </w:rPr>
   </w:style>
-  <w:style w:type="paragraph" w:styleId="FrameContents">
-    <w:name w:val="Frame Contents"/>
+  <w:style w:type="paragraph" w:styleId="FrameContentsuser">
+    <w:name w:val="Frame Contents (user)"/>
     <w:basedOn w:val="Normal"/>
     <w:qFormat/>
     <w:pPr/>

</xml_diff>

<commit_message>
document minor changes and force app to keep 100% scale even desktop scale is different
</commit_message>
<xml_diff>
--- a/src/main/resources/ppc.docx
+++ b/src/main/resources/ppc.docx
@@ -565,6 +565,66 @@
     </w:p>
     <w:p>
       <w:pPr>
+        <w:pStyle w:val="Normal"/>
+        <w:jc w:val="center"/>
+        <w:rPr>
+          <w:rFonts w:ascii="Times New Roman" w:hAnsi="Times New Roman" w:eastAsia="Times New Roman" w:cs="Times New Roman"/>
+          <w:b/>
+          <w:sz w:val="24"/>
+          <w:szCs w:val="24"/>
+        </w:rPr>
+      </w:pPr>
+      <w:r>
+        <w:rPr>
+          <w:rFonts w:eastAsia="Times New Roman" w:cs="Times New Roman"/>
+          <w:b/>
+          <w:sz w:val="24"/>
+          <w:szCs w:val="24"/>
+        </w:rPr>
+      </w:r>
+    </w:p>
+    <w:p>
+      <w:pPr>
+        <w:pStyle w:val="Normal"/>
+        <w:jc w:val="center"/>
+        <w:rPr>
+          <w:rFonts w:ascii="Times New Roman" w:hAnsi="Times New Roman" w:eastAsia="Times New Roman" w:cs="Times New Roman"/>
+          <w:b/>
+          <w:sz w:val="24"/>
+          <w:szCs w:val="24"/>
+        </w:rPr>
+      </w:pPr>
+      <w:r>
+        <w:rPr>
+          <w:rFonts w:eastAsia="Times New Roman" w:cs="Times New Roman"/>
+          <w:b/>
+          <w:sz w:val="24"/>
+          <w:szCs w:val="24"/>
+        </w:rPr>
+      </w:r>
+    </w:p>
+    <w:p>
+      <w:pPr>
+        <w:pStyle w:val="Normal"/>
+        <w:jc w:val="center"/>
+        <w:rPr>
+          <w:rFonts w:ascii="Times New Roman" w:hAnsi="Times New Roman" w:eastAsia="Times New Roman" w:cs="Times New Roman"/>
+          <w:b/>
+          <w:sz w:val="24"/>
+          <w:szCs w:val="24"/>
+        </w:rPr>
+      </w:pPr>
+      <w:r>
+        <w:rPr>
+          <w:rFonts w:eastAsia="Times New Roman" w:cs="Times New Roman"/>
+          <w:b/>
+          <w:sz w:val="24"/>
+          <w:szCs w:val="24"/>
+        </w:rPr>
+      </w:r>
+    </w:p>
+    <w:p>
+      <w:pPr>
         <w:pStyle w:val="Comisso"/>
         <w:rPr>
           <w:highlight w:val="none"/>
@@ -1659,17 +1719,16 @@
             </w:rPr>
             <w:fldChar w:fldCharType="separate"/>
           </w:r>
-          <w:r>
-            <w:rPr>
-              <w:rStyle w:val="IndexLink"/>
-            </w:rPr>
-            <w:t>1 APRESENTAÇÃO</w:t>
-          </w:r>
-          <w:r>
-            <w:rPr/>
-            <w:tab/>
-            <w:t>9</w:t>
-          </w:r>
+          <w:hyperlink w:anchor="__RefHeading___Toc3343_1736451874" w:tooltip="APRESENTAÇÃO">
+            <w:r>
+              <w:rPr>
+                <w:rStyle w:val="IndexLink"/>
+              </w:rPr>
+              <w:t>1 APRESENTAÇÃO</w:t>
+              <w:tab/>
+              <w:t>9</w:t>
+            </w:r>
+          </w:hyperlink>
         </w:p>
         <w:p>
           <w:pPr>
@@ -1680,12 +1739,16 @@
             </w:tabs>
             <w:rPr/>
           </w:pPr>
-          <w:r>
-            <w:rPr/>
-            <w:t>2 DADOS DA INSTITUIÇÃO</w:t>
-            <w:tab/>
-            <w:t>9</w:t>
-          </w:r>
+          <w:hyperlink w:anchor="__RefHeading___Toc3345_1736451874" w:tooltip="DADOS DA INSTITUIÇÃO">
+            <w:r>
+              <w:rPr>
+                <w:rStyle w:val="IndexLink"/>
+              </w:rPr>
+              <w:t>2 DADOS DA INSTITUIÇÃO</w:t>
+              <w:tab/>
+              <w:t>9</w:t>
+            </w:r>
+          </w:hyperlink>
         </w:p>
         <w:p>
           <w:pPr>
@@ -1696,12 +1759,16 @@
             </w:tabs>
             <w:rPr/>
           </w:pPr>
-          <w:r>
-            <w:rPr/>
-            <w:t>2.1 Da Mantenedora</w:t>
-            <w:tab/>
-            <w:t>9</w:t>
-          </w:r>
+          <w:hyperlink w:anchor="__RefHeading___Toc3347_1736451874" w:tooltip="Da Mantenedora">
+            <w:r>
+              <w:rPr>
+                <w:rStyle w:val="IndexLink"/>
+              </w:rPr>
+              <w:t>2.1 Da Mantenedora</w:t>
+              <w:tab/>
+              <w:t>9</w:t>
+            </w:r>
+          </w:hyperlink>
         </w:p>
         <w:p>
           <w:pPr>
@@ -1712,12 +1779,16 @@
             </w:tabs>
             <w:rPr/>
           </w:pPr>
-          <w:r>
-            <w:rPr/>
-            <w:t>2.2 Da Instituição Proponente do Curso</w:t>
-            <w:tab/>
-            <w:t>9</w:t>
-          </w:r>
+          <w:hyperlink w:anchor="__RefHeading___Toc3349_1736451874" w:tooltip="Da Instituição Proponente do Curso">
+            <w:r>
+              <w:rPr>
+                <w:rStyle w:val="IndexLink"/>
+              </w:rPr>
+              <w:t>2.2 Da Instituição Proponente do Curso</w:t>
+              <w:tab/>
+              <w:t>9</w:t>
+            </w:r>
+          </w:hyperlink>
         </w:p>
         <w:p>
           <w:pPr>
@@ -1728,12 +1799,16 @@
             </w:tabs>
             <w:rPr/>
           </w:pPr>
-          <w:r>
-            <w:rPr/>
-            <w:t>2.3 Situação do Curso</w:t>
-            <w:tab/>
-            <w:t>10</w:t>
-          </w:r>
+          <w:hyperlink w:anchor="__RefHeading___Toc3351_1736451874" w:tooltip="Situação do Curso">
+            <w:r>
+              <w:rPr>
+                <w:rStyle w:val="IndexLink"/>
+              </w:rPr>
+              <w:t>2.3 Situação do Curso</w:t>
+              <w:tab/>
+              <w:t>10</w:t>
+            </w:r>
+          </w:hyperlink>
         </w:p>
         <w:p>
           <w:pPr>
@@ -1744,12 +1819,16 @@
             </w:tabs>
             <w:rPr/>
           </w:pPr>
-          <w:r>
-            <w:rPr/>
-            <w:t>3 HISTÓRICO DA INSTITUIÇÃO – IFPE</w:t>
-            <w:tab/>
-            <w:t>14</w:t>
-          </w:r>
+          <w:hyperlink w:anchor="__RefHeading___Toc3343_1736451874_Copy_1" w:tooltip="HISTÓRICO DA INSTITUIÇÃO – IFPE">
+            <w:r>
+              <w:rPr>
+                <w:rStyle w:val="IndexLink"/>
+              </w:rPr>
+              <w:t>3 HISTÓRICO DA INSTITUIÇÃO – IFPE</w:t>
+              <w:tab/>
+              <w:t>14</w:t>
+            </w:r>
+          </w:hyperlink>
         </w:p>
         <w:p>
           <w:pPr>
@@ -1760,12 +1839,16 @@
             </w:tabs>
             <w:rPr/>
           </w:pPr>
-          <w:r>
-            <w:rPr/>
-            <w:t>4 HISTÓRICO DO CAMPUS {{campus}}</w:t>
-            <w:tab/>
-            <w:t>16</w:t>
-          </w:r>
+          <w:hyperlink w:anchor="__RefHeading___Toc3343_1736451874_Copy_2" w:tooltip="HISTÓRICO DO CAMPUS {{campus}}">
+            <w:r>
+              <w:rPr>
+                <w:rStyle w:val="IndexLink"/>
+              </w:rPr>
+              <w:t>4 HISTÓRICO DO CAMPUS {{campus}}</w:t>
+              <w:tab/>
+              <w:t>16</w:t>
+            </w:r>
+          </w:hyperlink>
         </w:p>
         <w:p>
           <w:pPr>
@@ -1776,12 +1859,16 @@
             </w:tabs>
             <w:rPr/>
           </w:pPr>
-          <w:r>
-            <w:rPr/>
-            <w:t>5 HISTÓRICO DO CURSO</w:t>
-            <w:tab/>
-            <w:t>16</w:t>
-          </w:r>
+          <w:hyperlink w:anchor="__RefHeading___Toc3343_1736451874_Copy_3" w:tooltip="HISTÓRICO DO CURSO">
+            <w:r>
+              <w:rPr>
+                <w:rStyle w:val="IndexLink"/>
+              </w:rPr>
+              <w:t>5 HISTÓRICO DO CURSO</w:t>
+              <w:tab/>
+              <w:t>16</w:t>
+            </w:r>
+          </w:hyperlink>
         </w:p>
         <w:p>
           <w:pPr>
@@ -1792,12 +1879,16 @@
             </w:tabs>
             <w:rPr/>
           </w:pPr>
-          <w:r>
-            <w:rPr/>
-            <w:t>6 JUSTIFICATIVA</w:t>
-            <w:tab/>
-            <w:t>16</w:t>
-          </w:r>
+          <w:hyperlink w:anchor="__RefHeading___Toc3343_1736451874_Copy_4" w:tooltip="JUSTIFICATIVA">
+            <w:r>
+              <w:rPr>
+                <w:rStyle w:val="IndexLink"/>
+              </w:rPr>
+              <w:t>6 JUSTIFICATIVA</w:t>
+              <w:tab/>
+              <w:t>16</w:t>
+            </w:r>
+          </w:hyperlink>
         </w:p>
         <w:p>
           <w:pPr>
@@ -1808,12 +1899,16 @@
             </w:tabs>
             <w:rPr/>
           </w:pPr>
-          <w:r>
-            <w:rPr/>
-            <w:t>6.1 Objetivos</w:t>
-            <w:tab/>
-            <w:t>17</w:t>
-          </w:r>
+          <w:hyperlink w:anchor="__RefHeading___Toc3351_1736451874_Copy_1" w:tooltip="Objetivos">
+            <w:r>
+              <w:rPr>
+                <w:rStyle w:val="IndexLink"/>
+              </w:rPr>
+              <w:t>6.1 Objetivos</w:t>
+              <w:tab/>
+              <w:t>17</w:t>
+            </w:r>
+          </w:hyperlink>
         </w:p>
         <w:p>
           <w:pPr>
@@ -1824,12 +1919,16 @@
             </w:tabs>
             <w:rPr/>
           </w:pPr>
-          <w:r>
-            <w:rPr/>
-            <w:t>6.1.1 Objetivo Geral</w:t>
-            <w:tab/>
-            <w:t>17</w:t>
-          </w:r>
+          <w:hyperlink w:anchor="__RefHeading___Toc3351_1736451874_Copy_2" w:tooltip="Objetivo Geral">
+            <w:r>
+              <w:rPr>
+                <w:rStyle w:val="IndexLink"/>
+              </w:rPr>
+              <w:t>6.1.1 Objetivo Geral</w:t>
+              <w:tab/>
+              <w:t>17</w:t>
+            </w:r>
+          </w:hyperlink>
         </w:p>
         <w:p>
           <w:pPr>
@@ -1840,12 +1939,16 @@
             </w:tabs>
             <w:rPr/>
           </w:pPr>
-          <w:r>
-            <w:rPr/>
-            <w:t>6.1.2 Objetivos Específicos</w:t>
-            <w:tab/>
-            <w:t>17</w:t>
-          </w:r>
+          <w:hyperlink w:anchor="__RefHeading___Toc3351_1736451874_Copy_3" w:tooltip="Objetivos Específicos">
+            <w:r>
+              <w:rPr>
+                <w:rStyle w:val="IndexLink"/>
+              </w:rPr>
+              <w:t>6.1.2 Objetivos Específicos</w:t>
+              <w:tab/>
+              <w:t>17</w:t>
+            </w:r>
+          </w:hyperlink>
         </w:p>
         <w:p>
           <w:pPr>
@@ -1856,12 +1959,16 @@
             </w:tabs>
             <w:rPr/>
           </w:pPr>
-          <w:r>
-            <w:rPr/>
-            <w:t>6.1.3 Articulação entre os objetivos e as características locais e regionais</w:t>
-            <w:tab/>
-            <w:t>17</w:t>
-          </w:r>
+          <w:hyperlink w:anchor="__RefHeading___Toc5067_1736451874" w:tooltip="Articulação entre os objetivos e as características locais e regionais">
+            <w:r>
+              <w:rPr>
+                <w:rStyle w:val="IndexLink"/>
+              </w:rPr>
+              <w:t>6.1.3 Articulação entre os objetivos e as características locais e regionais</w:t>
+              <w:tab/>
+              <w:t>17</w:t>
+            </w:r>
+          </w:hyperlink>
         </w:p>
         <w:p>
           <w:pPr>
@@ -1872,12 +1979,16 @@
             </w:tabs>
             <w:rPr/>
           </w:pPr>
-          <w:r>
-            <w:rPr/>
-            <w:t>6.1.4 Articulação entre os objetivos e o contexto educacional</w:t>
-            <w:tab/>
-            <w:t>17</w:t>
-          </w:r>
+          <w:hyperlink w:anchor="__RefHeading___Toc5069_1736451874" w:tooltip="Articulação entre os objetivos e o contexto educacional">
+            <w:r>
+              <w:rPr>
+                <w:rStyle w:val="IndexLink"/>
+              </w:rPr>
+              <w:t>6.1.4 Articulação entre os objetivos e o contexto educacional</w:t>
+              <w:tab/>
+              <w:t>17</w:t>
+            </w:r>
+          </w:hyperlink>
         </w:p>
         <w:p>
           <w:pPr>
@@ -1888,12 +1999,16 @@
             </w:tabs>
             <w:rPr/>
           </w:pPr>
-          <w:r>
-            <w:rPr/>
-            <w:t>7 REQUISITOS E FORMAS DE ACESSO</w:t>
-            <w:tab/>
-            <w:t>17</w:t>
-          </w:r>
+          <w:hyperlink w:anchor="__RefHeading___Toc5071_1736451874" w:tooltip="REQUISITOS E FORMAS DE ACESSO">
+            <w:r>
+              <w:rPr>
+                <w:rStyle w:val="IndexLink"/>
+              </w:rPr>
+              <w:t>7 REQUISITOS E FORMAS DE ACESSO</w:t>
+              <w:tab/>
+              <w:t>17</w:t>
+            </w:r>
+          </w:hyperlink>
         </w:p>
         <w:p>
           <w:pPr>
@@ -1904,12 +2019,16 @@
             </w:tabs>
             <w:rPr/>
           </w:pPr>
-          <w:r>
-            <w:rPr/>
-            <w:t>7.1 Publico Alvo</w:t>
-            <w:tab/>
-            <w:t>17</w:t>
-          </w:r>
+          <w:hyperlink w:anchor="__RefHeading___Toc7894_1192043239" w:tooltip="Publico Alvo">
+            <w:r>
+              <w:rPr>
+                <w:rStyle w:val="IndexLink"/>
+              </w:rPr>
+              <w:t>7.1 Publico Alvo</w:t>
+              <w:tab/>
+              <w:t>17</w:t>
+            </w:r>
+          </w:hyperlink>
         </w:p>
         <w:p>
           <w:pPr>
@@ -1920,12 +2039,16 @@
             </w:tabs>
             <w:rPr/>
           </w:pPr>
-          <w:r>
-            <w:rPr/>
-            <w:t>7.2 Formas de Acesso</w:t>
-            <w:tab/>
-            <w:t>18</w:t>
-          </w:r>
+          <w:hyperlink w:anchor="__RefHeading___Toc7896_1192043239" w:tooltip="Formas de Acesso">
+            <w:r>
+              <w:rPr>
+                <w:rStyle w:val="IndexLink"/>
+              </w:rPr>
+              <w:t>7.2 Formas de Acesso</w:t>
+              <w:tab/>
+              <w:t>18</w:t>
+            </w:r>
+          </w:hyperlink>
         </w:p>
         <w:p>
           <w:pPr>
@@ -1936,12 +2059,16 @@
             </w:tabs>
             <w:rPr/>
           </w:pPr>
-          <w:r>
-            <w:rPr/>
-            <w:t>8 FUNDAMENTAÇÃO LEGAL</w:t>
-            <w:tab/>
-            <w:t>18</w:t>
-          </w:r>
+          <w:hyperlink w:anchor="__RefHeading___Toc5081_1736451874" w:tooltip="FUNDAMENTAÇÃO LEGAL">
+            <w:r>
+              <w:rPr>
+                <w:rStyle w:val="IndexLink"/>
+              </w:rPr>
+              <w:t>8 FUNDAMENTAÇÃO LEGAL</w:t>
+              <w:tab/>
+              <w:t>18</w:t>
+            </w:r>
+          </w:hyperlink>
         </w:p>
         <w:p>
           <w:pPr>
@@ -1952,12 +2079,16 @@
             </w:tabs>
             <w:rPr/>
           </w:pPr>
-          <w:r>
-            <w:rPr/>
-            <w:t>8.1 Leis Federais</w:t>
-            <w:tab/>
-            <w:t>18</w:t>
-          </w:r>
+          <w:hyperlink w:anchor="__RefHeading___Toc5083_1736451874" w:tooltip="Leis Federais">
+            <w:r>
+              <w:rPr>
+                <w:rStyle w:val="IndexLink"/>
+              </w:rPr>
+              <w:t>8.1 Leis Federais</w:t>
+              <w:tab/>
+              <w:t>18</w:t>
+            </w:r>
+          </w:hyperlink>
         </w:p>
         <w:p>
           <w:pPr>
@@ -1968,12 +2099,16 @@
             </w:tabs>
             <w:rPr/>
           </w:pPr>
-          <w:r>
-            <w:rPr/>
-            <w:t>8.2 Decretos</w:t>
-            <w:tab/>
-            <w:t>19</w:t>
-          </w:r>
+          <w:hyperlink w:anchor="__RefHeading___Toc5085_1736451874" w:tooltip="Decretos">
+            <w:r>
+              <w:rPr>
+                <w:rStyle w:val="IndexLink"/>
+              </w:rPr>
+              <w:t>8.2 Decretos</w:t>
+              <w:tab/>
+              <w:t>19</w:t>
+            </w:r>
+          </w:hyperlink>
         </w:p>
         <w:p>
           <w:pPr>
@@ -1984,12 +2119,16 @@
             </w:tabs>
             <w:rPr/>
           </w:pPr>
-          <w:r>
-            <w:rPr/>
-            <w:t>8.3 Resoluções e Pareceres</w:t>
-            <w:tab/>
-            <w:t>20</w:t>
-          </w:r>
+          <w:hyperlink w:anchor="__RefHeading___Toc5087_1736451874" w:tooltip="Resoluções e Pareceres">
+            <w:r>
+              <w:rPr>
+                <w:rStyle w:val="IndexLink"/>
+              </w:rPr>
+              <w:t>8.3 Resoluções e Pareceres</w:t>
+              <w:tab/>
+              <w:t>20</w:t>
+            </w:r>
+          </w:hyperlink>
         </w:p>
         <w:p>
           <w:pPr>
@@ -2000,12 +2139,16 @@
             </w:tabs>
             <w:rPr/>
           </w:pPr>
-          <w:r>
-            <w:rPr/>
-            <w:t>8.4 Legislações pertinentes aos Cursos de Bacharelados</w:t>
-            <w:tab/>
-            <w:t>21</w:t>
-          </w:r>
+          <w:hyperlink w:anchor="__RefHeading___Toc5089_1736451874" w:tooltip="Legislações pertinentes aos Cursos de Bacharelados">
+            <w:r>
+              <w:rPr>
+                <w:rStyle w:val="IndexLink"/>
+              </w:rPr>
+              <w:t>8.4 Legislações pertinentes aos Cursos de Bacharelados</w:t>
+              <w:tab/>
+              <w:t>21</w:t>
+            </w:r>
+          </w:hyperlink>
         </w:p>
         <w:p>
           <w:pPr>
@@ -2016,12 +2159,16 @@
             </w:tabs>
             <w:rPr/>
           </w:pPr>
-          <w:r>
-            <w:rPr/>
-            <w:t>8.5 Legislações pertinentes aos Cursos de Tecnologia</w:t>
-            <w:tab/>
-            <w:t>22</w:t>
-          </w:r>
+          <w:hyperlink w:anchor="__RefHeading___Toc5091_1736451874" w:tooltip="Legislações pertinentes aos Cursos de Tecnologia">
+            <w:r>
+              <w:rPr>
+                <w:rStyle w:val="IndexLink"/>
+              </w:rPr>
+              <w:t>8.5 Legislações pertinentes aos Cursos de Tecnologia</w:t>
+              <w:tab/>
+              <w:t>22</w:t>
+            </w:r>
+          </w:hyperlink>
         </w:p>
         <w:p>
           <w:pPr>
@@ -2032,12 +2179,16 @@
             </w:tabs>
             <w:rPr/>
           </w:pPr>
-          <w:r>
-            <w:rPr/>
-            <w:t>8.6 Normas Internas do IFPE</w:t>
-            <w:tab/>
-            <w:t>22</w:t>
-          </w:r>
+          <w:hyperlink w:anchor="__RefHeading___Toc5093_1736451874" w:tooltip="Normas Internas do IFPE">
+            <w:r>
+              <w:rPr>
+                <w:rStyle w:val="IndexLink"/>
+              </w:rPr>
+              <w:t>8.6 Normas Internas do IFPE</w:t>
+              <w:tab/>
+              <w:t>22</w:t>
+            </w:r>
+          </w:hyperlink>
         </w:p>
         <w:p>
           <w:pPr>
@@ -2048,12 +2199,16 @@
             </w:tabs>
             <w:rPr/>
           </w:pPr>
-          <w:r>
-            <w:rPr/>
-            <w:t>8.7  Curricularização da Extensão</w:t>
-            <w:tab/>
-            <w:t>23</w:t>
-          </w:r>
+          <w:hyperlink w:anchor="__RefHeading___Toc5095_1736451874" w:tooltip=" Curricularização da Extensão">
+            <w:r>
+              <w:rPr>
+                <w:rStyle w:val="IndexLink"/>
+              </w:rPr>
+              <w:t>8.7  Curricularização da Extensão</w:t>
+              <w:tab/>
+              <w:t>23</w:t>
+            </w:r>
+          </w:hyperlink>
         </w:p>
         <w:p>
           <w:pPr>
@@ -2064,12 +2219,16 @@
             </w:tabs>
             <w:rPr/>
           </w:pPr>
-          <w:r>
-            <w:rPr/>
-            <w:t>9 PERFIL PROFISSIONAL DE CONCLUSÃO</w:t>
-            <w:tab/>
-            <w:t>24</w:t>
-          </w:r>
+          <w:hyperlink w:anchor="__RefHeading___Toc5097_1736451874" w:tooltip="PERFIL PROFISSIONAL DE CONCLUSÃO">
+            <w:r>
+              <w:rPr>
+                <w:rStyle w:val="IndexLink"/>
+              </w:rPr>
+              <w:t>9 PERFIL PROFISSIONAL DE CONCLUSÃO</w:t>
+              <w:tab/>
+              <w:t>24</w:t>
+            </w:r>
+          </w:hyperlink>
         </w:p>
         <w:p>
           <w:pPr>
@@ -2080,12 +2239,16 @@
             </w:tabs>
             <w:rPr/>
           </w:pPr>
-          <w:r>
-            <w:rPr/>
-            <w:t>10 CAMPO DE ATUAÇÃO</w:t>
-            <w:tab/>
-            <w:t>25</w:t>
-          </w:r>
+          <w:hyperlink w:anchor="__RefHeading___Toc5099_1736451874" w:tooltip="CAMPO DE ATUAÇÃO">
+            <w:r>
+              <w:rPr>
+                <w:rStyle w:val="IndexLink"/>
+              </w:rPr>
+              <w:t>10 CAMPO DE ATUAÇÃO</w:t>
+              <w:tab/>
+              <w:t>25</w:t>
+            </w:r>
+          </w:hyperlink>
         </w:p>
         <w:p>
           <w:pPr>
@@ -2096,12 +2259,16 @@
             </w:tabs>
             <w:rPr/>
           </w:pPr>
-          <w:r>
-            <w:rPr/>
-            <w:t>11 ORGANIZAÇÃO CURRICULAR</w:t>
-            <w:tab/>
-            <w:t>25</w:t>
-          </w:r>
+          <w:hyperlink w:anchor="__RefHeading___Toc5101_1736451874" w:tooltip="ORGANIZAÇÃO CURRICULAR">
+            <w:r>
+              <w:rPr>
+                <w:rStyle w:val="IndexLink"/>
+              </w:rPr>
+              <w:t>11 ORGANIZAÇÃO CURRICULAR</w:t>
+              <w:tab/>
+              <w:t>25</w:t>
+            </w:r>
+          </w:hyperlink>
         </w:p>
         <w:p>
           <w:pPr>
@@ -2112,12 +2279,16 @@
             </w:tabs>
             <w:rPr/>
           </w:pPr>
-          <w:r>
-            <w:rPr/>
-            <w:t>11.1  Concepções e princípios pedagógicos</w:t>
-            <w:tab/>
-            <w:t>25</w:t>
-          </w:r>
+          <w:hyperlink w:anchor="__RefHeading___Toc5103_1736451874" w:tooltip=" Concepções e princípios pedagógicos">
+            <w:r>
+              <w:rPr>
+                <w:rStyle w:val="IndexLink"/>
+              </w:rPr>
+              <w:t>11.1  Concepções e princípios pedagógicos</w:t>
+              <w:tab/>
+              <w:t>25</w:t>
+            </w:r>
+          </w:hyperlink>
         </w:p>
         <w:p>
           <w:pPr>
@@ -2128,12 +2299,16 @@
             </w:tabs>
             <w:rPr/>
           </w:pPr>
-          <w:r>
-            <w:rPr/>
-            <w:t>12 ESTRUTURA CURRICULAR</w:t>
-            <w:tab/>
-            <w:t>26</w:t>
-          </w:r>
+          <w:hyperlink w:anchor="__RefHeading___Toc5105_1736451874" w:tooltip="ESTRUTURA CURRICULAR">
+            <w:r>
+              <w:rPr>
+                <w:rStyle w:val="IndexLink"/>
+              </w:rPr>
+              <w:t>12 ESTRUTURA CURRICULAR</w:t>
+              <w:tab/>
+              <w:t>26</w:t>
+            </w:r>
+          </w:hyperlink>
         </w:p>
         <w:p>
           <w:pPr>
@@ -2144,12 +2319,16 @@
             </w:tabs>
             <w:rPr/>
           </w:pPr>
-          <w:r>
-            <w:rPr/>
-            <w:t>12.1  Curricularização da Extensão</w:t>
-            <w:tab/>
-            <w:t>27</w:t>
-          </w:r>
+          <w:hyperlink w:anchor="__RefHeading___Toc5107_1736451874" w:tooltip=" Curricularização da Extensão">
+            <w:r>
+              <w:rPr>
+                <w:rStyle w:val="IndexLink"/>
+              </w:rPr>
+              <w:t>12.1  Curricularização da Extensão</w:t>
+              <w:tab/>
+              <w:t>27</w:t>
+            </w:r>
+          </w:hyperlink>
         </w:p>
         <w:p>
           <w:pPr>
@@ -2160,12 +2339,16 @@
             </w:tabs>
             <w:rPr/>
           </w:pPr>
-          <w:r>
-            <w:rPr/>
-            <w:t>12.2 Sistema Acadêmico, duração e número de vagas</w:t>
-            <w:tab/>
-            <w:t>27</w:t>
-          </w:r>
+          <w:hyperlink w:anchor="__RefHeading___Toc5109_1736451874" w:tooltip="Sistema Acadêmico, duração e número de vagas">
+            <w:r>
+              <w:rPr>
+                <w:rStyle w:val="IndexLink"/>
+              </w:rPr>
+              <w:t>12.2 Sistema Acadêmico, duração e número de vagas</w:t>
+              <w:tab/>
+              <w:t>27</w:t>
+            </w:r>
+          </w:hyperlink>
         </w:p>
         <w:p>
           <w:pPr>
@@ -2176,12 +2359,16 @@
             </w:tabs>
             <w:rPr/>
           </w:pPr>
-          <w:r>
-            <w:rPr/>
-            <w:t>12.3 Desenho curricular</w:t>
-            <w:tab/>
-            <w:t>28</w:t>
-          </w:r>
+          <w:hyperlink w:anchor="__RefHeading___Toc5111_1736451874" w:tooltip="Desenho curricular">
+            <w:r>
+              <w:rPr>
+                <w:rStyle w:val="IndexLink"/>
+              </w:rPr>
+              <w:t>12.3 Desenho curricular</w:t>
+              <w:tab/>
+              <w:t>28</w:t>
+            </w:r>
+          </w:hyperlink>
         </w:p>
         <w:p>
           <w:pPr>
@@ -2192,12 +2379,16 @@
             </w:tabs>
             <w:rPr/>
           </w:pPr>
-          <w:r>
-            <w:rPr/>
-            <w:t>12.4 Fluxograma</w:t>
-            <w:tab/>
-            <w:t>29</w:t>
-          </w:r>
+          <w:hyperlink w:anchor="__RefHeading___Toc5113_1736451874" w:tooltip="Fluxograma">
+            <w:r>
+              <w:rPr>
+                <w:rStyle w:val="IndexLink"/>
+              </w:rPr>
+              <w:t>12.4 Fluxograma</w:t>
+              <w:tab/>
+              <w:t>29</w:t>
+            </w:r>
+          </w:hyperlink>
         </w:p>
         <w:p>
           <w:pPr>
@@ -2208,12 +2399,16 @@
             </w:tabs>
             <w:rPr/>
           </w:pPr>
-          <w:r>
-            <w:rPr/>
-            <w:t>12.5 Matriz Curricular</w:t>
-            <w:tab/>
-            <w:t>29</w:t>
-          </w:r>
+          <w:hyperlink w:anchor="__RefHeading___Toc8345_1736451874" w:tooltip="Matriz Curricular">
+            <w:r>
+              <w:rPr>
+                <w:rStyle w:val="IndexLink"/>
+              </w:rPr>
+              <w:t>12.5 Matriz Curricular</w:t>
+              <w:tab/>
+              <w:t>29</w:t>
+            </w:r>
+          </w:hyperlink>
         </w:p>
         <w:p>
           <w:pPr>
@@ -2224,12 +2419,16 @@
             </w:tabs>
             <w:rPr/>
           </w:pPr>
-          <w:r>
-            <w:rPr/>
-            <w:t>12.5.1  Componentes curriculares optativos</w:t>
-            <w:tab/>
-            <w:t>29</w:t>
-          </w:r>
+          <w:hyperlink w:anchor="__RefHeading___Toc8347_1736451874" w:tooltip=" Componentes curriculares optativos">
+            <w:r>
+              <w:rPr>
+                <w:rStyle w:val="IndexLink"/>
+              </w:rPr>
+              <w:t>12.5.1  Componentes curriculares optativos</w:t>
+              <w:tab/>
+              <w:t>29</w:t>
+            </w:r>
+          </w:hyperlink>
         </w:p>
         <w:p>
           <w:pPr>
@@ -2240,12 +2439,16 @@
             </w:tabs>
             <w:rPr/>
           </w:pPr>
-          <w:r>
-            <w:rPr/>
-            <w:t>12.5.2 Componentes curriculares eletivos</w:t>
-            <w:tab/>
-            <w:t>30</w:t>
-          </w:r>
+          <w:hyperlink w:anchor="__RefHeading___Toc8349_1736451874" w:tooltip="Componentes curriculares eletivos">
+            <w:r>
+              <w:rPr>
+                <w:rStyle w:val="IndexLink"/>
+              </w:rPr>
+              <w:t>12.5.2 Componentes curriculares eletivos</w:t>
+              <w:tab/>
+              <w:t>30</w:t>
+            </w:r>
+          </w:hyperlink>
         </w:p>
         <w:p>
           <w:pPr>
@@ -2256,12 +2459,16 @@
             </w:tabs>
             <w:rPr/>
           </w:pPr>
-          <w:r>
-            <w:rPr/>
-            <w:t>12.5.3 Matriz de equivalência</w:t>
-            <w:tab/>
-            <w:t>30</w:t>
-          </w:r>
+          <w:hyperlink w:anchor="__RefHeading___Toc8351_1736451874" w:tooltip="Matriz de equivalência">
+            <w:r>
+              <w:rPr>
+                <w:rStyle w:val="IndexLink"/>
+              </w:rPr>
+              <w:t>12.5.3 Matriz de equivalência</w:t>
+              <w:tab/>
+              <w:t>30</w:t>
+            </w:r>
+          </w:hyperlink>
         </w:p>
         <w:p>
           <w:pPr>
@@ -2272,12 +2479,16 @@
             </w:tabs>
             <w:rPr/>
           </w:pPr>
-          <w:r>
-            <w:rPr/>
-            <w:t>13 DINÂMICA CURRICULAR</w:t>
-            <w:tab/>
-            <w:t>30</w:t>
-          </w:r>
+          <w:hyperlink w:anchor="__RefHeading___Toc8353_1736451874" w:tooltip="DINÂMICA CURRICULAR">
+            <w:r>
+              <w:rPr>
+                <w:rStyle w:val="IndexLink"/>
+              </w:rPr>
+              <w:t>13 DINÂMICA CURRICULAR</w:t>
+              <w:tab/>
+              <w:t>30</w:t>
+            </w:r>
+          </w:hyperlink>
         </w:p>
         <w:p>
           <w:pPr>
@@ -2288,12 +2499,16 @@
             </w:tabs>
             <w:rPr/>
           </w:pPr>
-          <w:r>
-            <w:rPr/>
-            <w:t>13.1 Distribuição Percentual da Carga Horária do Desenho Curricular</w:t>
-            <w:tab/>
-            <w:t>31</w:t>
-          </w:r>
+          <w:hyperlink w:anchor="__RefHeading___Toc8355_1736451874" w:tooltip="Distribuição Percentual da Carga Horária do Desenho Curricular">
+            <w:r>
+              <w:rPr>
+                <w:rStyle w:val="IndexLink"/>
+              </w:rPr>
+              <w:t>13.1 Distribuição Percentual da Carga Horária do Desenho Curricular</w:t>
+              <w:tab/>
+              <w:t>31</w:t>
+            </w:r>
+          </w:hyperlink>
         </w:p>
         <w:p>
           <w:pPr>
@@ -2304,12 +2519,16 @@
             </w:tabs>
             <w:rPr/>
           </w:pPr>
-          <w:r>
-            <w:rPr/>
-            <w:t>14 ORIENTAÇÕES METODOLÓGICAS</w:t>
-            <w:tab/>
-            <w:t>32</w:t>
-          </w:r>
+          <w:hyperlink w:anchor="__RefHeading___Toc8357_1736451874" w:tooltip="ORIENTAÇÕES METODOLÓGICAS">
+            <w:r>
+              <w:rPr>
+                <w:rStyle w:val="IndexLink"/>
+              </w:rPr>
+              <w:t>14 ORIENTAÇÕES METODOLÓGICAS</w:t>
+              <w:tab/>
+              <w:t>32</w:t>
+            </w:r>
+          </w:hyperlink>
         </w:p>
         <w:p>
           <w:pPr>
@@ -2320,12 +2539,16 @@
             </w:tabs>
             <w:rPr/>
           </w:pPr>
-          <w:r>
-            <w:rPr/>
-            <w:t>15 ATIVIDADES DE ENSINO, PESQUISA E EXTENSÃO</w:t>
-            <w:tab/>
-            <w:t>32</w:t>
-          </w:r>
+          <w:hyperlink w:anchor="__RefHeading___Toc8359_1736451874" w:tooltip="ATIVIDADES DE ENSINO, PESQUISA E EXTENSÃO">
+            <w:r>
+              <w:rPr>
+                <w:rStyle w:val="IndexLink"/>
+              </w:rPr>
+              <w:t>15 ATIVIDADES DE ENSINO, PESQUISA E EXTENSÃO</w:t>
+              <w:tab/>
+              <w:t>32</w:t>
+            </w:r>
+          </w:hyperlink>
         </w:p>
         <w:p>
           <w:pPr>
@@ -2336,12 +2559,16 @@
             </w:tabs>
             <w:rPr/>
           </w:pPr>
-          <w:r>
-            <w:rPr/>
-            <w:t>15.1 Atividades complementares</w:t>
-            <w:tab/>
-            <w:t>33</w:t>
-          </w:r>
+          <w:hyperlink w:anchor="__RefHeading___Toc8361_1736451874" w:tooltip="Atividades complementares">
+            <w:r>
+              <w:rPr>
+                <w:rStyle w:val="IndexLink"/>
+              </w:rPr>
+              <w:t>15.1 Atividades complementares</w:t>
+              <w:tab/>
+              <w:t>33</w:t>
+            </w:r>
+          </w:hyperlink>
         </w:p>
         <w:p>
           <w:pPr>
@@ -2352,12 +2579,16 @@
             </w:tabs>
             <w:rPr/>
           </w:pPr>
-          <w:r>
-            <w:rPr/>
-            <w:t>16 PRÁTICA PROFISSIONAL</w:t>
-            <w:tab/>
-            <w:t>35</w:t>
-          </w:r>
+          <w:hyperlink w:anchor="__RefHeading___Toc8363_1736451874" w:tooltip="PRÁTICA PROFISSIONAL">
+            <w:r>
+              <w:rPr>
+                <w:rStyle w:val="IndexLink"/>
+              </w:rPr>
+              <w:t>16 PRÁTICA PROFISSIONAL</w:t>
+              <w:tab/>
+              <w:t>35</w:t>
+            </w:r>
+          </w:hyperlink>
         </w:p>
         <w:p>
           <w:pPr>
@@ -2368,12 +2599,16 @@
             </w:tabs>
             <w:rPr/>
           </w:pPr>
-          <w:r>
-            <w:rPr/>
-            <w:t>17 ESTÁGIO SUPERVISIONADO</w:t>
-            <w:tab/>
-            <w:t>36</w:t>
-          </w:r>
+          <w:hyperlink w:anchor="__RefHeading___Toc8365_1736451874" w:tooltip="ESTÁGIO SUPERVISIONADO">
+            <w:r>
+              <w:rPr>
+                <w:rStyle w:val="IndexLink"/>
+              </w:rPr>
+              <w:t>17 ESTÁGIO SUPERVISIONADO</w:t>
+              <w:tab/>
+              <w:t>35</w:t>
+            </w:r>
+          </w:hyperlink>
         </w:p>
         <w:p>
           <w:pPr>
@@ -2384,12 +2619,16 @@
             </w:tabs>
             <w:rPr/>
           </w:pPr>
-          <w:r>
-            <w:rPr/>
-            <w:t>18 TRABALHO DE CONCLUSÃO DE CURSO - TCC</w:t>
-            <w:tab/>
-            <w:t>37</w:t>
-          </w:r>
+          <w:hyperlink w:anchor="__RefHeading___Toc8369_1736451874" w:tooltip="TRABALHO DE CONCLUSÃO DE CURSO - TCC">
+            <w:r>
+              <w:rPr>
+                <w:rStyle w:val="IndexLink"/>
+              </w:rPr>
+              <w:t>18 TRABALHO DE CONCLUSÃO DE CURSO - TCC</w:t>
+              <w:tab/>
+              <w:t>36</w:t>
+            </w:r>
+          </w:hyperlink>
         </w:p>
         <w:p>
           <w:pPr>
@@ -2400,12 +2639,16 @@
             </w:tabs>
             <w:rPr/>
           </w:pPr>
-          <w:r>
-            <w:rPr/>
-            <w:t>19 EMENTÁRIO</w:t>
-            <w:tab/>
-            <w:t>37</w:t>
-          </w:r>
+          <w:hyperlink w:anchor="__RefHeading___Toc8371_1736451874" w:tooltip="EMENTÁRIO">
+            <w:r>
+              <w:rPr>
+                <w:rStyle w:val="IndexLink"/>
+              </w:rPr>
+              <w:t>19 EMENTÁRIO</w:t>
+              <w:tab/>
+              <w:t>37</w:t>
+            </w:r>
+          </w:hyperlink>
         </w:p>
         <w:p>
           <w:pPr>
@@ -2416,12 +2659,16 @@
             </w:tabs>
             <w:rPr/>
           </w:pPr>
-          <w:r>
-            <w:rPr/>
-            <w:t>20 ACESSIBILIDADE</w:t>
-            <w:tab/>
-            <w:t>38</w:t>
-          </w:r>
+          <w:hyperlink w:anchor="__RefHeading___Toc8373_1736451874" w:tooltip="ACESSIBILIDADE">
+            <w:r>
+              <w:rPr>
+                <w:rStyle w:val="IndexLink"/>
+              </w:rPr>
+              <w:t>20 ACESSIBILIDADE</w:t>
+              <w:tab/>
+              <w:t>38</w:t>
+            </w:r>
+          </w:hyperlink>
         </w:p>
         <w:p>
           <w:pPr>
@@ -2432,12 +2679,16 @@
             </w:tabs>
             <w:rPr/>
           </w:pPr>
-          <w:r>
-            <w:rPr/>
-            <w:t>21 CRITÉRIOS E PROCEDIMENTOS DE AVALIAÇÃO</w:t>
-            <w:tab/>
-            <w:t>39</w:t>
-          </w:r>
+          <w:hyperlink w:anchor="__RefHeading___Toc8375_1736451874" w:tooltip="CRITÉRIOS E PROCEDIMENTOS DE AVALIAÇÃO">
+            <w:r>
+              <w:rPr>
+                <w:rStyle w:val="IndexLink"/>
+              </w:rPr>
+              <w:t>21 CRITÉRIOS E PROCEDIMENTOS DE AVALIAÇÃO</w:t>
+              <w:tab/>
+              <w:t>38</w:t>
+            </w:r>
+          </w:hyperlink>
         </w:p>
         <w:p>
           <w:pPr>
@@ -2448,12 +2699,16 @@
             </w:tabs>
             <w:rPr/>
           </w:pPr>
-          <w:r>
-            <w:rPr/>
-            <w:t>21.1 Avaliação da Aprendizagem</w:t>
-            <w:tab/>
-            <w:t>39</w:t>
-          </w:r>
+          <w:hyperlink w:anchor="__RefHeading___Toc8377_1736451874" w:tooltip="Avaliação da Aprendizagem">
+            <w:r>
+              <w:rPr>
+                <w:rStyle w:val="IndexLink"/>
+              </w:rPr>
+              <w:t>21.1 Avaliação da Aprendizagem</w:t>
+              <w:tab/>
+              <w:t>39</w:t>
+            </w:r>
+          </w:hyperlink>
         </w:p>
         <w:p>
           <w:pPr>
@@ -2464,12 +2719,16 @@
             </w:tabs>
             <w:rPr/>
           </w:pPr>
-          <w:r>
-            <w:rPr/>
-            <w:t>21.2 Avaliações do Curso</w:t>
-            <w:tab/>
-            <w:t>40</w:t>
-          </w:r>
+          <w:hyperlink w:anchor="__RefHeading___Toc8379_1736451874" w:tooltip="Avaliações do Curso">
+            <w:r>
+              <w:rPr>
+                <w:rStyle w:val="IndexLink"/>
+              </w:rPr>
+              <w:t>21.2 Avaliações do Curso</w:t>
+              <w:tab/>
+              <w:t>39</w:t>
+            </w:r>
+          </w:hyperlink>
         </w:p>
         <w:p>
           <w:pPr>
@@ -2480,12 +2739,16 @@
             </w:tabs>
             <w:rPr/>
           </w:pPr>
-          <w:r>
-            <w:rPr/>
-            <w:t>21.3 Avaliação Externa</w:t>
-            <w:tab/>
-            <w:t>40</w:t>
-          </w:r>
+          <w:hyperlink w:anchor="__RefHeading___Toc8381_1736451874" w:tooltip="Avaliação Externa">
+            <w:r>
+              <w:rPr>
+                <w:rStyle w:val="IndexLink"/>
+              </w:rPr>
+              <w:t>21.3 Avaliação Externa</w:t>
+              <w:tab/>
+              <w:t>40</w:t>
+            </w:r>
+          </w:hyperlink>
         </w:p>
         <w:p>
           <w:pPr>
@@ -2496,12 +2759,16 @@
             </w:tabs>
             <w:rPr/>
           </w:pPr>
-          <w:r>
-            <w:rPr/>
-            <w:t>21.4 Avaliação Interna</w:t>
-            <w:tab/>
-            <w:t>41</w:t>
-          </w:r>
+          <w:hyperlink w:anchor="__RefHeading___Toc8383_1736451874" w:tooltip="Avaliação Interna">
+            <w:r>
+              <w:rPr>
+                <w:rStyle w:val="IndexLink"/>
+              </w:rPr>
+              <w:t>21.4 Avaliação Interna</w:t>
+              <w:tab/>
+              <w:t>40</w:t>
+            </w:r>
+          </w:hyperlink>
         </w:p>
         <w:p>
           <w:pPr>
@@ -2512,12 +2779,16 @@
             </w:tabs>
             <w:rPr/>
           </w:pPr>
-          <w:r>
-            <w:rPr/>
-            <w:t>22 ACOMPANHAMENTO DE EGRESSOS</w:t>
-            <w:tab/>
-            <w:t>42</w:t>
-          </w:r>
+          <w:hyperlink w:anchor="__RefHeading___Toc8788_1736451874" w:tooltip="ACOMPANHAMENTO DE EGRESSOS">
+            <w:r>
+              <w:rPr>
+                <w:rStyle w:val="IndexLink"/>
+              </w:rPr>
+              <w:t>22 ACOMPANHAMENTO DE EGRESSOS</w:t>
+              <w:tab/>
+              <w:t>42</w:t>
+            </w:r>
+          </w:hyperlink>
         </w:p>
         <w:p>
           <w:pPr>
@@ -2528,12 +2799,16 @@
             </w:tabs>
             <w:rPr/>
           </w:pPr>
-          <w:r>
-            <w:rPr/>
-            <w:t>23 DIPLOMAS</w:t>
-            <w:tab/>
-            <w:t>43</w:t>
-          </w:r>
+          <w:hyperlink w:anchor="__RefHeading___Toc8790_1736451874" w:tooltip="DIPLOMAS">
+            <w:r>
+              <w:rPr>
+                <w:rStyle w:val="IndexLink"/>
+              </w:rPr>
+              <w:t>23 DIPLOMAS</w:t>
+              <w:tab/>
+              <w:t>42</w:t>
+            </w:r>
+          </w:hyperlink>
         </w:p>
         <w:p>
           <w:pPr>
@@ -2544,12 +2819,16 @@
             </w:tabs>
             <w:rPr/>
           </w:pPr>
-          <w:r>
-            <w:rPr/>
-            <w:t>24 CORPO DOCENTE E TÉCNICO ADMINISTRATIVO</w:t>
-            <w:tab/>
-            <w:t>44</w:t>
-          </w:r>
+          <w:hyperlink w:anchor="__RefHeading___Toc8792_1736451874" w:tooltip="CORPO DOCENTE E TÉCNICO ADMINISTRATIVO">
+            <w:r>
+              <w:rPr>
+                <w:rStyle w:val="IndexLink"/>
+              </w:rPr>
+              <w:t>24 CORPO DOCENTE E TÉCNICO ADMINISTRATIVO</w:t>
+              <w:tab/>
+              <w:t>43</w:t>
+            </w:r>
+          </w:hyperlink>
         </w:p>
         <w:p>
           <w:pPr>
@@ -2560,12 +2839,16 @@
             </w:tabs>
             <w:rPr/>
           </w:pPr>
-          <w:r>
-            <w:rPr/>
-            <w:t>24.1 Coordenação do Curso</w:t>
-            <w:tab/>
-            <w:t>44</w:t>
-          </w:r>
+          <w:hyperlink w:anchor="__RefHeading___Toc8794_1736451874" w:tooltip="Coordenação do Curso">
+            <w:r>
+              <w:rPr>
+                <w:rStyle w:val="IndexLink"/>
+              </w:rPr>
+              <w:t>24.1 Coordenação do Curso</w:t>
+              <w:tab/>
+              <w:t>43</w:t>
+            </w:r>
+          </w:hyperlink>
         </w:p>
         <w:p>
           <w:pPr>
@@ -2576,12 +2859,16 @@
             </w:tabs>
             <w:rPr/>
           </w:pPr>
-          <w:r>
-            <w:rPr/>
-            <w:t>24.2 Atribuições do Coordenador</w:t>
-            <w:tab/>
-            <w:t>45</w:t>
-          </w:r>
+          <w:hyperlink w:anchor="__RefHeading___Toc2977_724336694" w:tooltip="Atribuições do Coordenador">
+            <w:r>
+              <w:rPr>
+                <w:rStyle w:val="IndexLink"/>
+              </w:rPr>
+              <w:t>24.2 Atribuições do Coordenador</w:t>
+              <w:tab/>
+              <w:t>44</w:t>
+            </w:r>
+          </w:hyperlink>
         </w:p>
         <w:p>
           <w:pPr>
@@ -2592,12 +2879,16 @@
             </w:tabs>
             <w:rPr/>
           </w:pPr>
-          <w:r>
-            <w:rPr/>
-            <w:t>25 PERFIL DO CORPO DOCENTE</w:t>
-            <w:tab/>
-            <w:t>46</w:t>
-          </w:r>
+          <w:hyperlink w:anchor="__RefHeading___Toc2979_724336694" w:tooltip="PERFIL DO CORPO DOCENTE">
+            <w:r>
+              <w:rPr>
+                <w:rStyle w:val="IndexLink"/>
+              </w:rPr>
+              <w:t>25 PERFIL DO CORPO DOCENTE</w:t>
+              <w:tab/>
+              <w:t>45</w:t>
+            </w:r>
+          </w:hyperlink>
         </w:p>
         <w:p>
           <w:pPr>
@@ -2608,12 +2899,16 @@
             </w:tabs>
             <w:rPr/>
           </w:pPr>
-          <w:r>
-            <w:rPr/>
-            <w:t>26 COLEGIADO DO CURSO</w:t>
-            <w:tab/>
-            <w:t>46</w:t>
-          </w:r>
+          <w:hyperlink w:anchor="__RefHeading___Toc2981_724336694" w:tooltip="COLEGIADO DO CURSO">
+            <w:r>
+              <w:rPr>
+                <w:rStyle w:val="IndexLink"/>
+              </w:rPr>
+              <w:t>26 COLEGIADO DO CURSO</w:t>
+              <w:tab/>
+              <w:t>46</w:t>
+            </w:r>
+          </w:hyperlink>
         </w:p>
         <w:p>
           <w:pPr>
@@ -2624,12 +2919,16 @@
             </w:tabs>
             <w:rPr/>
           </w:pPr>
-          <w:r>
-            <w:rPr/>
-            <w:t>27 Núcleo docente estruturante</w:t>
-            <w:tab/>
-            <w:t>47</w:t>
-          </w:r>
+          <w:hyperlink w:anchor="__RefHeading___Toc2983_724336694" w:tooltip="Núcleo docente estruturante">
+            <w:r>
+              <w:rPr>
+                <w:rStyle w:val="IndexLink"/>
+              </w:rPr>
+              <w:t>27 Núcleo docente estruturante</w:t>
+              <w:tab/>
+              <w:t>46</w:t>
+            </w:r>
+          </w:hyperlink>
         </w:p>
         <w:p>
           <w:pPr>
@@ -2640,12 +2939,16 @@
             </w:tabs>
             <w:rPr/>
           </w:pPr>
-          <w:r>
-            <w:rPr/>
-            <w:t>27.1 Atribuições do NDE</w:t>
-            <w:tab/>
-            <w:t>47</w:t>
-          </w:r>
+          <w:hyperlink w:anchor="__RefHeading___Toc2985_724336694" w:tooltip="Atribuições do NDE">
+            <w:r>
+              <w:rPr>
+                <w:rStyle w:val="IndexLink"/>
+              </w:rPr>
+              <w:t>27.1 Atribuições do NDE</w:t>
+              <w:tab/>
+              <w:t>47</w:t>
+            </w:r>
+          </w:hyperlink>
         </w:p>
         <w:p>
           <w:pPr>
@@ -2656,12 +2959,16 @@
             </w:tabs>
             <w:rPr/>
           </w:pPr>
-          <w:r>
-            <w:rPr/>
-            <w:t>28 INFRAESTRUTURA</w:t>
-            <w:tab/>
-            <w:t>48</w:t>
-          </w:r>
+          <w:hyperlink w:anchor="__RefHeading___Toc2987_724336694" w:tooltip="INFRAESTRUTURA">
+            <w:r>
+              <w:rPr>
+                <w:rStyle w:val="IndexLink"/>
+              </w:rPr>
+              <w:t>28 INFRAESTRUTURA</w:t>
+              <w:tab/>
+              <w:t>47</w:t>
+            </w:r>
+          </w:hyperlink>
         </w:p>
         <w:p>
           <w:pPr>
@@ -2672,12 +2979,16 @@
             </w:tabs>
             <w:rPr/>
           </w:pPr>
-          <w:r>
-            <w:rPr/>
-            <w:t>28.1 Instalações de Equipamentos</w:t>
-            <w:tab/>
-            <w:t>48</w:t>
-          </w:r>
+          <w:hyperlink w:anchor="__RefHeading___Toc2989_724336694" w:tooltip="Instalações de Equipamentos">
+            <w:r>
+              <w:rPr>
+                <w:rStyle w:val="IndexLink"/>
+              </w:rPr>
+              <w:t>28.1 Instalações de Equipamentos</w:t>
+              <w:tab/>
+              <w:t>48</w:t>
+            </w:r>
+          </w:hyperlink>
         </w:p>
         <w:p>
           <w:pPr>
@@ -2688,12 +2999,16 @@
             </w:tabs>
             <w:rPr/>
           </w:pPr>
-          <w:r>
-            <w:rPr/>
-            <w:t>28.2 Laboratórios</w:t>
-            <w:tab/>
-            <w:t>51</w:t>
-          </w:r>
+          <w:hyperlink w:anchor="__RefHeading___Toc2991_724336694" w:tooltip="Laboratórios">
+            <w:r>
+              <w:rPr>
+                <w:rStyle w:val="IndexLink"/>
+              </w:rPr>
+              <w:t>28.2 Laboratórios</w:t>
+              <w:tab/>
+              <w:t>51</w:t>
+            </w:r>
+          </w:hyperlink>
         </w:p>
         <w:p>
           <w:pPr>
@@ -2704,12 +3019,16 @@
             </w:tabs>
             <w:rPr/>
           </w:pPr>
-          <w:r>
-            <w:rPr/>
-            <w:t>28.3 Sala(s) de Aula(s)</w:t>
-            <w:tab/>
-            <w:t>53</w:t>
-          </w:r>
+          <w:hyperlink w:anchor="__RefHeading___Toc2993_724336694" w:tooltip="Sala(s) de Aula(s)">
+            <w:r>
+              <w:rPr>
+                <w:rStyle w:val="IndexLink"/>
+              </w:rPr>
+              <w:t>28.3 Sala(s) de Aula(s)</w:t>
+              <w:tab/>
+              <w:t>52</w:t>
+            </w:r>
+          </w:hyperlink>
         </w:p>
         <w:p>
           <w:pPr>
@@ -2720,12 +3039,16 @@
             </w:tabs>
             <w:rPr/>
           </w:pPr>
-          <w:r>
-            <w:rPr/>
-            <w:t>29 SETORES DE APRENDIZAGEM DA FORMAÇÃO NO CAMPO</w:t>
-            <w:tab/>
-            <w:t>54</w:t>
-          </w:r>
+          <w:hyperlink w:anchor="__RefHeading___Toc2995_724336694" w:tooltip="SETORES DE APRENDIZAGEM DA FORMAÇÃO NO CAMPO">
+            <w:r>
+              <w:rPr>
+                <w:rStyle w:val="IndexLink"/>
+              </w:rPr>
+              <w:t>29 SETORES DE APRENDIZAGEM DA FORMAÇÃO NO CAMPO</w:t>
+              <w:tab/>
+              <w:t>54</w:t>
+            </w:r>
+          </w:hyperlink>
         </w:p>
         <w:p>
           <w:pPr>
@@ -2736,12 +3059,16 @@
             </w:tabs>
             <w:rPr/>
           </w:pPr>
-          <w:r>
-            <w:rPr/>
-            <w:t>30 Biblioteca</w:t>
-            <w:tab/>
-            <w:t>55</w:t>
-          </w:r>
+          <w:hyperlink w:anchor="__RefHeading___Toc2997_724336694" w:tooltip="Biblioteca">
+            <w:r>
+              <w:rPr>
+                <w:rStyle w:val="IndexLink"/>
+              </w:rPr>
+              <w:t>30 Biblioteca</w:t>
+              <w:tab/>
+              <w:t>55</w:t>
+            </w:r>
+          </w:hyperlink>
         </w:p>
         <w:p>
           <w:pPr>
@@ -2752,12 +3079,16 @@
             </w:tabs>
             <w:rPr/>
           </w:pPr>
-          <w:r>
-            <w:rPr/>
-            <w:t>30.1 Infraestrutura da biblioteca: mobiliário e equipamentos</w:t>
-            <w:tab/>
-            <w:t>56</w:t>
-          </w:r>
+          <w:hyperlink w:anchor="__RefHeading___Toc2999_724336694" w:tooltip="Infraestrutura da biblioteca: mobiliário e equipamentos">
+            <w:r>
+              <w:rPr>
+                <w:rStyle w:val="IndexLink"/>
+              </w:rPr>
+              <w:t>30.1 Infraestrutura da biblioteca: mobiliário e equipamentos</w:t>
+              <w:tab/>
+              <w:t>56</w:t>
+            </w:r>
+          </w:hyperlink>
         </w:p>
         <w:p>
           <w:pPr>
@@ -2768,12 +3099,16 @@
             </w:tabs>
             <w:rPr/>
           </w:pPr>
-          <w:r>
-            <w:rPr/>
-            <w:t>30.1.1 Acervo da bibliografia básica do curso</w:t>
-            <w:tab/>
-            <w:t>57</w:t>
-          </w:r>
+          <w:hyperlink w:anchor="__RefHeading___Toc3001_724336694" w:tooltip="Acervo da bibliografia básica do curso">
+            <w:r>
+              <w:rPr>
+                <w:rStyle w:val="IndexLink"/>
+              </w:rPr>
+              <w:t>30.1.1 Acervo da bibliografia básica do curso</w:t>
+              <w:tab/>
+              <w:t>56</w:t>
+            </w:r>
+          </w:hyperlink>
         </w:p>
         <w:p>
           <w:pPr>
@@ -2784,12 +3119,16 @@
             </w:tabs>
             <w:rPr/>
           </w:pPr>
-          <w:r>
-            <w:rPr/>
-            <w:t>30.1.2 Acervo da bibliografia complementar do curso</w:t>
-            <w:tab/>
-            <w:t>57</w:t>
-          </w:r>
+          <w:hyperlink w:anchor="__RefHeading___Toc3003_724336694" w:tooltip="Acervo da bibliografia complementar do curso">
+            <w:r>
+              <w:rPr>
+                <w:rStyle w:val="IndexLink"/>
+              </w:rPr>
+              <w:t>30.1.2 Acervo da bibliografia complementar do curso</w:t>
+              <w:tab/>
+              <w:t>57</w:t>
+            </w:r>
+          </w:hyperlink>
         </w:p>
         <w:p>
           <w:pPr>
@@ -2800,12 +3139,16 @@
             </w:tabs>
             <w:rPr/>
           </w:pPr>
-          <w:r>
-            <w:rPr/>
-            <w:t>30.1.3 Acervo multimídia</w:t>
-            <w:tab/>
-            <w:t>58</w:t>
-          </w:r>
+          <w:hyperlink w:anchor="__RefHeading___Toc3005_724336694" w:tooltip="Acervo multimídia">
+            <w:r>
+              <w:rPr>
+                <w:rStyle w:val="IndexLink"/>
+              </w:rPr>
+              <w:t>30.1.3 Acervo multimídia</w:t>
+              <w:tab/>
+              <w:t>57</w:t>
+            </w:r>
+          </w:hyperlink>
         </w:p>
         <w:p>
           <w:pPr>
@@ -2816,12 +3159,16 @@
             </w:tabs>
             <w:rPr/>
           </w:pPr>
-          <w:r>
-            <w:rPr/>
-            <w:t>31 REFERÊNCIAS</w:t>
-            <w:tab/>
-            <w:t>58</w:t>
-          </w:r>
+          <w:hyperlink w:anchor="__RefHeading___Toc3007_724336694" w:tooltip="REFERÊNCIAS">
+            <w:r>
+              <w:rPr>
+                <w:rStyle w:val="IndexLink"/>
+              </w:rPr>
+              <w:t>31 REFERÊNCIAS</w:t>
+              <w:tab/>
+              <w:t>58</w:t>
+            </w:r>
+          </w:hyperlink>
         </w:p>
         <w:p>
           <w:pPr>
@@ -2832,12 +3179,16 @@
             </w:tabs>
             <w:rPr/>
           </w:pPr>
-          <w:r>
-            <w:rPr/>
-            <w:t>APÊNDICE</w:t>
-            <w:tab/>
-            <w:t>59</w:t>
-          </w:r>
+          <w:hyperlink w:anchor="__RefHeading___Toc3009_724336694" w:tooltip="APÊNDICE">
+            <w:r>
+              <w:rPr>
+                <w:rStyle w:val="IndexLink"/>
+              </w:rPr>
+              <w:t>APÊNDICE</w:t>
+              <w:tab/>
+              <w:t>58</w:t>
+            </w:r>
+          </w:hyperlink>
         </w:p>
         <w:p>
           <w:pPr>
@@ -2848,14 +3199,26 @@
             </w:tabs>
             <w:rPr/>
           </w:pPr>
+          <w:hyperlink w:anchor="__RefHeading___Toc3011_724336694" w:tooltip=" ANEXOS">
+            <w:r>
+              <w:rPr>
+                <w:rStyle w:val="IndexLink"/>
+              </w:rPr>
+              <w:t xml:space="preserve"> </w:t>
+            </w:r>
+            <w:r>
+              <w:rPr>
+                <w:rStyle w:val="IndexLink"/>
+              </w:rPr>
+              <w:t>ANEXOS</w:t>
+              <w:tab/>
+              <w:t>59</w:t>
+            </w:r>
+          </w:hyperlink>
           <w:r>
-            <w:rPr/>
-            <w:t>ANEXOS</w:t>
-            <w:tab/>
-            <w:t>59</w:t>
-          </w:r>
-          <w:r>
-            <w:rPr/>
+            <w:rPr>
+              <w:rStyle w:val="IndexLink"/>
+            </w:rPr>
             <w:fldChar w:fldCharType="end"/>
           </w:r>
         </w:p>
@@ -3134,7 +3497,7 @@
               <w:pStyle w:val="TableHeading"/>
               <w:widowControl/>
               <w:suppressAutoHyphens w:val="true"/>
-              <w:overflowPunct w:val="false"/>
+              <w:overflowPunct w:val="true"/>
               <w:bidi w:val="0"/>
               <w:spacing w:lineRule="auto" w:line="331" w:before="120" w:after="0"/>
               <w:ind w:hanging="0" w:left="0" w:right="0"/>
@@ -13888,7 +14251,7 @@
         <w:widowControl/>
         <w:shd w:val="clear" w:fill="FFFFFF"/>
         <w:suppressAutoHyphens w:val="true"/>
-        <w:overflowPunct w:val="false"/>
+        <w:overflowPunct w:val="true"/>
         <w:bidi w:val="0"/>
         <w:spacing w:lineRule="auto" w:line="360" w:before="0" w:after="0"/>
         <w:ind w:firstLine="709" w:left="0" w:right="0"/>
@@ -16780,8 +17143,8 @@
           <w:rFonts w:ascii="Times New Roman" w:hAnsi="Times New Roman"/>
         </w:rPr>
       </w:pPr>
-      <w:bookmarkStart w:id="58" w:name="__DdeLink__6479_642834953"/>
-      <w:bookmarkStart w:id="59" w:name="__DdeLink__3036_642834953"/>
+      <w:bookmarkStart w:id="58" w:name="__DdeLink__3036_642834953"/>
+      <w:bookmarkStart w:id="59" w:name="__DdeLink__6479_642834953"/>
       <w:r>
         <w:rPr>
           <w:sz w:val="24"/>
@@ -17166,7 +17529,7 @@
         <w:pStyle w:val="BodyText"/>
         <w:bidi w:val="0"/>
         <w:spacing w:lineRule="auto" w:line="360" w:before="0" w:after="0"/>
-        <w:ind w:firstLine="709" w:left="0" w:right="121"/>
+        <w:ind w:firstLine="709" w:left="0" w:right="0"/>
         <w:jc w:val="both"/>
         <w:rPr>
           <w:rFonts w:ascii="Times New Roman" w:hAnsi="Times New Roman"/>
@@ -20731,7 +21094,7 @@
         <w:pStyle w:val="BodyText"/>
         <w:bidi w:val="0"/>
         <w:spacing w:lineRule="auto" w:line="360" w:before="0" w:after="0"/>
-        <w:ind w:firstLine="720" w:left="0" w:right="121"/>
+        <w:ind w:firstLine="709" w:left="0" w:right="0"/>
         <w:jc w:val="both"/>
         <w:rPr>
           <w:rFonts w:ascii="Times New Roman" w:hAnsi="Times New Roman"/>
@@ -20850,7 +21213,7 @@
         <w:pStyle w:val="BodyText"/>
         <w:widowControl/>
         <w:suppressAutoHyphens w:val="true"/>
-        <w:overflowPunct w:val="false"/>
+        <w:overflowPunct w:val="true"/>
         <w:bidi w:val="0"/>
         <w:spacing w:lineRule="auto" w:line="360" w:before="709" w:after="709"/>
         <w:ind w:firstLine="709" w:left="0" w:right="0"/>
@@ -20883,7 +21246,7 @@
         <w:pStyle w:val="BodyText"/>
         <w:widowControl/>
         <w:suppressAutoHyphens w:val="true"/>
-        <w:overflowPunct w:val="false"/>
+        <w:overflowPunct w:val="true"/>
         <w:bidi w:val="0"/>
         <w:spacing w:lineRule="auto" w:line="360" w:before="709" w:after="709"/>
         <w:ind w:firstLine="709" w:left="0" w:right="0"/>
@@ -20916,7 +21279,7 @@
         <w:pStyle w:val="BodyText"/>
         <w:widowControl/>
         <w:suppressAutoHyphens w:val="true"/>
-        <w:overflowPunct w:val="false"/>
+        <w:overflowPunct w:val="true"/>
         <w:bidi w:val="0"/>
         <w:spacing w:lineRule="auto" w:line="360" w:before="709" w:after="709"/>
         <w:ind w:firstLine="709" w:left="0" w:right="0"/>
@@ -21263,7 +21626,7 @@
         <w:pStyle w:val="BodyText"/>
         <w:widowControl/>
         <w:suppressAutoHyphens w:val="true"/>
-        <w:overflowPunct w:val="false"/>
+        <w:overflowPunct w:val="true"/>
         <w:bidi w:val="0"/>
         <w:spacing w:before="0" w:after="0"/>
         <w:ind w:firstLine="709" w:left="0" w:right="0"/>
@@ -22313,7 +22676,7 @@
         </w:numPr>
         <w:bidi w:val="0"/>
         <w:spacing w:lineRule="auto" w:line="360" w:before="0" w:after="0"/>
-        <w:ind w:hanging="0" w:left="0" w:right="121"/>
+        <w:ind w:hanging="0" w:left="0" w:right="0"/>
         <w:jc w:val="both"/>
         <w:rPr>
           <w:rFonts w:ascii="Times New Roman" w:hAnsi="Times New Roman"/>
@@ -22348,7 +22711,7 @@
         </w:numPr>
         <w:bidi w:val="0"/>
         <w:spacing w:lineRule="auto" w:line="360" w:before="0" w:after="0"/>
-        <w:ind w:hanging="0" w:left="0" w:right="121"/>
+        <w:ind w:hanging="0" w:left="0" w:right="0"/>
         <w:jc w:val="both"/>
         <w:rPr>
           <w:rFonts w:ascii="Times New Roman" w:hAnsi="Times New Roman"/>
@@ -22383,7 +22746,7 @@
         </w:numPr>
         <w:bidi w:val="0"/>
         <w:spacing w:lineRule="auto" w:line="360" w:before="0" w:after="0"/>
-        <w:ind w:hanging="0" w:left="0" w:right="121"/>
+        <w:ind w:hanging="0" w:left="0" w:right="0"/>
         <w:jc w:val="both"/>
         <w:rPr>
           <w:rFonts w:ascii="Times New Roman" w:hAnsi="Times New Roman"/>
@@ -22504,7 +22867,7 @@
         <w:suppressAutoHyphens w:val="true"/>
         <w:bidi w:val="0"/>
         <w:spacing w:lineRule="auto" w:line="360" w:before="0" w:after="0"/>
-        <w:ind w:hanging="0" w:left="0" w:right="121"/>
+        <w:ind w:firstLine="709" w:left="0" w:right="0"/>
         <w:jc w:val="both"/>
         <w:rPr>
           <w:rFonts w:ascii="Times New Roman" w:hAnsi="Times New Roman"/>
@@ -22543,11 +22906,9 @@
         </w:numPr>
         <w:bidi w:val="0"/>
         <w:spacing w:lineRule="auto" w:line="360" w:before="0" w:after="0"/>
-        <w:ind w:hanging="0" w:left="0" w:right="121"/>
+        <w:ind w:firstLine="709" w:left="0" w:right="0"/>
         <w:jc w:val="both"/>
-        <w:rPr>
-          <w:rFonts w:ascii="Times New Roman" w:hAnsi="Times New Roman"/>
-        </w:rPr>
+        <w:rPr/>
       </w:pPr>
       <w:r>
         <w:rPr>
@@ -22567,11 +22928,9 @@
         </w:numPr>
         <w:bidi w:val="0"/>
         <w:spacing w:lineRule="auto" w:line="360" w:before="0" w:after="0"/>
-        <w:ind w:hanging="0" w:left="0" w:right="121"/>
+        <w:ind w:firstLine="709" w:left="0" w:right="0"/>
         <w:jc w:val="both"/>
-        <w:rPr>
-          <w:rFonts w:ascii="Times New Roman" w:hAnsi="Times New Roman"/>
-        </w:rPr>
+        <w:rPr/>
       </w:pPr>
       <w:r>
         <w:rPr>
@@ -22602,11 +22961,9 @@
         </w:numPr>
         <w:bidi w:val="0"/>
         <w:spacing w:lineRule="auto" w:line="360" w:before="0" w:after="0"/>
-        <w:ind w:hanging="0" w:left="0" w:right="121"/>
+        <w:ind w:firstLine="709" w:left="0" w:right="0"/>
         <w:jc w:val="both"/>
-        <w:rPr>
-          <w:rFonts w:ascii="Times New Roman" w:hAnsi="Times New Roman"/>
-        </w:rPr>
+        <w:rPr/>
       </w:pPr>
       <w:r>
         <w:rPr>
@@ -22637,11 +22994,9 @@
         </w:numPr>
         <w:bidi w:val="0"/>
         <w:spacing w:lineRule="auto" w:line="360" w:before="0" w:after="0"/>
-        <w:ind w:hanging="0" w:left="0" w:right="121"/>
+        <w:ind w:firstLine="709" w:left="0" w:right="0"/>
         <w:jc w:val="both"/>
-        <w:rPr>
-          <w:rFonts w:ascii="Times New Roman" w:hAnsi="Times New Roman"/>
-        </w:rPr>
+        <w:rPr/>
       </w:pPr>
       <w:r>
         <w:rPr>
@@ -22672,11 +23027,9 @@
         </w:numPr>
         <w:bidi w:val="0"/>
         <w:spacing w:lineRule="auto" w:line="360" w:before="0" w:after="0"/>
-        <w:ind w:hanging="0" w:left="0" w:right="121"/>
+        <w:ind w:firstLine="709" w:left="0" w:right="0"/>
         <w:jc w:val="both"/>
-        <w:rPr>
-          <w:rFonts w:ascii="Times New Roman" w:hAnsi="Times New Roman"/>
-        </w:rPr>
+        <w:rPr/>
       </w:pPr>
       <w:r>
         <w:rPr>
@@ -22707,11 +23060,9 @@
         </w:numPr>
         <w:bidi w:val="0"/>
         <w:spacing w:lineRule="auto" w:line="360" w:before="0" w:after="0"/>
-        <w:ind w:hanging="0" w:left="0" w:right="121"/>
+        <w:ind w:firstLine="709" w:left="0" w:right="0"/>
         <w:jc w:val="both"/>
-        <w:rPr>
-          <w:rFonts w:ascii="Times New Roman" w:hAnsi="Times New Roman"/>
-        </w:rPr>
+        <w:rPr/>
       </w:pPr>
       <w:r>
         <w:rPr>
@@ -22742,11 +23093,9 @@
         </w:numPr>
         <w:bidi w:val="0"/>
         <w:spacing w:lineRule="auto" w:line="360" w:before="0" w:after="0"/>
-        <w:ind w:hanging="0" w:left="0" w:right="121"/>
+        <w:ind w:hanging="0" w:left="0" w:right="0"/>
         <w:jc w:val="both"/>
-        <w:rPr>
-          <w:rFonts w:ascii="Times New Roman" w:hAnsi="Times New Roman"/>
-        </w:rPr>
+        <w:rPr/>
       </w:pPr>
       <w:r>
         <w:rPr>
@@ -22837,14 +23186,12 @@
         <w:suppressAutoHyphens w:val="true"/>
         <w:bidi w:val="0"/>
         <w:spacing w:lineRule="auto" w:line="360" w:before="0" w:after="0"/>
-        <w:ind w:hanging="0" w:left="0" w:right="121"/>
+        <w:ind w:firstLine="709" w:left="0" w:right="0"/>
         <w:jc w:val="both"/>
         <w:rPr>
           <w:rFonts w:ascii="Times New Roman" w:hAnsi="Times New Roman"/>
         </w:rPr>
       </w:pPr>
-      <w:bookmarkStart w:id="88" w:name="docs-internal-guid-c126c193-7fff-b966-c5"/>
-      <w:bookmarkEnd w:id="88"/>
       <w:r>
         <w:rPr>
           <w:rFonts w:eastAsia="Noto Sans CJK SC" w:cs="FreeSans"/>
@@ -22861,11 +23208,148 @@
           <w:szCs w:val="24"/>
           <w:u w:val="none"/>
           <w:effect w:val="none"/>
-          <w:shd w:fill="auto" w:val="clear"/>
+          <w:shd w:fill="FFF2CC" w:val="clear"/>
           <w:lang w:val="pt-BR" w:eastAsia="zh-CN" w:bidi="hi-IN"/>
         </w:rPr>
-        <w:tab/>
-      </w:r>
+        <w:t>Durante toda a trajetória acadêmica, será sempre reforçada a importância de manter o vínculo com a instituição, mesmo após concluir a formação. Para isso, o egresso deve entender que o processo de aprendizagem é contínuo. Assim, depois de obter o seu diploma, ele poderá participar de programas de Pós-Graduação do IFPE, contar com o apoio dos professores e da própria instituição, além de participar de eventos promovidos pelo IFPE.</w:t>
+      </w:r>
+    </w:p>
+    <w:p>
+      <w:pPr>
+        <w:pStyle w:val="BodyText"/>
+        <w:bidi w:val="0"/>
+        <w:spacing w:lineRule="auto" w:line="360" w:before="0" w:after="0"/>
+        <w:ind w:firstLine="709" w:left="0" w:right="0"/>
+        <w:jc w:val="both"/>
+        <w:rPr/>
+      </w:pPr>
+      <w:r>
+        <w:rPr>
+          <w:rFonts w:eastAsia="Noto Sans CJK SC"/>
+          <w:b w:val="false"/>
+          <w:bCs/>
+          <w:i w:val="false"/>
+          <w:caps w:val="false"/>
+          <w:smallCaps w:val="false"/>
+          <w:strike w:val="false"/>
+          <w:dstrike w:val="false"/>
+          <w:color w:val="000000"/>
+          <w:sz w:val="24"/>
+          <w:szCs w:val="24"/>
+          <w:u w:val="none"/>
+          <w:effect w:val="none"/>
+          <w:shd w:fill="FFF2CC" w:val="clear"/>
+        </w:rPr>
+        <w:t>Nos termos do Regulamento de Acompanhamento de Egressos do IFPE (Resolução no 54/2015 CONSUP), o egresso é o estudante que efetivamente concluiu os estudos regulares, estágios e outras atividades previstas no curso e que esteja apto a receber ou já recebeu o diploma. O acompanhamento dos egressos será focado em verificar a sua empregabilidade, como a formação técnica que receberam está atendendo às demandas do mercado de trabalho, e também na continuidade dos estudos após a conclusão do curso. Para isso, serão criados procedimentos institucionais que acompanhem a trajetória profissional dos ex-alunos, ajudando a identificar oportunidades no mundo do trabalho e a melhorar continuamente o Ensino, a Pesquisa e a Extensão na instituição.</w:t>
+      </w:r>
+    </w:p>
+    <w:p>
+      <w:pPr>
+        <w:pStyle w:val="BodyText"/>
+        <w:bidi w:val="0"/>
+        <w:spacing w:lineRule="auto" w:line="360" w:before="0" w:after="0"/>
+        <w:ind w:firstLine="709" w:left="0" w:right="0"/>
+        <w:jc w:val="both"/>
+        <w:rPr/>
+      </w:pPr>
+      <w:r>
+        <w:rPr>
+          <w:rFonts w:eastAsia="Noto Sans CJK SC"/>
+          <w:b w:val="false"/>
+          <w:bCs/>
+          <w:i w:val="false"/>
+          <w:caps w:val="false"/>
+          <w:smallCaps w:val="false"/>
+          <w:strike w:val="false"/>
+          <w:dstrike w:val="false"/>
+          <w:color w:val="000000"/>
+          <w:sz w:val="24"/>
+          <w:szCs w:val="24"/>
+          <w:u w:val="none"/>
+          <w:effect w:val="none"/>
+          <w:shd w:fill="FFF2CC" w:val="clear"/>
+        </w:rPr>
+        <w:t>Observar os documentos que regulamentam o acompanhamento de egressos emanados pela Pró Reitoria de Extensão do IFPE e mencionar as ferramentas de que o curso e a Instituição dispõe para o monitoramento dos estudantes egressos, apresentando, por exemplo, canais de comunicação para fornecimento de informações relacionadas a oportunidades de trabalho, coleta de dados que possam traduzir os desdobramentos do curso na sociedade e no mundo do trabalho e promover a interação dos egressos com empresas.</w:t>
+      </w:r>
+    </w:p>
+    <w:p>
+      <w:pPr>
+        <w:pStyle w:val="BodyText"/>
+        <w:widowControl/>
+        <w:suppressAutoHyphens w:val="true"/>
+        <w:bidi w:val="0"/>
+        <w:spacing w:lineRule="auto" w:line="360" w:before="0" w:after="0"/>
+        <w:ind w:hanging="0" w:left="0" w:right="121"/>
+        <w:jc w:val="both"/>
+        <w:rPr>
+          <w:rFonts w:ascii="Times New Roman" w:hAnsi="Times New Roman"/>
+          <w:sz w:val="24"/>
+          <w:szCs w:val="24"/>
+          <w:highlight w:val="none"/>
+          <w:shd w:fill="FFF2CC" w:val="clear"/>
+        </w:rPr>
+      </w:pPr>
+      <w:r>
+        <w:rPr>
+          <w:sz w:val="24"/>
+          <w:szCs w:val="24"/>
+          <w:shd w:fill="FFF2CC" w:val="clear"/>
+        </w:rPr>
+      </w:r>
+    </w:p>
+    <w:p>
+      <w:pPr>
+        <w:pStyle w:val="Heading1"/>
+        <w:numPr>
+          <w:ilvl w:val="0"/>
+          <w:numId w:val="1"/>
+        </w:numPr>
+        <w:spacing w:lineRule="auto" w:line="360"/>
+        <w:rPr>
+          <w:rFonts w:ascii="Times New Roman" w:hAnsi="Times New Roman"/>
+        </w:rPr>
+      </w:pPr>
+      <w:bookmarkStart w:id="88" w:name="__RefHeading___Toc8790_1736451874"/>
+      <w:bookmarkEnd w:id="88"/>
+      <w:r>
+        <w:rPr>
+          <w:rFonts w:ascii="Times New Roman" w:hAnsi="Times New Roman"/>
+          <w:sz w:val="24"/>
+          <w:szCs w:val="24"/>
+        </w:rPr>
+        <w:t>DIPLOMAS</w:t>
+      </w:r>
+    </w:p>
+    <w:p>
+      <w:pPr>
+        <w:pStyle w:val="BodyText"/>
+        <w:spacing w:lineRule="auto" w:line="360"/>
+        <w:rPr>
+          <w:rFonts w:ascii="Times New Roman" w:hAnsi="Times New Roman"/>
+          <w:sz w:val="24"/>
+          <w:szCs w:val="24"/>
+        </w:rPr>
+      </w:pPr>
+      <w:r>
+        <w:rPr>
+          <w:sz w:val="24"/>
+          <w:szCs w:val="24"/>
+        </w:rPr>
+      </w:r>
+    </w:p>
+    <w:p>
+      <w:pPr>
+        <w:pStyle w:val="BodyText"/>
+        <w:widowControl/>
+        <w:suppressAutoHyphens w:val="true"/>
+        <w:bidi w:val="0"/>
+        <w:spacing w:lineRule="auto" w:line="360" w:before="0" w:after="0"/>
+        <w:ind w:firstLine="709" w:left="0" w:right="0"/>
+        <w:jc w:val="both"/>
+        <w:rPr/>
+      </w:pPr>
+      <w:bookmarkStart w:id="89" w:name="docs-internal-guid-a7d25463-7fff-641b-76"/>
+      <w:bookmarkEnd w:id="89"/>
       <w:r>
         <w:rPr>
           <w:rFonts w:eastAsia="Noto Sans CJK SC" w:cs="FreeSans"/>
@@ -22885,7 +23369,7 @@
           <w:shd w:fill="FFF2CC" w:val="clear"/>
           <w:lang w:val="pt-BR" w:eastAsia="zh-CN" w:bidi="hi-IN"/>
         </w:rPr>
-        <w:t>Durante toda a trajetória acadêmica, será sempre reforçada a importância de manter o vínculo com a instituição, mesmo após concluir a formação. Para isso, o egresso deve entender que o processo de aprendizagem é contínuo. Assim, depois de obter o seu diploma, ele poderá participar de programas de Pós-Graduação do IFPE, contar com o apoio dos professores e da própria instituição, além de participar de eventos promovidos pelo IFPE.</w:t>
+        <w:t>Quando o estudante concluir todas as disciplinas do curso, incluindo os componentes obrigatórios e optativos, totalizando as horas, contando também com as de Estágio Curricular Supervisionado, entregar toda a documentação necessária ao CIEC, apresentar e aprovar o Trabalho de Conclusão de Curso, depositar esse trabalho na biblioteca do Campus e estar em situação regular junto ao ENADE, ele receberá o diploma.</w:t>
       </w:r>
     </w:p>
     <w:p>
@@ -22893,11 +23377,9 @@
         <w:pStyle w:val="BodyText"/>
         <w:bidi w:val="0"/>
         <w:spacing w:lineRule="auto" w:line="360" w:before="0" w:after="0"/>
-        <w:ind w:firstLine="720" w:left="0" w:right="121"/>
+        <w:ind w:firstLine="709" w:left="0" w:right="0"/>
         <w:jc w:val="both"/>
-        <w:rPr>
-          <w:rFonts w:ascii="Times New Roman" w:hAnsi="Times New Roman"/>
-        </w:rPr>
+        <w:rPr/>
       </w:pPr>
       <w:r>
         <w:rPr>
@@ -22916,7 +23398,7 @@
           <w:effect w:val="none"/>
           <w:shd w:fill="FFF2CC" w:val="clear"/>
         </w:rPr>
-        <w:t>Nos termos do Regulamento de Acompanhamento de Egressos do IFPE (Resolução no 54/2015 CONSUP), o egresso é o estudante que efetivamente concluiu os estudos regulares, estágios e outras atividades previstas no curso e que esteja apto a receber ou já recebeu o diploma. O acompanhamento dos egressos será focado em verificar a sua empregabilidade, como a formação técnica que receberam está atendendo às demandas do mercado de trabalho, e também na continuidade dos estudos após a conclusão do curso. Para isso, serão criados procedimentos institucionais que acompanhem a trajetória profissional dos ex-alunos, ajudando a identificar oportunidades no mundo do trabalho e a melhorar continuamente o Ensino, a Pesquisa e a Extensão na instituição.</w:t>
+        <w:t>Os estudantes que concluírem o curso de graduação participarão de uma cerimônia de COLAÇÃO DE GRAU, sendo esta uma etapa obrigatória para obter o diploma. Nesse momento especial, o estudante precisa assinar a ata de solenidade de colação de grau, que é um requisito necessário para solicitar a emissão do seu diploma junto ao setor de Registro Acadêmico do campus.</w:t>
       </w:r>
     </w:p>
     <w:p>
@@ -22924,11 +23406,9 @@
         <w:pStyle w:val="BodyText"/>
         <w:bidi w:val="0"/>
         <w:spacing w:lineRule="auto" w:line="360" w:before="0" w:after="0"/>
-        <w:ind w:firstLine="720" w:left="0" w:right="121"/>
+        <w:ind w:firstLine="709" w:left="0" w:right="0"/>
         <w:jc w:val="both"/>
-        <w:rPr>
-          <w:rFonts w:ascii="Times New Roman" w:hAnsi="Times New Roman"/>
-        </w:rPr>
+        <w:rPr/>
       </w:pPr>
       <w:r>
         <w:rPr>
@@ -22947,31 +23427,50 @@
           <w:effect w:val="none"/>
           <w:shd w:fill="FFF2CC" w:val="clear"/>
         </w:rPr>
-        <w:t>Observar os documentos que regulamentam o acompanhamento de egressos emanados pela Pró Reitoria de Extensão do IFPE e mencionar as ferramentas de que o curso e a Instituição dispõe para o monitoramento dos estudantes egressos, apresentando, por exemplo, canais de comunicação para fornecimento de informações relacionadas a oportunidades de trabalho, coleta de dados que possam traduzir os desdobramentos do curso na sociedade e no mundo do trabalho e promover a interação dos egressos com empresas.</w:t>
-      </w:r>
-    </w:p>
-    <w:p>
-      <w:pPr>
-        <w:pStyle w:val="BodyText"/>
-        <w:widowControl/>
-        <w:suppressAutoHyphens w:val="true"/>
+        <w:t>Acrescente-se a isso as informações relativas ao(s) documento(s) de conclusão de curso expedido(s) pelo estabelecimento de ensino a seus estudantes, identificando a habilitação para qual será expedida o diploma e explicitando a titulação concedida. A instituição deve, ainda, estar atenta ao fato de que, no Histórico Escolar, serão registradas, também, as competências que o estudante construiu no processo de formação, definidas no perfil profissional de conclusão do curso.</w:t>
+      </w:r>
+    </w:p>
+    <w:p>
+      <w:pPr>
+        <w:pStyle w:val="BodyText"/>
         <w:bidi w:val="0"/>
         <w:spacing w:lineRule="auto" w:line="360" w:before="0" w:after="0"/>
-        <w:ind w:hanging="0" w:left="0" w:right="121"/>
+        <w:ind w:firstLine="720" w:left="0" w:right="121"/>
         <w:jc w:val="both"/>
         <w:rPr>
-          <w:rFonts w:ascii="Times New Roman" w:hAnsi="Times New Roman"/>
-          <w:sz w:val="24"/>
-          <w:szCs w:val="24"/>
-          <w:highlight w:val="none"/>
-          <w:shd w:fill="FFF2CC" w:val="clear"/>
-        </w:rPr>
-      </w:pPr>
-      <w:r>
-        <w:rPr>
-          <w:sz w:val="24"/>
-          <w:szCs w:val="24"/>
-          <w:shd w:fill="FFF2CC" w:val="clear"/>
+          <w:rFonts w:ascii="Times New Roman" w:hAnsi="Times New Roman" w:eastAsia="Noto Sans CJK SC"/>
+          <w:b w:val="false"/>
+          <w:bCs/>
+          <w:i w:val="false"/>
+          <w:i w:val="false"/>
+          <w:caps w:val="false"/>
+          <w:smallCaps w:val="false"/>
+          <w:strike w:val="false"/>
+          <w:dstrike w:val="false"/>
+          <w:color w:val="000000"/>
+          <w:sz w:val="24"/>
+          <w:szCs w:val="24"/>
+          <w:u w:val="none"/>
+          <w:effect w:val="none"/>
+          <w:shd w:fill="FFFFFF" w:val="clear"/>
+        </w:rPr>
+      </w:pPr>
+      <w:r>
+        <w:rPr>
+          <w:rFonts w:eastAsia="Noto Sans CJK SC"/>
+          <w:b w:val="false"/>
+          <w:bCs/>
+          <w:i w:val="false"/>
+          <w:caps w:val="false"/>
+          <w:smallCaps w:val="false"/>
+          <w:strike w:val="false"/>
+          <w:dstrike w:val="false"/>
+          <w:color w:val="000000"/>
+          <w:sz w:val="24"/>
+          <w:szCs w:val="24"/>
+          <w:u w:val="none"/>
+          <w:effect w:val="none"/>
+          <w:shd w:fill="FFFFFF" w:val="clear"/>
         </w:rPr>
       </w:r>
     </w:p>
@@ -22987,15 +23486,15 @@
           <w:rFonts w:ascii="Times New Roman" w:hAnsi="Times New Roman"/>
         </w:rPr>
       </w:pPr>
-      <w:bookmarkStart w:id="89" w:name="__RefHeading___Toc8790_1736451874"/>
-      <w:bookmarkEnd w:id="89"/>
-      <w:r>
-        <w:rPr>
-          <w:rFonts w:ascii="Times New Roman" w:hAnsi="Times New Roman"/>
-          <w:sz w:val="24"/>
-          <w:szCs w:val="24"/>
-        </w:rPr>
-        <w:t>DIPLOMAS</w:t>
+      <w:bookmarkStart w:id="90" w:name="__RefHeading___Toc8792_1736451874"/>
+      <w:bookmarkEnd w:id="90"/>
+      <w:r>
+        <w:rPr>
+          <w:rFonts w:ascii="Times New Roman" w:hAnsi="Times New Roman"/>
+          <w:sz w:val="24"/>
+          <w:szCs w:val="24"/>
+        </w:rPr>
+        <w:t xml:space="preserve">CORPO DOCENTE E TÉCNICO ADMINISTRATIVO </w:t>
       </w:r>
     </w:p>
     <w:p>
@@ -23022,14 +23521,29 @@
         <w:suppressAutoHyphens w:val="true"/>
         <w:bidi w:val="0"/>
         <w:spacing w:lineRule="auto" w:line="360" w:before="0" w:after="0"/>
-        <w:ind w:firstLine="720" w:left="0" w:right="121"/>
+        <w:ind w:firstLine="709" w:left="0" w:right="0"/>
         <w:jc w:val="both"/>
         <w:rPr>
           <w:rFonts w:ascii="Times New Roman" w:hAnsi="Times New Roman"/>
         </w:rPr>
       </w:pPr>
-      <w:bookmarkStart w:id="90" w:name="docs-internal-guid-a7d25463-7fff-641b-76"/>
-      <w:bookmarkEnd w:id="90"/>
+      <w:r>
+        <w:rPr>
+          <w:b w:val="false"/>
+          <w:i w:val="false"/>
+          <w:caps w:val="false"/>
+          <w:smallCaps w:val="false"/>
+          <w:strike w:val="false"/>
+          <w:dstrike w:val="false"/>
+          <w:color w:val="000000"/>
+          <w:sz w:val="24"/>
+          <w:szCs w:val="24"/>
+          <w:u w:val="none"/>
+          <w:effect w:val="none"/>
+          <w:shd w:fill="FFF2CC" w:val="clear"/>
+        </w:rPr>
+        <w:t>Neste campo deve-se mencionar a estrutura organizacional do curso, e sua distribuição de equipe composta por docentes e servidores técnico-</w:t>
+      </w:r>
       <w:r>
         <w:rPr>
           <w:rFonts w:eastAsia="Noto Sans CJK SC" w:cs="FreeSans"/>
@@ -23049,224 +23563,6 @@
           <w:shd w:fill="FFF2CC" w:val="clear"/>
           <w:lang w:val="pt-BR" w:eastAsia="zh-CN" w:bidi="hi-IN"/>
         </w:rPr>
-        <w:t>Quando o estudante concluir todas as disciplinas do curso, incluindo os componentes obrigatórios e optativos, totalizando as horas, contando também com as de Estágio Curricular Supervisionado, entregar toda a documentação necessária ao CIEC, apresentar e aprovar o Trabalho de Conclusão de Curso, depositar esse trabalho na biblioteca do Campus e estar em situação regular junto ao ENADE, ele receberá o diploma.</w:t>
-      </w:r>
-    </w:p>
-    <w:p>
-      <w:pPr>
-        <w:pStyle w:val="BodyText"/>
-        <w:bidi w:val="0"/>
-        <w:spacing w:lineRule="auto" w:line="360" w:before="0" w:after="0"/>
-        <w:ind w:hanging="0" w:left="0" w:right="121"/>
-        <w:jc w:val="both"/>
-        <w:rPr>
-          <w:rFonts w:ascii="Times New Roman" w:hAnsi="Times New Roman"/>
-        </w:rPr>
-      </w:pPr>
-      <w:r>
-        <w:rPr>
-          <w:rFonts w:eastAsia="Noto Sans CJK SC"/>
-          <w:b w:val="false"/>
-          <w:bCs/>
-          <w:i w:val="false"/>
-          <w:caps w:val="false"/>
-          <w:smallCaps w:val="false"/>
-          <w:strike w:val="false"/>
-          <w:dstrike w:val="false"/>
-          <w:color w:val="000000"/>
-          <w:sz w:val="24"/>
-          <w:szCs w:val="24"/>
-          <w:u w:val="none"/>
-          <w:effect w:val="none"/>
-          <w:shd w:fill="FFF2CC" w:val="clear"/>
-        </w:rPr>
-        <w:tab/>
-        <w:t>Os estudantes que concluírem o curso de graduação participarão de uma cerimônia de COLAÇÃO DE GRAU, sendo esta uma etapa obrigatória para obter o diploma. Nesse momento especial, o estudante precisa assinar a ata de solenidade de colação de grau, que é um requisito necessário para solicitar a emissão do seu diploma junto ao setor de Registro Acadêmico do campus.</w:t>
-      </w:r>
-    </w:p>
-    <w:p>
-      <w:pPr>
-        <w:pStyle w:val="BodyText"/>
-        <w:bidi w:val="0"/>
-        <w:spacing w:lineRule="auto" w:line="360" w:before="0" w:after="0"/>
-        <w:ind w:firstLine="720" w:left="0" w:right="121"/>
-        <w:jc w:val="both"/>
-        <w:rPr>
-          <w:rFonts w:ascii="Times New Roman" w:hAnsi="Times New Roman"/>
-        </w:rPr>
-      </w:pPr>
-      <w:r>
-        <w:rPr>
-          <w:rFonts w:eastAsia="Noto Sans CJK SC"/>
-          <w:b w:val="false"/>
-          <w:bCs/>
-          <w:i w:val="false"/>
-          <w:caps w:val="false"/>
-          <w:smallCaps w:val="false"/>
-          <w:strike w:val="false"/>
-          <w:dstrike w:val="false"/>
-          <w:color w:val="000000"/>
-          <w:sz w:val="24"/>
-          <w:szCs w:val="24"/>
-          <w:u w:val="none"/>
-          <w:effect w:val="none"/>
-          <w:shd w:fill="FFF2CC" w:val="clear"/>
-        </w:rPr>
-        <w:t>Acrescente-se a isso as informações relativas ao(s) documento(s) de conclusão de curso expedido(s) pelo estabelecimento de ensino a seus estudantes, identificando a habilitação para qual será expedida o diploma e explicitando a titulação concedida. A instituição deve, ainda, estar atenta ao fato de que, no Histórico Escolar, serão registradas, também, as competências que o estudante construiu no processo de formação, definidas no perfil profissional de conclusão do curso.</w:t>
-      </w:r>
-    </w:p>
-    <w:p>
-      <w:pPr>
-        <w:pStyle w:val="BodyText"/>
-        <w:bidi w:val="0"/>
-        <w:spacing w:lineRule="auto" w:line="360" w:before="0" w:after="0"/>
-        <w:ind w:firstLine="720" w:left="0" w:right="121"/>
-        <w:jc w:val="both"/>
-        <w:rPr>
-          <w:rFonts w:ascii="Times New Roman" w:hAnsi="Times New Roman" w:eastAsia="Noto Sans CJK SC"/>
-          <w:b w:val="false"/>
-          <w:bCs/>
-          <w:i w:val="false"/>
-          <w:i w:val="false"/>
-          <w:caps w:val="false"/>
-          <w:smallCaps w:val="false"/>
-          <w:strike w:val="false"/>
-          <w:dstrike w:val="false"/>
-          <w:color w:val="000000"/>
-          <w:sz w:val="24"/>
-          <w:szCs w:val="24"/>
-          <w:u w:val="none"/>
-          <w:effect w:val="none"/>
-          <w:shd w:fill="FFFFFF" w:val="clear"/>
-        </w:rPr>
-      </w:pPr>
-      <w:r>
-        <w:rPr>
-          <w:rFonts w:eastAsia="Noto Sans CJK SC"/>
-          <w:b w:val="false"/>
-          <w:bCs/>
-          <w:i w:val="false"/>
-          <w:caps w:val="false"/>
-          <w:smallCaps w:val="false"/>
-          <w:strike w:val="false"/>
-          <w:dstrike w:val="false"/>
-          <w:color w:val="000000"/>
-          <w:sz w:val="24"/>
-          <w:szCs w:val="24"/>
-          <w:u w:val="none"/>
-          <w:effect w:val="none"/>
-          <w:shd w:fill="FFFFFF" w:val="clear"/>
-        </w:rPr>
-      </w:r>
-    </w:p>
-    <w:p>
-      <w:pPr>
-        <w:pStyle w:val="Heading1"/>
-        <w:numPr>
-          <w:ilvl w:val="0"/>
-          <w:numId w:val="1"/>
-        </w:numPr>
-        <w:spacing w:lineRule="auto" w:line="360"/>
-        <w:rPr>
-          <w:rFonts w:ascii="Times New Roman" w:hAnsi="Times New Roman"/>
-        </w:rPr>
-      </w:pPr>
-      <w:bookmarkStart w:id="91" w:name="__RefHeading___Toc8792_1736451874"/>
-      <w:bookmarkEnd w:id="91"/>
-      <w:r>
-        <w:rPr>
-          <w:rFonts w:ascii="Times New Roman" w:hAnsi="Times New Roman"/>
-          <w:sz w:val="24"/>
-          <w:szCs w:val="24"/>
-        </w:rPr>
-        <w:t xml:space="preserve">CORPO DOCENTE E TÉCNICO ADMINISTRATIVO </w:t>
-      </w:r>
-    </w:p>
-    <w:p>
-      <w:pPr>
-        <w:pStyle w:val="BodyText"/>
-        <w:spacing w:lineRule="auto" w:line="360"/>
-        <w:rPr>
-          <w:rFonts w:ascii="Times New Roman" w:hAnsi="Times New Roman"/>
-          <w:sz w:val="24"/>
-          <w:szCs w:val="24"/>
-        </w:rPr>
-      </w:pPr>
-      <w:r>
-        <w:rPr>
-          <w:sz w:val="24"/>
-          <w:szCs w:val="24"/>
-        </w:rPr>
-      </w:r>
-    </w:p>
-    <w:p>
-      <w:pPr>
-        <w:pStyle w:val="BodyText"/>
-        <w:widowControl/>
-        <w:suppressAutoHyphens w:val="true"/>
-        <w:bidi w:val="0"/>
-        <w:spacing w:lineRule="auto" w:line="360" w:before="0" w:after="0"/>
-        <w:ind w:hanging="0" w:left="0" w:right="121"/>
-        <w:jc w:val="both"/>
-        <w:rPr>
-          <w:rFonts w:ascii="Times New Roman" w:hAnsi="Times New Roman"/>
-        </w:rPr>
-      </w:pPr>
-      <w:bookmarkStart w:id="92" w:name="docs-internal-guid-b2efdd94-7fff-c6f5-62"/>
-      <w:bookmarkEnd w:id="92"/>
-      <w:r>
-        <w:rPr>
-          <w:b w:val="false"/>
-          <w:i w:val="false"/>
-          <w:caps w:val="false"/>
-          <w:smallCaps w:val="false"/>
-          <w:strike w:val="false"/>
-          <w:dstrike w:val="false"/>
-          <w:color w:val="000000"/>
-          <w:sz w:val="24"/>
-          <w:szCs w:val="24"/>
-          <w:u w:val="none"/>
-          <w:effect w:val="none"/>
-          <w:shd w:fill="auto" w:val="clear"/>
-        </w:rPr>
-        <w:tab/>
-      </w:r>
-      <w:r>
-        <w:rPr>
-          <w:b w:val="false"/>
-          <w:i w:val="false"/>
-          <w:caps w:val="false"/>
-          <w:smallCaps w:val="false"/>
-          <w:strike w:val="false"/>
-          <w:dstrike w:val="false"/>
-          <w:color w:val="000000"/>
-          <w:sz w:val="24"/>
-          <w:szCs w:val="24"/>
-          <w:u w:val="none"/>
-          <w:effect w:val="none"/>
-          <w:shd w:fill="FFF2CC" w:val="clear"/>
-        </w:rPr>
-        <w:t>Neste campo deve-se mencionar a estrutura organizacional do curso, e sua distribuição de equipe composta por docentes e servidores técnico-</w:t>
-      </w:r>
-      <w:r>
-        <w:rPr>
-          <w:rFonts w:eastAsia="Noto Sans CJK SC" w:cs="FreeSans"/>
-          <w:b w:val="false"/>
-          <w:bCs/>
-          <w:i w:val="false"/>
-          <w:caps w:val="false"/>
-          <w:smallCaps w:val="false"/>
-          <w:strike w:val="false"/>
-          <w:dstrike w:val="false"/>
-          <w:color w:val="000000"/>
-          <w:kern w:val="2"/>
-          <w:sz w:val="24"/>
-          <w:szCs w:val="24"/>
-          <w:u w:val="none"/>
-          <w:effect w:val="none"/>
-          <w:shd w:fill="FFF2CC" w:val="clear"/>
-          <w:lang w:val="pt-BR" w:eastAsia="zh-CN" w:bidi="hi-IN"/>
-        </w:rPr>
         <w:t>administrativos</w:t>
       </w:r>
       <w:r>
@@ -23316,8 +23612,8 @@
           <w:rFonts w:ascii="Times New Roman" w:hAnsi="Times New Roman"/>
         </w:rPr>
       </w:pPr>
-      <w:bookmarkStart w:id="93" w:name="__RefHeading___Toc8794_1736451874"/>
-      <w:bookmarkEnd w:id="93"/>
+      <w:bookmarkStart w:id="91" w:name="__RefHeading___Toc8794_1736451874"/>
+      <w:bookmarkEnd w:id="91"/>
       <w:r>
         <w:rPr>
           <w:rFonts w:ascii="Times New Roman" w:hAnsi="Times New Roman"/>
@@ -24655,8 +24951,8 @@
           <w:rFonts w:ascii="Times New Roman" w:hAnsi="Times New Roman"/>
         </w:rPr>
       </w:pPr>
-      <w:bookmarkStart w:id="94" w:name="__RefHeading___Toc2977_724336694"/>
-      <w:bookmarkEnd w:id="94"/>
+      <w:bookmarkStart w:id="92" w:name="__RefHeading___Toc2977_724336694"/>
+      <w:bookmarkEnd w:id="92"/>
       <w:r>
         <w:rPr>
           <w:rFonts w:ascii="Times New Roman" w:hAnsi="Times New Roman"/>
@@ -24694,8 +24990,8 @@
           <w:rFonts w:ascii="Times New Roman" w:hAnsi="Times New Roman"/>
         </w:rPr>
       </w:pPr>
-      <w:bookmarkStart w:id="95" w:name="docs-internal-guid-87136094-7fff-8bab-7f"/>
-      <w:bookmarkEnd w:id="95"/>
+      <w:bookmarkStart w:id="93" w:name="docs-internal-guid-87136094-7fff-8bab-7f"/>
+      <w:bookmarkEnd w:id="93"/>
       <w:r>
         <w:rPr>
           <w:b w:val="false"/>
@@ -24723,11 +25019,9 @@
         </w:numPr>
         <w:bidi w:val="0"/>
         <w:spacing w:lineRule="auto" w:line="360" w:before="0" w:after="0"/>
-        <w:ind w:hanging="0" w:left="0" w:right="121"/>
+        <w:ind w:firstLine="709" w:left="0" w:right="0"/>
         <w:jc w:val="both"/>
-        <w:rPr>
-          <w:rFonts w:ascii="Times New Roman" w:hAnsi="Times New Roman"/>
-        </w:rPr>
+        <w:rPr/>
       </w:pPr>
       <w:r>
         <w:rPr>
@@ -24747,11 +25041,9 @@
         </w:numPr>
         <w:bidi w:val="0"/>
         <w:spacing w:lineRule="auto" w:line="360" w:before="0" w:after="0"/>
-        <w:ind w:hanging="0" w:left="0" w:right="121"/>
+        <w:ind w:firstLine="709" w:left="0" w:right="0"/>
         <w:jc w:val="both"/>
-        <w:rPr>
-          <w:rFonts w:ascii="Times New Roman" w:hAnsi="Times New Roman"/>
-        </w:rPr>
+        <w:rPr/>
       </w:pPr>
       <w:r>
         <w:rPr>
@@ -24771,11 +25063,9 @@
         </w:numPr>
         <w:bidi w:val="0"/>
         <w:spacing w:lineRule="auto" w:line="360" w:before="0" w:after="0"/>
-        <w:ind w:hanging="0" w:left="0" w:right="121"/>
+        <w:ind w:firstLine="709" w:left="0" w:right="0"/>
         <w:jc w:val="both"/>
-        <w:rPr>
-          <w:rFonts w:ascii="Times New Roman" w:hAnsi="Times New Roman"/>
-        </w:rPr>
+        <w:rPr/>
       </w:pPr>
       <w:r>
         <w:rPr>
@@ -24795,11 +25085,9 @@
         </w:numPr>
         <w:bidi w:val="0"/>
         <w:spacing w:lineRule="auto" w:line="360" w:before="0" w:after="0"/>
-        <w:ind w:hanging="0" w:left="0" w:right="121"/>
+        <w:ind w:firstLine="709" w:left="0" w:right="0"/>
         <w:jc w:val="both"/>
-        <w:rPr>
-          <w:rFonts w:ascii="Times New Roman" w:hAnsi="Times New Roman"/>
-        </w:rPr>
+        <w:rPr/>
       </w:pPr>
       <w:r>
         <w:rPr>
@@ -24828,11 +25116,9 @@
         </w:numPr>
         <w:bidi w:val="0"/>
         <w:spacing w:lineRule="auto" w:line="360" w:before="0" w:after="0"/>
-        <w:ind w:hanging="0" w:left="0" w:right="121"/>
+        <w:ind w:firstLine="709" w:left="0" w:right="0"/>
         <w:jc w:val="both"/>
-        <w:rPr>
-          <w:rFonts w:ascii="Times New Roman" w:hAnsi="Times New Roman"/>
-        </w:rPr>
+        <w:rPr/>
       </w:pPr>
       <w:r>
         <w:rPr>
@@ -24861,11 +25147,9 @@
         </w:numPr>
         <w:bidi w:val="0"/>
         <w:spacing w:lineRule="auto" w:line="360" w:before="0" w:after="0"/>
-        <w:ind w:hanging="0" w:left="0" w:right="121"/>
+        <w:ind w:firstLine="709" w:left="0" w:right="0"/>
         <w:jc w:val="both"/>
-        <w:rPr>
-          <w:rFonts w:ascii="Times New Roman" w:hAnsi="Times New Roman"/>
-        </w:rPr>
+        <w:rPr/>
       </w:pPr>
       <w:r>
         <w:rPr>
@@ -24894,11 +25178,9 @@
         </w:numPr>
         <w:bidi w:val="0"/>
         <w:spacing w:lineRule="auto" w:line="360" w:before="0" w:after="0"/>
-        <w:ind w:hanging="0" w:left="0" w:right="121"/>
+        <w:ind w:firstLine="709" w:left="0" w:right="0"/>
         <w:jc w:val="both"/>
-        <w:rPr>
-          <w:rFonts w:ascii="Times New Roman" w:hAnsi="Times New Roman"/>
-        </w:rPr>
+        <w:rPr/>
       </w:pPr>
       <w:r>
         <w:rPr>
@@ -24927,11 +25209,9 @@
         </w:numPr>
         <w:bidi w:val="0"/>
         <w:spacing w:lineRule="auto" w:line="360" w:before="0" w:after="0"/>
-        <w:ind w:hanging="0" w:left="0" w:right="121"/>
+        <w:ind w:firstLine="709" w:left="0" w:right="0"/>
         <w:jc w:val="both"/>
-        <w:rPr>
-          <w:rFonts w:ascii="Times New Roman" w:hAnsi="Times New Roman"/>
-        </w:rPr>
+        <w:rPr/>
       </w:pPr>
       <w:r>
         <w:rPr>
@@ -24960,11 +25240,9 @@
         </w:numPr>
         <w:bidi w:val="0"/>
         <w:spacing w:lineRule="auto" w:line="360" w:before="0" w:after="0"/>
-        <w:ind w:hanging="0" w:left="0" w:right="121"/>
+        <w:ind w:firstLine="709" w:left="0" w:right="0"/>
         <w:jc w:val="both"/>
-        <w:rPr>
-          <w:rFonts w:ascii="Times New Roman" w:hAnsi="Times New Roman"/>
-        </w:rPr>
+        <w:rPr/>
       </w:pPr>
       <w:r>
         <w:rPr>
@@ -24993,11 +25271,9 @@
         </w:numPr>
         <w:bidi w:val="0"/>
         <w:spacing w:lineRule="auto" w:line="360" w:before="0" w:after="0"/>
-        <w:ind w:hanging="0" w:left="0" w:right="121"/>
+        <w:ind w:firstLine="709" w:left="0" w:right="0"/>
         <w:jc w:val="both"/>
-        <w:rPr>
-          <w:rFonts w:ascii="Times New Roman" w:hAnsi="Times New Roman"/>
-        </w:rPr>
+        <w:rPr/>
       </w:pPr>
       <w:r>
         <w:rPr>
@@ -25022,7 +25298,7 @@
         <w:pStyle w:val="BodyText"/>
         <w:bidi w:val="0"/>
         <w:spacing w:lineRule="auto" w:line="360" w:before="0" w:after="0"/>
-        <w:ind w:hanging="0" w:left="0" w:right="121"/>
+        <w:ind w:firstLine="709" w:left="0" w:right="0"/>
         <w:jc w:val="both"/>
         <w:rPr>
           <w:rFonts w:ascii="Times New Roman" w:hAnsi="Times New Roman"/>
@@ -25043,7 +25319,6 @@
           <w:effect w:val="none"/>
           <w:shd w:fill="FFF2CC" w:val="clear"/>
         </w:rPr>
-        <w:tab/>
         <w:t>Para a execução dessa demanda, a coordenadora dispõe no seu Plano de atividades docentes uma carga horária entre 14 e 20 horas para atendimento ao público e para os procedimentos internos da coordenação.</w:t>
       </w:r>
     </w:p>
@@ -25076,8 +25351,8 @@
           <w:rFonts w:ascii="Times New Roman" w:hAnsi="Times New Roman"/>
         </w:rPr>
       </w:pPr>
-      <w:bookmarkStart w:id="96" w:name="__RefHeading___Toc2979_724336694"/>
-      <w:bookmarkEnd w:id="96"/>
+      <w:bookmarkStart w:id="94" w:name="__RefHeading___Toc2979_724336694"/>
+      <w:bookmarkEnd w:id="94"/>
       <w:r>
         <w:rPr>
           <w:rFonts w:ascii="Times New Roman" w:hAnsi="Times New Roman"/>
@@ -25766,8 +26041,8 @@
           <w:rFonts w:ascii="Times New Roman" w:hAnsi="Times New Roman"/>
         </w:rPr>
       </w:pPr>
-      <w:bookmarkStart w:id="97" w:name="__RefHeading___Toc2981_724336694"/>
-      <w:bookmarkEnd w:id="97"/>
+      <w:bookmarkStart w:id="95" w:name="__RefHeading___Toc2981_724336694"/>
+      <w:bookmarkEnd w:id="95"/>
       <w:r>
         <w:rPr>
           <w:rFonts w:ascii="Times New Roman" w:hAnsi="Times New Roman"/>
@@ -25852,8 +26127,8 @@
           <w:rFonts w:ascii="Times New Roman" w:hAnsi="Times New Roman"/>
         </w:rPr>
       </w:pPr>
-      <w:bookmarkStart w:id="98" w:name="__RefHeading___Toc2983_724336694"/>
-      <w:bookmarkEnd w:id="98"/>
+      <w:bookmarkStart w:id="96" w:name="__RefHeading___Toc2983_724336694"/>
+      <w:bookmarkEnd w:id="96"/>
       <w:r>
         <w:rPr>
           <w:rFonts w:ascii="Times New Roman" w:hAnsi="Times New Roman"/>
@@ -25885,14 +26160,14 @@
         <w:pStyle w:val="BodyText"/>
         <w:bidi w:val="0"/>
         <w:spacing w:lineRule="auto" w:line="360" w:before="0" w:after="0"/>
-        <w:ind w:hanging="0" w:left="0" w:right="121"/>
+        <w:ind w:firstLine="709" w:left="0" w:right="0"/>
         <w:jc w:val="both"/>
         <w:rPr>
           <w:rFonts w:ascii="Times New Roman" w:hAnsi="Times New Roman"/>
         </w:rPr>
       </w:pPr>
-      <w:bookmarkStart w:id="99" w:name="docs-internal-guid-0b707fbe-7fff-99ad-37"/>
-      <w:bookmarkEnd w:id="99"/>
+      <w:bookmarkStart w:id="97" w:name="docs-internal-guid-0b707fbe-7fff-99ad-37"/>
+      <w:bookmarkEnd w:id="97"/>
       <w:r>
         <w:rPr>
           <w:b w:val="false"/>
@@ -26633,8 +26908,8 @@
           <w:rFonts w:ascii="Times New Roman" w:hAnsi="Times New Roman"/>
         </w:rPr>
       </w:pPr>
-      <w:bookmarkStart w:id="100" w:name="__RefHeading___Toc2985_724336694"/>
-      <w:bookmarkEnd w:id="100"/>
+      <w:bookmarkStart w:id="98" w:name="__RefHeading___Toc2985_724336694"/>
+      <w:bookmarkEnd w:id="98"/>
       <w:r>
         <w:rPr>
           <w:rFonts w:ascii="Times New Roman" w:hAnsi="Times New Roman"/>
@@ -27313,8 +27588,8 @@
           <w:rFonts w:ascii="Times New Roman" w:hAnsi="Times New Roman"/>
         </w:rPr>
       </w:pPr>
-      <w:bookmarkStart w:id="101" w:name="__RefHeading___Toc2987_724336694"/>
-      <w:bookmarkEnd w:id="101"/>
+      <w:bookmarkStart w:id="99" w:name="__RefHeading___Toc2987_724336694"/>
+      <w:bookmarkEnd w:id="99"/>
       <w:r>
         <w:rPr>
           <w:rFonts w:ascii="Times New Roman" w:hAnsi="Times New Roman"/>
@@ -27399,8 +27674,8 @@
           <w:rFonts w:ascii="Times New Roman" w:hAnsi="Times New Roman"/>
         </w:rPr>
       </w:pPr>
-      <w:bookmarkStart w:id="102" w:name="__RefHeading___Toc2989_724336694"/>
-      <w:bookmarkEnd w:id="102"/>
+      <w:bookmarkStart w:id="100" w:name="__RefHeading___Toc2989_724336694"/>
+      <w:bookmarkEnd w:id="100"/>
       <w:r>
         <w:rPr>
           <w:rFonts w:ascii="Times New Roman" w:hAnsi="Times New Roman"/>
@@ -27432,13 +27707,11 @@
         <w:pStyle w:val="BodyText"/>
         <w:bidi w:val="0"/>
         <w:spacing w:lineRule="auto" w:line="360" w:before="0" w:after="0"/>
-        <w:ind w:hanging="0" w:left="0" w:right="121"/>
-        <w:rPr>
-          <w:rFonts w:ascii="Times New Roman" w:hAnsi="Times New Roman"/>
-        </w:rPr>
-      </w:pPr>
-      <w:bookmarkStart w:id="103" w:name="docs-internal-guid-b32a8770-7fff-9117-7c"/>
-      <w:bookmarkEnd w:id="103"/>
+        <w:ind w:firstLine="709" w:left="0" w:right="0"/>
+        <w:rPr/>
+      </w:pPr>
+      <w:bookmarkStart w:id="101" w:name="docs-internal-guid-b32a8770-7fff-9117-7c"/>
+      <w:bookmarkEnd w:id="101"/>
       <w:r>
         <w:rPr>
           <w:b/>
@@ -27480,11 +27753,9 @@
         <w:shd w:val="clear" w:fill="FFFFFF"/>
         <w:bidi w:val="0"/>
         <w:spacing w:lineRule="auto" w:line="360" w:before="0" w:after="0"/>
-        <w:ind w:hanging="0" w:left="0" w:right="121"/>
+        <w:ind w:firstLine="709" w:left="0" w:right="0"/>
         <w:jc w:val="both"/>
-        <w:rPr>
-          <w:rFonts w:ascii="Times New Roman" w:hAnsi="Times New Roman"/>
-        </w:rPr>
+        <w:rPr/>
       </w:pPr>
       <w:r>
         <w:rPr>
@@ -27542,11 +27813,9 @@
         <w:shd w:val="clear" w:fill="FFFFFF"/>
         <w:bidi w:val="0"/>
         <w:spacing w:lineRule="auto" w:line="360" w:before="0" w:after="0"/>
-        <w:ind w:hanging="0" w:left="0" w:right="121"/>
+        <w:ind w:firstLine="709" w:left="0" w:right="0"/>
         <w:jc w:val="both"/>
-        <w:rPr>
-          <w:rFonts w:ascii="Times New Roman" w:hAnsi="Times New Roman"/>
-        </w:rPr>
+        <w:rPr/>
       </w:pPr>
       <w:r>
         <w:rPr>
@@ -27589,11 +27858,9 @@
         <w:shd w:val="clear" w:fill="FFFFFF"/>
         <w:bidi w:val="0"/>
         <w:spacing w:lineRule="auto" w:line="360" w:before="0" w:after="0"/>
-        <w:ind w:hanging="0" w:left="0" w:right="121"/>
+        <w:ind w:firstLine="709" w:left="0" w:right="0"/>
         <w:jc w:val="both"/>
-        <w:rPr>
-          <w:rFonts w:ascii="Times New Roman" w:hAnsi="Times New Roman"/>
-        </w:rPr>
+        <w:rPr/>
       </w:pPr>
       <w:r>
         <w:rPr>
@@ -27636,11 +27903,9 @@
         <w:shd w:val="clear" w:fill="FFFFFF"/>
         <w:bidi w:val="0"/>
         <w:spacing w:lineRule="auto" w:line="360" w:before="0" w:after="0"/>
-        <w:ind w:hanging="0" w:left="0" w:right="121"/>
+        <w:ind w:firstLine="709" w:left="0" w:right="0"/>
         <w:jc w:val="both"/>
-        <w:rPr>
-          <w:rFonts w:ascii="Times New Roman" w:hAnsi="Times New Roman"/>
-        </w:rPr>
+        <w:rPr/>
       </w:pPr>
       <w:r>
         <w:rPr>
@@ -27683,11 +27948,9 @@
         <w:shd w:val="clear" w:fill="FFFFFF"/>
         <w:bidi w:val="0"/>
         <w:spacing w:lineRule="auto" w:line="360" w:before="0" w:after="0"/>
-        <w:ind w:hanging="0" w:left="0" w:right="121"/>
+        <w:ind w:firstLine="709" w:left="0" w:right="0"/>
         <w:jc w:val="both"/>
-        <w:rPr>
-          <w:rFonts w:ascii="Times New Roman" w:hAnsi="Times New Roman"/>
-        </w:rPr>
+        <w:rPr/>
       </w:pPr>
       <w:r>
         <w:rPr>
@@ -27730,11 +27993,9 @@
         <w:shd w:val="clear" w:fill="FFFFFF"/>
         <w:bidi w:val="0"/>
         <w:spacing w:lineRule="auto" w:line="360" w:before="0" w:after="0"/>
-        <w:ind w:hanging="0" w:left="0" w:right="121"/>
+        <w:ind w:firstLine="709" w:left="0" w:right="0"/>
         <w:jc w:val="both"/>
-        <w:rPr>
-          <w:rFonts w:ascii="Times New Roman" w:hAnsi="Times New Roman"/>
-        </w:rPr>
+        <w:rPr/>
       </w:pPr>
       <w:r>
         <w:rPr>
@@ -27760,11 +28021,9 @@
         <w:shd w:val="clear" w:fill="FFFFFF"/>
         <w:bidi w:val="0"/>
         <w:spacing w:lineRule="auto" w:line="360" w:before="0" w:after="0"/>
-        <w:ind w:firstLine="709" w:left="0" w:right="121"/>
+        <w:ind w:firstLine="709" w:left="0" w:right="0"/>
         <w:jc w:val="both"/>
-        <w:rPr>
-          <w:rFonts w:ascii="Times New Roman" w:hAnsi="Times New Roman"/>
-        </w:rPr>
+        <w:rPr/>
       </w:pPr>
       <w:r>
         <w:rPr>
@@ -27839,11 +28098,9 @@
         <w:shd w:val="clear" w:fill="FFFFFF"/>
         <w:bidi w:val="0"/>
         <w:spacing w:lineRule="auto" w:line="360" w:before="0" w:after="0"/>
-        <w:ind w:firstLine="709" w:left="0" w:right="121"/>
+        <w:ind w:firstLine="709" w:left="0" w:right="0"/>
         <w:jc w:val="both"/>
-        <w:rPr>
-          <w:rFonts w:ascii="Times New Roman" w:hAnsi="Times New Roman"/>
-        </w:rPr>
+        <w:rPr/>
       </w:pPr>
       <w:r>
         <w:rPr>
@@ -27910,9 +28167,8 @@
         <w:pStyle w:val="Quadro"/>
         <w:keepNext w:val="true"/>
         <w:spacing w:lineRule="auto" w:line="360"/>
-        <w:rPr>
-          <w:rFonts w:ascii="Times New Roman" w:hAnsi="Times New Roman"/>
-        </w:rPr>
+        <w:jc w:val="both"/>
+        <w:rPr/>
       </w:pPr>
       <w:r>
         <w:rPr>
@@ -30590,8 +30846,8 @@
           <w:rFonts w:ascii="Times New Roman" w:hAnsi="Times New Roman"/>
         </w:rPr>
       </w:pPr>
-      <w:bookmarkStart w:id="104" w:name="__RefHeading___Toc2991_724336694"/>
-      <w:bookmarkEnd w:id="104"/>
+      <w:bookmarkStart w:id="102" w:name="__RefHeading___Toc2991_724336694"/>
+      <w:bookmarkEnd w:id="102"/>
       <w:r>
         <w:rPr>
           <w:rFonts w:ascii="Times New Roman" w:hAnsi="Times New Roman"/>
@@ -30623,14 +30879,10 @@
         <w:pStyle w:val="BodyText"/>
         <w:bidi w:val="0"/>
         <w:spacing w:lineRule="auto" w:line="360" w:before="0" w:after="0"/>
-        <w:ind w:hanging="0" w:left="0" w:right="121"/>
+        <w:ind w:firstLine="709" w:left="0" w:right="0"/>
         <w:jc w:val="both"/>
-        <w:rPr>
-          <w:rFonts w:ascii="Times New Roman" w:hAnsi="Times New Roman"/>
-        </w:rPr>
-      </w:pPr>
-      <w:bookmarkStart w:id="105" w:name="docs-internal-guid-4b63a4ab-7fff-0975-36"/>
-      <w:bookmarkEnd w:id="105"/>
+        <w:rPr/>
+      </w:pPr>
       <w:r>
         <w:rPr>
           <w:b w:val="false"/>
@@ -30646,7 +30898,6 @@
           <w:effect w:val="none"/>
           <w:shd w:fill="FFF2CC" w:val="clear"/>
         </w:rPr>
-        <w:tab/>
         <w:t>Do ponto de vista das instalações físicas, o SINAES observa se os espaços físicos, utilizados no desenvolvimento do curso, atendem adequadamente aos requisitos de quantidade, dimensão, mobiliário, equipamentos, iluminação, limpeza, acústica, ventilação, segurança, conservação e comodidade necessária às atividades acadêmicas. Em termos de infraestrutura, outro aspecto analisado é se a tipologia, quantidade de ambientes/ laboratórios, espaços e equipamentos especificados estão de acordo com o PPC, se funcionam segundo a finalidade a que se destinam e se correspondem adequadamente aos objetivos, diretrizes e finalidades consignados na proposta do curso. </w:t>
       </w:r>
     </w:p>
@@ -30656,11 +30907,9 @@
         <w:shd w:val="clear" w:fill="FFFFFF"/>
         <w:bidi w:val="0"/>
         <w:spacing w:lineRule="auto" w:line="360" w:before="0" w:after="0"/>
-        <w:ind w:firstLine="720" w:left="0" w:right="121"/>
+        <w:ind w:firstLine="709" w:left="0" w:right="0"/>
         <w:jc w:val="both"/>
-        <w:rPr>
-          <w:rFonts w:ascii="Times New Roman" w:hAnsi="Times New Roman"/>
-        </w:rPr>
+        <w:rPr/>
       </w:pPr>
       <w:r>
         <w:rPr>
@@ -32690,8 +32939,8 @@
           <w:rFonts w:ascii="Times New Roman" w:hAnsi="Times New Roman"/>
         </w:rPr>
       </w:pPr>
-      <w:bookmarkStart w:id="106" w:name="__RefHeading___Toc2993_724336694"/>
-      <w:bookmarkEnd w:id="106"/>
+      <w:bookmarkStart w:id="103" w:name="__RefHeading___Toc2993_724336694"/>
+      <w:bookmarkEnd w:id="103"/>
       <w:r>
         <w:rPr>
           <w:rFonts w:ascii="Times New Roman" w:hAnsi="Times New Roman"/>
@@ -32723,14 +32972,14 @@
         <w:pStyle w:val="BodyText"/>
         <w:bidi w:val="0"/>
         <w:spacing w:lineRule="auto" w:line="360" w:before="0" w:after="0"/>
-        <w:ind w:firstLine="720" w:left="0" w:right="121"/>
+        <w:ind w:firstLine="709" w:left="0" w:right="0"/>
         <w:jc w:val="both"/>
         <w:rPr>
           <w:rFonts w:ascii="Times New Roman" w:hAnsi="Times New Roman"/>
         </w:rPr>
       </w:pPr>
-      <w:bookmarkStart w:id="107" w:name="docs-internal-guid-458d0a24-7fff-e929-a5"/>
-      <w:bookmarkEnd w:id="107"/>
+      <w:bookmarkStart w:id="104" w:name="docs-internal-guid-458d0a24-7fff-e929-a5"/>
+      <w:bookmarkEnd w:id="104"/>
       <w:r>
         <w:rPr>
           <w:b w:val="false"/>
@@ -34556,8 +34805,8 @@
           <w:rFonts w:ascii="Times New Roman" w:hAnsi="Times New Roman"/>
         </w:rPr>
       </w:pPr>
-      <w:bookmarkStart w:id="108" w:name="__RefHeading___Toc2995_724336694"/>
-      <w:bookmarkEnd w:id="108"/>
+      <w:bookmarkStart w:id="105" w:name="__RefHeading___Toc2995_724336694"/>
+      <w:bookmarkEnd w:id="105"/>
       <w:r>
         <w:rPr>
           <w:rFonts w:ascii="Times New Roman" w:hAnsi="Times New Roman"/>
@@ -34588,13 +34837,10 @@
       <w:pPr>
         <w:pStyle w:val="BodyText"/>
         <w:spacing w:lineRule="auto" w:line="360"/>
+        <w:ind w:firstLine="709"/>
         <w:jc w:val="both"/>
-        <w:rPr>
-          <w:rFonts w:ascii="Times New Roman" w:hAnsi="Times New Roman"/>
-        </w:rPr>
-      </w:pPr>
-      <w:bookmarkStart w:id="109" w:name="docs-internal-guid-7e083a9e-7fff-3439-45"/>
-      <w:bookmarkEnd w:id="109"/>
+        <w:rPr/>
+      </w:pPr>
       <w:r>
         <w:rPr>
           <w:rFonts w:eastAsia="Noto Serif CJK SC" w:cs="FreeSans"/>
@@ -34610,14 +34856,14 @@
           <w:szCs w:val="24"/>
           <w:u w:val="none"/>
           <w:effect w:val="none"/>
-          <w:shd w:fill="auto" w:val="clear"/>
+          <w:shd w:fill="FFF2CC" w:val="clear"/>
           <w:lang w:val="pt-BR" w:eastAsia="zh-CN" w:bidi="hi-IN"/>
         </w:rPr>
-        <w:tab/>
-      </w:r>
-      <w:r>
-        <w:rPr>
-          <w:rFonts w:eastAsia="Noto Serif CJK SC" w:cs="FreeSans"/>
+        <w:t>Os setores de aprendizagem da formação no campo são espaços pedagógicos fundamentais para a articulação entre teoria e prática no processo formativo dos estudantes. Esses setores possibilitam vivências contextualizadas e a aplicação de saberes voltados à realidade rural e às especificidades da agricultura familiar, da agroecologia e da sustentabilidade. </w:t>
+      </w:r>
+      <w:r>
+        <w:rPr>
+          <w:rFonts w:eastAsia="Noto Serif CJK SC"/>
           <w:b w:val="false"/>
           <w:i w:val="false"/>
           <w:caps w:val="false"/>
@@ -34625,19 +34871,26 @@
           <w:strike w:val="false"/>
           <w:dstrike w:val="false"/>
           <w:color w:val="000000"/>
-          <w:kern w:val="2"/>
           <w:sz w:val="24"/>
           <w:szCs w:val="24"/>
           <w:u w:val="none"/>
           <w:effect w:val="none"/>
           <w:shd w:fill="FFF2CC" w:val="clear"/>
-          <w:lang w:val="pt-BR" w:eastAsia="zh-CN" w:bidi="hi-IN"/>
-        </w:rPr>
-        <w:t>Os setores de aprendizagem da formação no campo são espaços pedagógicos fundamentais para a articulação entre teoria e prática no processo formativo dos estudantes. Esses setores possibilitam vivências contextualizadas e a aplicação de saberes voltados à realidade rural e às especificidades da agricultura familiar, da agroecologia e da sustentabilidade. </w:t>
-      </w:r>
-      <w:r>
-        <w:rPr>
-          <w:rFonts w:eastAsia="Noto Serif CJK SC"/>
+        </w:rPr>
+        <w:t> </w:t>
+      </w:r>
+    </w:p>
+    <w:p>
+      <w:pPr>
+        <w:pStyle w:val="BodyText"/>
+        <w:bidi w:val="0"/>
+        <w:spacing w:lineRule="auto" w:line="360" w:before="0" w:after="0"/>
+        <w:ind w:firstLine="709" w:left="0" w:right="0"/>
+        <w:jc w:val="both"/>
+        <w:rPr/>
+      </w:pPr>
+      <w:r>
+        <w:rPr>
           <w:b w:val="false"/>
           <w:i w:val="false"/>
           <w:caps w:val="false"/>
@@ -34651,19 +34904,17 @@
           <w:effect w:val="none"/>
           <w:shd w:fill="FFF2CC" w:val="clear"/>
         </w:rPr>
-        <w:t> </w:t>
+        <w:t>Deve-se apresentar, neste tópico, como a formação acadêmica se articula com a realidade socioterritorial, cultural, econômica e política das populações do campo, valorizando os saberes locais, a pedagogia da alternância e os princípios da educação contextualizada. Para tanto, é recomendado o uso de tabelas, ou outra ferramenta que possibilite essa ilustração e seu detalhamento ao caracterizar  os espaços que serão utilizados nesta prática, como: comunidades, associações, cooperativas, espaços de produção…</w:t>
       </w:r>
     </w:p>
     <w:p>
       <w:pPr>
         <w:pStyle w:val="BodyText"/>
         <w:bidi w:val="0"/>
-        <w:spacing w:lineRule="auto" w:line="360" w:before="0" w:after="0"/>
-        <w:ind w:hanging="0" w:left="0" w:right="121"/>
+        <w:spacing w:lineRule="auto" w:line="360" w:before="240" w:after="240"/>
+        <w:ind w:firstLine="709" w:left="0" w:right="0"/>
         <w:jc w:val="both"/>
-        <w:rPr>
-          <w:rFonts w:ascii="Times New Roman" w:hAnsi="Times New Roman"/>
-        </w:rPr>
+        <w:rPr/>
       </w:pPr>
       <w:r>
         <w:rPr>
@@ -34680,7 +34931,7 @@
           <w:effect w:val="none"/>
           <w:shd w:fill="FFF2CC" w:val="clear"/>
         </w:rPr>
-        <w:t>Deve-se apresentar, neste tópico, como a formação acadêmica se articula com a realidade socioterritorial, cultural, econômica e política das populações do campo, valorizando os saberes locais, a pedagogia da alternância e os princípios da educação contextualizada. Para tanto, é recomendado o uso de tabelas, ou outra ferramenta que possibilite essa ilustração e seu detalhamento ao caracterizar  os espaços que serão utilizados nesta prática, como: comunidades, associações, cooperativas, espaços de produção…</w:t>
+        <w:t>No âmbito do curso, em detrimento de sua abordagem metodológica, alguns setores de aprendizagem podem incluir:</w:t>
       </w:r>
     </w:p>
     <w:p>
@@ -34688,15 +34939,13 @@
         <w:pStyle w:val="BodyText"/>
         <w:bidi w:val="0"/>
         <w:spacing w:lineRule="auto" w:line="360" w:before="240" w:after="240"/>
-        <w:ind w:hanging="0" w:left="0" w:right="0"/>
+        <w:ind w:firstLine="709" w:left="0" w:right="0"/>
         <w:jc w:val="both"/>
-        <w:rPr>
-          <w:rFonts w:ascii="Times New Roman" w:hAnsi="Times New Roman"/>
-        </w:rPr>
-      </w:pPr>
-      <w:r>
-        <w:rPr>
-          <w:b w:val="false"/>
+        <w:rPr/>
+      </w:pPr>
+      <w:r>
+        <w:rPr>
+          <w:b/>
           <w:i w:val="false"/>
           <w:caps w:val="false"/>
           <w:smallCaps w:val="false"/>
@@ -34709,24 +34958,10 @@
           <w:effect w:val="none"/>
           <w:shd w:fill="FFF2CC" w:val="clear"/>
         </w:rPr>
-        <w:t>No âmbito do curso, em detrimento de sua abordagem metodológica, alguns setores de aprendizagem podem incluir:</w:t>
-      </w:r>
-    </w:p>
-    <w:p>
-      <w:pPr>
-        <w:pStyle w:val="BodyText"/>
-        <w:bidi w:val="0"/>
-        <w:spacing w:lineRule="auto" w:line="360" w:before="240" w:after="240"/>
-        <w:ind w:hanging="0" w:left="0" w:right="0"/>
-        <w:jc w:val="both"/>
-        <w:rPr>
-          <w:rFonts w:ascii="Times New Roman" w:hAnsi="Times New Roman"/>
-        </w:rPr>
-      </w:pPr>
-      <w:r>
-        <w:rPr>
-          <w:b/>
-          <w:i w:val="false"/>
+        <w:t>Unidades de Produção Agrícola e Agroecológica:</w:t>
+      </w:r>
+      <w:r>
+        <w:rPr>
           <w:caps w:val="false"/>
           <w:smallCaps w:val="false"/>
           <w:strike w:val="false"/>
@@ -34738,10 +34973,12 @@
           <w:effect w:val="none"/>
           <w:shd w:fill="FFF2CC" w:val="clear"/>
         </w:rPr>
-        <w:t>Unidades de Produção Agrícola e Agroecológica:</w:t>
-      </w:r>
-      <w:r>
-        <w:rPr>
+        <w:t xml:space="preserve"> </w:t>
+      </w:r>
+      <w:r>
+        <w:rPr>
+          <w:b w:val="false"/>
+          <w:i w:val="false"/>
           <w:caps w:val="false"/>
           <w:smallCaps w:val="false"/>
           <w:strike w:val="false"/>
@@ -34753,11 +34990,21 @@
           <w:effect w:val="none"/>
           <w:shd w:fill="FFF2CC" w:val="clear"/>
         </w:rPr>
-        <w:t xml:space="preserve"> </w:t>
-      </w:r>
-      <w:r>
-        <w:rPr>
-          <w:b w:val="false"/>
+        <w:t>sendo estes, espaços destinados ao cultivo de hortaliças, frutas, plantas medicinais e outras culturas adaptadas ao contexto local, permitindo o desenvolvimento de práticas sustentáveis e integradas ao bioma da região. </w:t>
+      </w:r>
+    </w:p>
+    <w:p>
+      <w:pPr>
+        <w:pStyle w:val="BodyText"/>
+        <w:bidi w:val="0"/>
+        <w:spacing w:lineRule="auto" w:line="360" w:before="240" w:after="240"/>
+        <w:ind w:firstLine="709" w:left="0" w:right="0"/>
+        <w:jc w:val="both"/>
+        <w:rPr/>
+      </w:pPr>
+      <w:r>
+        <w:rPr>
+          <w:b/>
           <w:i w:val="false"/>
           <w:caps w:val="false"/>
           <w:smallCaps w:val="false"/>
@@ -34770,23 +35017,11 @@
           <w:effect w:val="none"/>
           <w:shd w:fill="FFF2CC" w:val="clear"/>
         </w:rPr>
-        <w:t>sendo estes, espaços destinados ao cultivo de hortaliças, frutas, plantas medicinais e outras culturas adaptadas ao contexto local, permitindo o desenvolvimento de práticas sustentáveis e integradas ao bioma da região. </w:t>
-      </w:r>
-    </w:p>
-    <w:p>
-      <w:pPr>
-        <w:pStyle w:val="BodyText"/>
-        <w:bidi w:val="0"/>
-        <w:spacing w:lineRule="auto" w:line="360" w:before="240" w:after="240"/>
-        <w:ind w:hanging="0" w:left="0" w:right="0"/>
-        <w:jc w:val="both"/>
-        <w:rPr>
-          <w:rFonts w:ascii="Times New Roman" w:hAnsi="Times New Roman"/>
-        </w:rPr>
-      </w:pPr>
-      <w:r>
-        <w:rPr>
-          <w:b/>
+        <w:t>Laboratórios de Ciências Agrárias e Naturais</w:t>
+      </w:r>
+      <w:r>
+        <w:rPr>
+          <w:b w:val="false"/>
           <w:i w:val="false"/>
           <w:caps w:val="false"/>
           <w:smallCaps w:val="false"/>
@@ -34799,11 +35034,21 @@
           <w:effect w:val="none"/>
           <w:shd w:fill="FFF2CC" w:val="clear"/>
         </w:rPr>
-        <w:t>Laboratórios de Ciências Agrárias e Naturais</w:t>
-      </w:r>
-      <w:r>
-        <w:rPr>
-          <w:b w:val="false"/>
+        <w:t>: são estes os ambientes equipados para a realização de experimentos nas áreas de solos, sementes, microbiologia, fitotecnia, irrigação, entre outros, visando à compreensão científica das práticas agrícolas.</w:t>
+      </w:r>
+    </w:p>
+    <w:p>
+      <w:pPr>
+        <w:pStyle w:val="BodyText"/>
+        <w:bidi w:val="0"/>
+        <w:spacing w:lineRule="auto" w:line="360" w:before="240" w:after="240"/>
+        <w:ind w:firstLine="709" w:left="0" w:right="0"/>
+        <w:jc w:val="both"/>
+        <w:rPr/>
+      </w:pPr>
+      <w:r>
+        <w:rPr>
+          <w:b/>
           <w:i w:val="false"/>
           <w:caps w:val="false"/>
           <w:smallCaps w:val="false"/>
@@ -34816,23 +35061,11 @@
           <w:effect w:val="none"/>
           <w:shd w:fill="FFF2CC" w:val="clear"/>
         </w:rPr>
-        <w:t>: são estes os ambientes equipados para a realização de experimentos nas áreas de solos, sementes, microbiologia, fitotecnia, irrigação, entre outros, visando à compreensão científica das práticas agrícolas.</w:t>
-      </w:r>
-    </w:p>
-    <w:p>
-      <w:pPr>
-        <w:pStyle w:val="BodyText"/>
-        <w:bidi w:val="0"/>
-        <w:spacing w:lineRule="auto" w:line="360" w:before="240" w:after="240"/>
-        <w:ind w:hanging="0" w:left="0" w:right="0"/>
-        <w:jc w:val="both"/>
-        <w:rPr>
-          <w:rFonts w:ascii="Times New Roman" w:hAnsi="Times New Roman"/>
-        </w:rPr>
-      </w:pPr>
-      <w:r>
-        <w:rPr>
-          <w:b/>
+        <w:t>Setor de Zootecnia e Produção Animal</w:t>
+      </w:r>
+      <w:r>
+        <w:rPr>
+          <w:b w:val="false"/>
           <w:i w:val="false"/>
           <w:caps w:val="false"/>
           <w:smallCaps w:val="false"/>
@@ -34845,11 +35078,21 @@
           <w:effect w:val="none"/>
           <w:shd w:fill="FFF2CC" w:val="clear"/>
         </w:rPr>
-        <w:t>Setor de Zootecnia e Produção Animal</w:t>
-      </w:r>
-      <w:r>
-        <w:rPr>
-          <w:b w:val="false"/>
+        <w:t>: destinado a  atividades relacionadas ao manejo de animais de pequeno e médio porte, práticas de alimentação, sanidade e melhoramento genético. </w:t>
+      </w:r>
+    </w:p>
+    <w:p>
+      <w:pPr>
+        <w:pStyle w:val="BodyText"/>
+        <w:bidi w:val="0"/>
+        <w:spacing w:lineRule="auto" w:line="360" w:before="240" w:after="240"/>
+        <w:ind w:firstLine="709" w:left="0" w:right="0"/>
+        <w:jc w:val="both"/>
+        <w:rPr/>
+      </w:pPr>
+      <w:r>
+        <w:rPr>
+          <w:b/>
           <w:i w:val="false"/>
           <w:caps w:val="false"/>
           <w:smallCaps w:val="false"/>
@@ -34862,23 +35105,11 @@
           <w:effect w:val="none"/>
           <w:shd w:fill="FFF2CC" w:val="clear"/>
         </w:rPr>
-        <w:t>: destinado a  atividades relacionadas ao manejo de animais de pequeno e médio porte, práticas de alimentação, sanidade e melhoramento genético. </w:t>
-      </w:r>
-    </w:p>
-    <w:p>
-      <w:pPr>
-        <w:pStyle w:val="BodyText"/>
-        <w:bidi w:val="0"/>
-        <w:spacing w:lineRule="auto" w:line="360" w:before="240" w:after="240"/>
-        <w:ind w:hanging="0" w:left="0" w:right="0"/>
-        <w:jc w:val="both"/>
-        <w:rPr>
-          <w:rFonts w:ascii="Times New Roman" w:hAnsi="Times New Roman"/>
-        </w:rPr>
-      </w:pPr>
-      <w:r>
-        <w:rPr>
-          <w:b/>
+        <w:t>Espaços de Convivência e Cultura Camponesa</w:t>
+      </w:r>
+      <w:r>
+        <w:rPr>
+          <w:b w:val="false"/>
           <w:i w:val="false"/>
           <w:caps w:val="false"/>
           <w:smallCaps w:val="false"/>
@@ -34891,24 +35122,7 @@
           <w:effect w:val="none"/>
           <w:shd w:fill="FFF2CC" w:val="clear"/>
         </w:rPr>
-        <w:t>Espaços de Convivência e Cultura Camponesa</w:t>
-      </w:r>
-      <w:r>
-        <w:rPr>
-          <w:b w:val="false"/>
-          <w:i w:val="false"/>
-          <w:caps w:val="false"/>
-          <w:smallCaps w:val="false"/>
-          <w:strike w:val="false"/>
-          <w:dstrike w:val="false"/>
-          <w:color w:val="000000"/>
-          <w:sz w:val="24"/>
-          <w:szCs w:val="24"/>
-          <w:u w:val="none"/>
-          <w:effect w:val="none"/>
-          <w:shd w:fill="FFF2CC" w:val="clear"/>
-        </w:rPr>
-        <w:t>:  espaço que viabiliza o         fortalecimento da identidade do campo, à valorização dos saberes tradicionais e à promoção de práticas educativas que integram arte, cultura, trabalho e vida comunitária.</w:t>
+        <w:t>:  espaço que viabiliza o  fortalecimento da identidade do campo, à valorização dos saberes tradicionais e à promoção de práticas educativas que integram arte, cultura, trabalho e vida comunitária.</w:t>
       </w:r>
     </w:p>
     <w:p>
@@ -34916,11 +35130,9 @@
         <w:pStyle w:val="BodyText"/>
         <w:bidi w:val="0"/>
         <w:spacing w:lineRule="auto" w:line="360" w:before="240" w:after="240"/>
-        <w:ind w:hanging="0" w:left="0" w:right="0"/>
+        <w:ind w:firstLine="709" w:left="0" w:right="0"/>
         <w:jc w:val="both"/>
-        <w:rPr>
-          <w:rFonts w:ascii="Times New Roman" w:hAnsi="Times New Roman"/>
-        </w:rPr>
+        <w:rPr/>
       </w:pPr>
       <w:r>
         <w:rPr>
@@ -35011,8 +35223,8 @@
           <w:rFonts w:ascii="Times New Roman" w:hAnsi="Times New Roman"/>
         </w:rPr>
       </w:pPr>
-      <w:bookmarkStart w:id="110" w:name="__RefHeading___Toc2997_724336694"/>
-      <w:bookmarkEnd w:id="110"/>
+      <w:bookmarkStart w:id="106" w:name="__RefHeading___Toc2997_724336694"/>
+      <w:bookmarkEnd w:id="106"/>
       <w:r>
         <w:rPr>
           <w:rFonts w:ascii="Times New Roman" w:hAnsi="Times New Roman"/>
@@ -35044,14 +35256,10 @@
         <w:pStyle w:val="BodyText"/>
         <w:bidi w:val="0"/>
         <w:spacing w:lineRule="auto" w:line="360" w:before="0" w:after="0"/>
-        <w:ind w:hanging="0" w:left="0" w:right="121"/>
+        <w:ind w:firstLine="709" w:left="0" w:right="0"/>
         <w:jc w:val="both"/>
-        <w:rPr>
-          <w:rFonts w:ascii="Times New Roman" w:hAnsi="Times New Roman"/>
-        </w:rPr>
-      </w:pPr>
-      <w:bookmarkStart w:id="111" w:name="docs-internal-guid-8d680f4f-7fff-fc40-ad"/>
-      <w:bookmarkEnd w:id="111"/>
+        <w:rPr/>
+      </w:pPr>
       <w:r>
         <w:rPr>
           <w:b w:val="false"/>
@@ -35065,10 +35273,20 @@
           <w:szCs w:val="24"/>
           <w:u w:val="none"/>
           <w:effect w:val="none"/>
-          <w:shd w:fill="auto" w:val="clear"/>
-        </w:rPr>
-        <w:tab/>
-      </w:r>
+          <w:shd w:fill="FFF2CC" w:val="clear"/>
+        </w:rPr>
+        <w:t>Do ponto de vista do acervo, o SINAES recomenda que seja indicada uma bibliografia básica e uma bibliografia complementar. A bibliografia básica deve atender aos programas de todos os componentes curriculares/ períodos previstos no curso, na proporção de um exemplar para quatro (4) estudantes previstos para cada turma, referentes aos títulos indicados na bibliografia básica (mínimo de três (3) títulos), e estar atualizada, informatizada e tombada no patrimônio da Instituição. Quanto à bibliografia complementar, deve também atender às indicações bibliográficas complementares (mínimo de 5 bibliografias) referidas nos programas dos componentes curriculares. </w:t>
+      </w:r>
+    </w:p>
+    <w:p>
+      <w:pPr>
+        <w:pStyle w:val="BodyText"/>
+        <w:bidi w:val="0"/>
+        <w:spacing w:lineRule="auto" w:line="360" w:before="0" w:after="0"/>
+        <w:ind w:firstLine="709" w:left="0" w:right="0"/>
+        <w:jc w:val="both"/>
+        <w:rPr/>
+      </w:pPr>
       <w:r>
         <w:rPr>
           <w:b w:val="false"/>
@@ -35084,7 +35302,7 @@
           <w:effect w:val="none"/>
           <w:shd w:fill="FFF2CC" w:val="clear"/>
         </w:rPr>
-        <w:t>Do ponto de vista do acervo, o SINAES recomenda que seja indicada uma bibliografia básica e uma bibliografia complementar. A bibliografia básica deve atender aos programas de todos os componentes curriculares/ períodos previstos no curso, na proporção de um exemplar para quatro (4) estudantes previstos para cada turma, referentes aos títulos indicados na bibliografia básica (mínimo de três (3) títulos), e estar atualizada, informatizada e tombada no patrimônio da Instituição. Quanto à bibliografia complementar, deve também atender às indicações bibliográficas complementares (mínimo de 5 bibliografias) referidas nos programas dos componentes curriculares. </w:t>
+        <w:t>Periódicos especializados, indexados e correntes, revistas e acervo multimídia também são analisados no âmbito dos instrumentos do SINAES. Ressalte-se que assinaturas de periódicos especializados, indexados e correntes, sob a forma impressa ou informatizada, devem estar atualizados em sua maioria nos últimos três anos e abranger as principais áreas temáticas do curso, de modo a atender adequadamente aos programas de todos os componentes curriculares e à demanda do conjunto dos estudantes matriculados. </w:t>
       </w:r>
     </w:p>
     <w:p>
@@ -35092,40 +35310,9 @@
         <w:pStyle w:val="BodyText"/>
         <w:bidi w:val="0"/>
         <w:spacing w:lineRule="auto" w:line="360" w:before="0" w:after="0"/>
-        <w:ind w:hanging="0" w:left="0" w:right="121"/>
+        <w:ind w:firstLine="709" w:left="0" w:right="0"/>
         <w:jc w:val="both"/>
-        <w:rPr>
-          <w:rFonts w:ascii="Times New Roman" w:hAnsi="Times New Roman"/>
-        </w:rPr>
-      </w:pPr>
-      <w:r>
-        <w:rPr>
-          <w:b w:val="false"/>
-          <w:i w:val="false"/>
-          <w:caps w:val="false"/>
-          <w:smallCaps w:val="false"/>
-          <w:strike w:val="false"/>
-          <w:dstrike w:val="false"/>
-          <w:color w:val="000000"/>
-          <w:sz w:val="24"/>
-          <w:szCs w:val="24"/>
-          <w:u w:val="none"/>
-          <w:effect w:val="none"/>
-          <w:shd w:fill="FFF2CC" w:val="clear"/>
-        </w:rPr>
-        <w:t>Periódicos especializados, indexados e correntes, revistas e acervo multimídia também são analisados no âmbito dos instrumentos do SINAES. Ressalte-se que assinaturas de periódicos especializados, indexados e correntes, sob a forma impressa ou informatizada, devem estar atualizados em sua maioria nos últimos três anos e abranger as principais áreas temáticas do curso, de modo a atender adequadamente aos programas de todos os componentes curriculares e à demanda do conjunto dos estudantes matriculados. </w:t>
-      </w:r>
-    </w:p>
-    <w:p>
-      <w:pPr>
-        <w:pStyle w:val="BodyText"/>
-        <w:bidi w:val="0"/>
-        <w:spacing w:lineRule="auto" w:line="360" w:before="0" w:after="0"/>
-        <w:ind w:hanging="0" w:left="0" w:right="121"/>
-        <w:jc w:val="both"/>
-        <w:rPr>
-          <w:rFonts w:ascii="Times New Roman" w:hAnsi="Times New Roman"/>
-        </w:rPr>
+        <w:rPr/>
       </w:pPr>
       <w:r>
         <w:rPr>
@@ -35174,8 +35361,8 @@
           <w:rFonts w:ascii="Times New Roman" w:hAnsi="Times New Roman"/>
         </w:rPr>
       </w:pPr>
-      <w:bookmarkStart w:id="112" w:name="__RefHeading___Toc2999_724336694"/>
-      <w:bookmarkEnd w:id="112"/>
+      <w:bookmarkStart w:id="107" w:name="__RefHeading___Toc2999_724336694"/>
+      <w:bookmarkEnd w:id="107"/>
       <w:r>
         <w:rPr>
           <w:rFonts w:ascii="Times New Roman" w:hAnsi="Times New Roman"/>
@@ -36419,27 +36606,10 @@
         <w:pStyle w:val="BodyText"/>
         <w:bidi w:val="0"/>
         <w:spacing w:lineRule="auto" w:line="360" w:before="0" w:after="0"/>
-        <w:ind w:hanging="0" w:left="0" w:right="121"/>
+        <w:ind w:firstLine="709" w:left="0" w:right="0"/>
         <w:jc w:val="both"/>
         <w:rPr/>
       </w:pPr>
-      <w:r>
-        <w:rPr>
-          <w:b w:val="false"/>
-          <w:i w:val="false"/>
-          <w:caps w:val="false"/>
-          <w:smallCaps w:val="false"/>
-          <w:strike w:val="false"/>
-          <w:dstrike w:val="false"/>
-          <w:color w:val="000000"/>
-          <w:sz w:val="24"/>
-          <w:szCs w:val="24"/>
-          <w:u w:val="none"/>
-          <w:effect w:val="none"/>
-          <w:shd w:fill="auto" w:val="clear"/>
-        </w:rPr>
-        <w:tab/>
-      </w:r>
       <w:r>
         <w:rPr>
           <w:b w:val="false"/>
@@ -36507,8 +36677,8 @@
           <w:rFonts w:ascii="Times New Roman" w:hAnsi="Times New Roman"/>
         </w:rPr>
       </w:pPr>
-      <w:bookmarkStart w:id="113" w:name="__RefHeading___Toc3001_724336694"/>
-      <w:bookmarkEnd w:id="113"/>
+      <w:bookmarkStart w:id="108" w:name="__RefHeading___Toc3001_724336694"/>
+      <w:bookmarkEnd w:id="108"/>
       <w:r>
         <w:rPr>
           <w:rFonts w:ascii="Times New Roman" w:hAnsi="Times New Roman"/>
@@ -37312,8 +37482,8 @@
           <w:rFonts w:ascii="Times New Roman" w:hAnsi="Times New Roman"/>
         </w:rPr>
       </w:pPr>
-      <w:bookmarkStart w:id="114" w:name="__RefHeading___Toc3003_724336694"/>
-      <w:bookmarkEnd w:id="114"/>
+      <w:bookmarkStart w:id="109" w:name="__RefHeading___Toc3003_724336694"/>
+      <w:bookmarkEnd w:id="109"/>
       <w:r>
         <w:rPr>
           <w:rFonts w:ascii="Times New Roman" w:hAnsi="Times New Roman"/>
@@ -38156,8 +38326,8 @@
           <w:rFonts w:ascii="Times New Roman" w:hAnsi="Times New Roman"/>
         </w:rPr>
       </w:pPr>
-      <w:bookmarkStart w:id="115" w:name="__RefHeading___Toc3005_724336694"/>
-      <w:bookmarkEnd w:id="115"/>
+      <w:bookmarkStart w:id="110" w:name="__RefHeading___Toc3005_724336694"/>
+      <w:bookmarkEnd w:id="110"/>
       <w:r>
         <w:rPr>
           <w:rFonts w:ascii="Times New Roman" w:hAnsi="Times New Roman"/>
@@ -39305,8 +39475,8 @@
           <w:rFonts w:ascii="Times New Roman" w:hAnsi="Times New Roman"/>
         </w:rPr>
       </w:pPr>
-      <w:bookmarkStart w:id="116" w:name="__RefHeading___Toc3007_724336694"/>
-      <w:bookmarkEnd w:id="116"/>
+      <w:bookmarkStart w:id="111" w:name="__RefHeading___Toc3007_724336694"/>
+      <w:bookmarkEnd w:id="111"/>
       <w:r>
         <w:rPr>
           <w:rFonts w:ascii="Times New Roman" w:hAnsi="Times New Roman"/>
@@ -39338,31 +39508,12 @@
         <w:pStyle w:val="BodyText"/>
         <w:bidi w:val="0"/>
         <w:spacing w:lineRule="auto" w:line="360" w:before="0" w:after="0"/>
-        <w:ind w:hanging="0" w:left="0" w:right="121"/>
+        <w:ind w:firstLine="709" w:left="0" w:right="0"/>
         <w:jc w:val="both"/>
         <w:rPr>
           <w:rFonts w:ascii="Times New Roman" w:hAnsi="Times New Roman"/>
         </w:rPr>
       </w:pPr>
-      <w:bookmarkStart w:id="117" w:name="docs-internal-guid-e289bde1-7fff-aaaa-77"/>
-      <w:bookmarkEnd w:id="117"/>
-      <w:r>
-        <w:rPr>
-          <w:b w:val="false"/>
-          <w:i w:val="false"/>
-          <w:caps w:val="false"/>
-          <w:smallCaps w:val="false"/>
-          <w:strike w:val="false"/>
-          <w:dstrike w:val="false"/>
-          <w:color w:val="000000"/>
-          <w:sz w:val="24"/>
-          <w:szCs w:val="24"/>
-          <w:u w:val="none"/>
-          <w:effect w:val="none"/>
-          <w:shd w:fill="auto" w:val="clear"/>
-        </w:rPr>
-        <w:tab/>
-      </w:r>
       <w:r>
         <w:rPr>
           <w:b w:val="false"/>
@@ -39411,8 +39562,8 @@
           <w:rFonts w:ascii="Times New Roman" w:hAnsi="Times New Roman"/>
         </w:rPr>
       </w:pPr>
-      <w:bookmarkStart w:id="118" w:name="__RefHeading___Toc3009_724336694"/>
-      <w:bookmarkEnd w:id="118"/>
+      <w:bookmarkStart w:id="112" w:name="__RefHeading___Toc3009_724336694"/>
+      <w:bookmarkEnd w:id="112"/>
       <w:r>
         <w:rPr>
           <w:rFonts w:ascii="Times New Roman" w:hAnsi="Times New Roman"/>
@@ -39449,14 +39600,10 @@
         <w:pStyle w:val="BodyText"/>
         <w:bidi w:val="0"/>
         <w:spacing w:lineRule="auto" w:line="360" w:before="0" w:after="0"/>
-        <w:ind w:hanging="0" w:left="0" w:right="121"/>
+        <w:ind w:firstLine="709" w:left="0" w:right="0"/>
         <w:jc w:val="both"/>
-        <w:rPr>
-          <w:rFonts w:ascii="Times New Roman" w:hAnsi="Times New Roman"/>
-        </w:rPr>
-      </w:pPr>
-      <w:bookmarkStart w:id="119" w:name="docs-internal-guid-c178bbc7-7fff-25d2-4c"/>
-      <w:bookmarkEnd w:id="119"/>
+        <w:rPr/>
+      </w:pPr>
       <w:r>
         <w:rPr>
           <w:b w:val="false"/>
@@ -39470,10 +39617,41 @@
           <w:szCs w:val="24"/>
           <w:u w:val="none"/>
           <w:effect w:val="none"/>
-          <w:shd w:fill="auto" w:val="clear"/>
-        </w:rPr>
-        <w:tab/>
-      </w:r>
+          <w:shd w:fill="FFF2CC" w:val="clear"/>
+        </w:rPr>
+        <w:t>Trata-se de documentos da própria autoria da equipe de elaboração do PPC que podem completar as informações do texto sem prejuízo da unidade e coerência do corpo do texto. Assim, podem ser incluídos itens que sejam considerados importantes para o PPC, como por exemplo, o Programa dos 26 componentes curriculares, o currículo resumido dos docentes, matrizes de equivalência, projetos de laboratórios específicos, além de outros itens que sejam considerados importantes. Apresentam-se nos trabalhos da seguinte forma: </w:t>
+      </w:r>
+    </w:p>
+    <w:p>
+      <w:pPr>
+        <w:pStyle w:val="BodyText"/>
+        <w:spacing w:lineRule="auto" w:line="360"/>
+        <w:ind w:firstLine="709" w:right="0"/>
+        <w:rPr>
+          <w:rFonts w:ascii="Times New Roman" w:hAnsi="Times New Roman"/>
+          <w:sz w:val="24"/>
+          <w:szCs w:val="24"/>
+          <w:highlight w:val="none"/>
+          <w:shd w:fill="FFF2CC" w:val="clear"/>
+        </w:rPr>
+      </w:pPr>
+      <w:r>
+        <w:rPr>
+          <w:sz w:val="24"/>
+          <w:szCs w:val="24"/>
+          <w:shd w:fill="FFF2CC" w:val="clear"/>
+        </w:rPr>
+      </w:r>
+    </w:p>
+    <w:p>
+      <w:pPr>
+        <w:pStyle w:val="BodyText"/>
+        <w:bidi w:val="0"/>
+        <w:spacing w:lineRule="auto" w:line="360" w:before="0" w:after="0"/>
+        <w:ind w:firstLine="709" w:left="0" w:right="0"/>
+        <w:jc w:val="both"/>
+        <w:rPr/>
+      </w:pPr>
       <w:r>
         <w:rPr>
           <w:b w:val="false"/>
@@ -39489,27 +39667,7 @@
           <w:effect w:val="none"/>
           <w:shd w:fill="FFF2CC" w:val="clear"/>
         </w:rPr>
-        <w:t>Trata-se de documentos da própria autoria da equipe de elaboração do PPC que podem completar as informações do texto sem prejuízo da unidade e coerência do corpo do texto. Assim, podem ser incluídos itens que sejam considerados importantes para o PPC, como por exemplo, o Programa dos 26 componentes curriculares, o currículo resumido dos docentes, matrizes de equivalência, projetos de laboratórios específicos, além de outros itens que sejam considerados importantes. Apresentam-se nos trabalhos da seguinte forma: </w:t>
-      </w:r>
-    </w:p>
-    <w:p>
-      <w:pPr>
-        <w:pStyle w:val="BodyText"/>
-        <w:spacing w:lineRule="auto" w:line="360"/>
-        <w:rPr>
-          <w:rFonts w:ascii="Times New Roman" w:hAnsi="Times New Roman"/>
-          <w:sz w:val="24"/>
-          <w:szCs w:val="24"/>
-          <w:highlight w:val="none"/>
-          <w:shd w:fill="FFF2CC" w:val="clear"/>
-        </w:rPr>
-      </w:pPr>
-      <w:r>
-        <w:rPr>
-          <w:sz w:val="24"/>
-          <w:szCs w:val="24"/>
-          <w:shd w:fill="FFF2CC" w:val="clear"/>
-        </w:rPr>
+        <w:t>Programa dos Componentes Curriculares</w:t>
       </w:r>
     </w:p>
     <w:p>
@@ -39517,11 +39675,9 @@
         <w:pStyle w:val="BodyText"/>
         <w:bidi w:val="0"/>
         <w:spacing w:lineRule="auto" w:line="360" w:before="0" w:after="0"/>
-        <w:ind w:hanging="0" w:left="0" w:right="121"/>
+        <w:ind w:firstLine="709" w:left="0" w:right="0"/>
         <w:jc w:val="both"/>
-        <w:rPr>
-          <w:rFonts w:ascii="Times New Roman" w:hAnsi="Times New Roman"/>
-        </w:rPr>
+        <w:rPr/>
       </w:pPr>
       <w:r>
         <w:rPr>
@@ -39538,36 +39694,6 @@
           <w:effect w:val="none"/>
           <w:shd w:fill="FFF2CC" w:val="clear"/>
         </w:rPr>
-        <w:t>Programa dos Componentes Curriculares</w:t>
-      </w:r>
-    </w:p>
-    <w:p>
-      <w:pPr>
-        <w:pStyle w:val="BodyText"/>
-        <w:bidi w:val="0"/>
-        <w:spacing w:lineRule="auto" w:line="360" w:before="0" w:after="0"/>
-        <w:ind w:hanging="0" w:left="0" w:right="121"/>
-        <w:jc w:val="both"/>
-        <w:rPr>
-          <w:rFonts w:ascii="Times New Roman" w:hAnsi="Times New Roman"/>
-        </w:rPr>
-      </w:pPr>
-      <w:r>
-        <w:rPr>
-          <w:b w:val="false"/>
-          <w:i w:val="false"/>
-          <w:caps w:val="false"/>
-          <w:smallCaps w:val="false"/>
-          <w:strike w:val="false"/>
-          <w:dstrike w:val="false"/>
-          <w:color w:val="000000"/>
-          <w:sz w:val="24"/>
-          <w:szCs w:val="24"/>
-          <w:u w:val="none"/>
-          <w:effect w:val="none"/>
-          <w:shd w:fill="FFF2CC" w:val="clear"/>
-        </w:rPr>
-        <w:tab/>
         <w:t>É obrigatória a inclusão dos Programas de todos os componentes curriculares com bibliografia básica (três títulos, no mínimo) e complementar (cinco títulos, no mínimo). O plano pedagógico do curso também deve apresentar uma adequada coerência dos conteúdos curriculares com as Diretrizes Curriculares Nacionais para a Educação Profissional Técnica de Nível Médio (Resolução N. 06/2012). O Programa de cada componente será elaborado em formulário sob a forma de Plano de Ensino, preenchidos em formulário instituído pela Pró-Reitoria de Ensino – PRODEN, conforme segue:</w:t>
       </w:r>
     </w:p>
@@ -39596,21 +39722,22 @@
           <w:numId w:val="0"/>
         </w:numPr>
         <w:spacing w:lineRule="auto" w:line="360"/>
-        <w:ind w:hanging="0" w:left="720"/>
-        <w:rPr>
-          <w:rFonts w:ascii="Times New Roman" w:hAnsi="Times New Roman"/>
-        </w:rPr>
-      </w:pPr>
-      <w:bookmarkStart w:id="120" w:name="__RefHeading___Toc3011_724336694"/>
-      <w:bookmarkStart w:id="121" w:name="docs-internal-guid-cb6f7ca0-7fff-8df8-8d"/>
-      <w:bookmarkEnd w:id="120"/>
-      <w:bookmarkEnd w:id="121"/>
-      <w:r>
-        <w:rPr>
-          <w:rFonts w:ascii="Times New Roman" w:hAnsi="Times New Roman"/>
-          <w:sz w:val="24"/>
-          <w:szCs w:val="24"/>
-        </w:rPr>
+        <w:ind w:hanging="0" w:left="0"/>
+        <w:rPr>
+          <w:rFonts w:ascii="Times New Roman" w:hAnsi="Times New Roman"/>
+        </w:rPr>
+      </w:pPr>
+      <w:bookmarkStart w:id="113" w:name="__RefHeading___Toc3011_724336694"/>
+      <w:bookmarkStart w:id="114" w:name="docs-internal-guid-cb6f7ca0-7fff-8df8-8d"/>
+      <w:bookmarkEnd w:id="113"/>
+      <w:bookmarkEnd w:id="114"/>
+      <w:r>
+        <w:rPr>
+          <w:rFonts w:ascii="Times New Roman" w:hAnsi="Times New Roman"/>
+          <w:sz w:val="24"/>
+          <w:szCs w:val="24"/>
+        </w:rPr>
+        <w:tab/>
         <w:t>ANEXOS</w:t>
       </w:r>
     </w:p>
@@ -39774,11 +39901,9 @@
         <w:pStyle w:val="BodyText"/>
         <w:bidi w:val="0"/>
         <w:spacing w:lineRule="auto" w:line="360" w:before="0" w:after="0"/>
-        <w:ind w:firstLine="709" w:left="0" w:right="121"/>
+        <w:ind w:firstLine="709" w:left="0" w:right="0"/>
         <w:jc w:val="both"/>
-        <w:rPr>
-          <w:rFonts w:ascii="Times New Roman" w:hAnsi="Times New Roman"/>
-        </w:rPr>
+        <w:rPr/>
       </w:pPr>
       <w:r>
         <w:rPr>
@@ -40740,7 +40865,7 @@
     <w:pPr>
       <w:widowControl/>
       <w:suppressAutoHyphens w:val="true"/>
-      <w:overflowPunct w:val="false"/>
+      <w:overflowPunct w:val="true"/>
       <w:bidi w:val="0"/>
       <w:spacing w:lineRule="auto" w:line="360" w:before="0" w:after="0"/>
       <w:ind w:firstLine="709"/>
@@ -40927,8 +41052,8 @@
     <w:qFormat/>
     <w:rPr/>
   </w:style>
-  <w:style w:type="character" w:styleId="Bullets">
-    <w:name w:val="Bullets"/>
+  <w:style w:type="character" w:styleId="Bulletsuser">
+    <w:name w:val="Bullets (user)"/>
     <w:qFormat/>
     <w:rPr>
       <w:rFonts w:ascii="OpenSymbol" w:hAnsi="OpenSymbol" w:eastAsia="OpenSymbol" w:cs="OpenSymbol"/>
@@ -40953,7 +41078,7 @@
     <w:name w:val="Body Text"/>
     <w:basedOn w:val="Normal"/>
     <w:pPr>
-      <w:spacing w:lineRule="auto" w:line="360" w:before="0" w:after="140"/>
+      <w:spacing w:lineRule="auto" w:line="360" w:before="0" w:after="0"/>
       <w:jc w:val="both"/>
     </w:pPr>
     <w:rPr>
@@ -41205,8 +41330,8 @@
       <w:smallCaps w:val="false"/>
     </w:rPr>
   </w:style>
-  <w:style w:type="paragraph" w:styleId="TableIndexHeadinguser">
-    <w:name w:val="Table Index Heading (user)"/>
+  <w:style w:type="paragraph" w:styleId="TableIndexHeading">
+    <w:name w:val="Table Index Heading"/>
     <w:basedOn w:val="IndexHeading"/>
     <w:qFormat/>
     <w:pPr>
@@ -41267,8 +41392,8 @@
       <w:smallCaps w:val="false"/>
     </w:rPr>
   </w:style>
-  <w:style w:type="paragraph" w:styleId="FooterLeft">
-    <w:name w:val="Footer Left"/>
+  <w:style w:type="paragraph" w:styleId="FooterLeftuser">
+    <w:name w:val="Footer Left (user)"/>
     <w:basedOn w:val="Footer"/>
     <w:qFormat/>
     <w:pPr>
@@ -41276,8 +41401,8 @@
     </w:pPr>
     <w:rPr/>
   </w:style>
-  <w:style w:type="paragraph" w:styleId="FooterRight">
-    <w:name w:val="Footer Right"/>
+  <w:style w:type="paragraph" w:styleId="FooterRightuser">
+    <w:name w:val="Footer Right (user)"/>
     <w:basedOn w:val="Footer"/>
     <w:qFormat/>
     <w:pPr>
@@ -41323,8 +41448,8 @@
       <w:smallCaps w:val="false"/>
     </w:rPr>
   </w:style>
-  <w:style w:type="paragraph" w:styleId="FrameContents">
-    <w:name w:val="Frame Contents"/>
+  <w:style w:type="paragraph" w:styleId="FrameContentsuser">
+    <w:name w:val="Frame Contents (user)"/>
     <w:basedOn w:val="Normal"/>
     <w:qFormat/>
     <w:pPr/>
@@ -41376,8 +41501,8 @@
       <w:caps/>
     </w:rPr>
   </w:style>
-  <w:style w:type="paragraph" w:styleId="HeaderLeft">
-    <w:name w:val="Header Left"/>
+  <w:style w:type="paragraph" w:styleId="HeaderLeftuser">
+    <w:name w:val="Header Left (user)"/>
     <w:basedOn w:val="Header"/>
     <w:qFormat/>
     <w:pPr>
@@ -41385,8 +41510,8 @@
     </w:pPr>
     <w:rPr/>
   </w:style>
-  <w:style w:type="paragraph" w:styleId="HeaderRight">
-    <w:name w:val="Header Right"/>
+  <w:style w:type="paragraph" w:styleId="HeaderRightuser">
+    <w:name w:val="Header Right (user)"/>
     <w:basedOn w:val="Header"/>
     <w:qFormat/>
     <w:pPr>

</xml_diff>

<commit_message>
using xmlCursor to append curricular form elements inthe right place and refactoring replacers
</commit_message>
<xml_diff>
--- a/src/main/resources/ppc.docx
+++ b/src/main/resources/ppc.docx
@@ -3198,7 +3198,7 @@
               <w:pStyle w:val="TableHeading"/>
               <w:widowControl/>
               <w:suppressAutoHyphens w:val="true"/>
-              <w:overflowPunct w:val="false"/>
+              <w:overflowPunct w:val="true"/>
               <w:bidi w:val="0"/>
               <w:spacing w:lineRule="auto" w:line="331" w:before="120" w:after="0"/>
               <w:ind w:hanging="0" w:left="0" w:right="0"/>
@@ -13952,7 +13952,7 @@
         <w:widowControl/>
         <w:shd w:val="clear" w:fill="FFFFFF"/>
         <w:suppressAutoHyphens w:val="true"/>
-        <w:overflowPunct w:val="false"/>
+        <w:overflowPunct w:val="true"/>
         <w:bidi w:val="0"/>
         <w:spacing w:lineRule="auto" w:line="360" w:before="0" w:after="0"/>
         <w:ind w:firstLine="709" w:left="0" w:right="0"/>
@@ -16844,8 +16844,8 @@
           <w:rFonts w:ascii="Times New Roman" w:hAnsi="Times New Roman"/>
         </w:rPr>
       </w:pPr>
-      <w:bookmarkStart w:id="58" w:name="__DdeLink__6479_642834953"/>
-      <w:bookmarkStart w:id="59" w:name="__DdeLink__3036_642834953"/>
+      <w:bookmarkStart w:id="58" w:name="__DdeLink__3036_642834953"/>
+      <w:bookmarkStart w:id="59" w:name="__DdeLink__6479_642834953"/>
       <w:r>
         <w:rPr>
           <w:sz w:val="24"/>
@@ -20914,7 +20914,7 @@
         <w:pStyle w:val="BodyText"/>
         <w:widowControl/>
         <w:suppressAutoHyphens w:val="true"/>
-        <w:overflowPunct w:val="false"/>
+        <w:overflowPunct w:val="true"/>
         <w:bidi w:val="0"/>
         <w:spacing w:lineRule="auto" w:line="360" w:before="709" w:after="709"/>
         <w:ind w:firstLine="709" w:left="0" w:right="0"/>
@@ -20947,7 +20947,7 @@
         <w:pStyle w:val="BodyText"/>
         <w:widowControl/>
         <w:suppressAutoHyphens w:val="true"/>
-        <w:overflowPunct w:val="false"/>
+        <w:overflowPunct w:val="true"/>
         <w:bidi w:val="0"/>
         <w:spacing w:lineRule="auto" w:line="360" w:before="709" w:after="709"/>
         <w:ind w:firstLine="709" w:left="0" w:right="0"/>
@@ -20980,7 +20980,7 @@
         <w:pStyle w:val="BodyText"/>
         <w:widowControl/>
         <w:suppressAutoHyphens w:val="true"/>
-        <w:overflowPunct w:val="false"/>
+        <w:overflowPunct w:val="true"/>
         <w:bidi w:val="0"/>
         <w:spacing w:lineRule="auto" w:line="360" w:before="709" w:after="709"/>
         <w:ind w:firstLine="709" w:left="0" w:right="0"/>
@@ -21327,7 +21327,7 @@
         <w:pStyle w:val="BodyText"/>
         <w:widowControl/>
         <w:suppressAutoHyphens w:val="true"/>
-        <w:overflowPunct w:val="false"/>
+        <w:overflowPunct w:val="true"/>
         <w:bidi w:val="0"/>
         <w:spacing w:before="0" w:after="0"/>
         <w:ind w:firstLine="709" w:left="0" w:right="0"/>
@@ -39355,6 +39355,80 @@
       <w:pPr>
         <w:pStyle w:val="BodyText"/>
         <w:spacing w:lineRule="auto" w:line="360"/>
+        <w:ind w:hanging="0" w:left="0"/>
+        <w:rPr>
+          <w:rFonts w:ascii="Times New Roman" w:hAnsi="Times New Roman"/>
+          <w:sz w:val="24"/>
+          <w:szCs w:val="24"/>
+        </w:rPr>
+      </w:pPr>
+      <w:r>
+        <w:rPr>
+          <w:sz w:val="24"/>
+          <w:szCs w:val="24"/>
+        </w:rPr>
+      </w:r>
+    </w:p>
+    <w:p>
+      <w:pPr>
+        <w:pStyle w:val="BodyText"/>
+        <w:spacing w:lineRule="auto" w:line="360"/>
+        <w:ind w:hanging="0" w:left="0"/>
+        <w:rPr>
+          <w:rFonts w:ascii="Times New Roman" w:hAnsi="Times New Roman"/>
+          <w:sz w:val="24"/>
+          <w:szCs w:val="24"/>
+        </w:rPr>
+      </w:pPr>
+      <w:r>
+        <w:rPr>
+          <w:sz w:val="24"/>
+          <w:szCs w:val="24"/>
+        </w:rPr>
+      </w:r>
+    </w:p>
+    <w:p>
+      <w:pPr>
+        <w:pStyle w:val="BodyText"/>
+        <w:spacing w:lineRule="auto" w:line="360"/>
+        <w:ind w:hanging="0" w:left="0"/>
+        <w:rPr>
+          <w:rFonts w:ascii="Times New Roman" w:hAnsi="Times New Roman"/>
+          <w:sz w:val="24"/>
+          <w:szCs w:val="24"/>
+        </w:rPr>
+      </w:pPr>
+      <w:r>
+        <w:rPr>
+          <w:sz w:val="24"/>
+          <w:szCs w:val="24"/>
+        </w:rPr>
+      </w:r>
+    </w:p>
+    <w:p>
+      <w:pPr>
+        <w:pStyle w:val="BodyText"/>
+        <w:spacing w:lineRule="auto" w:line="360"/>
+        <w:ind w:hanging="0" w:left="0"/>
+        <w:rPr>
+          <w:rFonts w:ascii="Times New Roman" w:hAnsi="Times New Roman"/>
+          <w:sz w:val="24"/>
+          <w:szCs w:val="24"/>
+        </w:rPr>
+      </w:pPr>
+      <w:r>
+        <w:rPr>
+          <w:sz w:val="24"/>
+          <w:szCs w:val="24"/>
+        </w:rPr>
+        <w:t>@@formulario_componentes_curriculares@@</w:t>
+      </w:r>
+    </w:p>
+    <w:p>
+      <w:pPr>
+        <w:pStyle w:val="BodyText"/>
+        <w:spacing w:lineRule="auto" w:line="360"/>
+        <w:ind w:hanging="0" w:left="0"/>
         <w:rPr>
           <w:rFonts w:ascii="Times New Roman" w:hAnsi="Times New Roman"/>
           <w:sz w:val="24"/>
@@ -40519,7 +40593,7 @@
     <w:pPr>
       <w:widowControl/>
       <w:suppressAutoHyphens w:val="true"/>
-      <w:overflowPunct w:val="false"/>
+      <w:overflowPunct w:val="true"/>
       <w:bidi w:val="0"/>
       <w:spacing w:lineRule="auto" w:line="360" w:before="0" w:after="0"/>
       <w:ind w:firstLine="709"/>
@@ -40706,8 +40780,8 @@
     <w:qFormat/>
     <w:rPr/>
   </w:style>
-  <w:style w:type="character" w:styleId="Bullets">
-    <w:name w:val="Bullets"/>
+  <w:style w:type="character" w:styleId="Bulletsuser">
+    <w:name w:val="Bullets (user)"/>
     <w:qFormat/>
     <w:rPr>
       <w:rFonts w:ascii="OpenSymbol" w:hAnsi="OpenSymbol" w:eastAsia="OpenSymbol" w:cs="OpenSymbol"/>
@@ -40984,8 +41058,8 @@
       <w:smallCaps w:val="false"/>
     </w:rPr>
   </w:style>
-  <w:style w:type="paragraph" w:styleId="TableIndexHeadinguser">
-    <w:name w:val="Table Index Heading (user)"/>
+  <w:style w:type="paragraph" w:styleId="TableIndexHeading">
+    <w:name w:val="Table Index Heading"/>
     <w:basedOn w:val="IndexHeading"/>
     <w:qFormat/>
     <w:pPr>
@@ -41046,8 +41120,8 @@
       <w:smallCaps w:val="false"/>
     </w:rPr>
   </w:style>
-  <w:style w:type="paragraph" w:styleId="FooterLeft">
-    <w:name w:val="Footer Left"/>
+  <w:style w:type="paragraph" w:styleId="FooterLeftuser">
+    <w:name w:val="Footer Left (user)"/>
     <w:basedOn w:val="Footer"/>
     <w:qFormat/>
     <w:pPr>
@@ -41055,8 +41129,8 @@
     </w:pPr>
     <w:rPr/>
   </w:style>
-  <w:style w:type="paragraph" w:styleId="FooterRight">
-    <w:name w:val="Footer Right"/>
+  <w:style w:type="paragraph" w:styleId="FooterRightuser">
+    <w:name w:val="Footer Right (user)"/>
     <w:basedOn w:val="Footer"/>
     <w:qFormat/>
     <w:pPr>
@@ -41102,8 +41176,8 @@
       <w:smallCaps w:val="false"/>
     </w:rPr>
   </w:style>
-  <w:style w:type="paragraph" w:styleId="FrameContents">
-    <w:name w:val="Frame Contents"/>
+  <w:style w:type="paragraph" w:styleId="FrameContentsuser">
+    <w:name w:val="Frame Contents (user)"/>
     <w:basedOn w:val="Normal"/>
     <w:qFormat/>
     <w:pPr/>
@@ -41155,8 +41229,8 @@
       <w:caps/>
     </w:rPr>
   </w:style>
-  <w:style w:type="paragraph" w:styleId="HeaderLeft">
-    <w:name w:val="Header Left"/>
+  <w:style w:type="paragraph" w:styleId="HeaderLeftuser">
+    <w:name w:val="Header Left (user)"/>
     <w:basedOn w:val="Header"/>
     <w:qFormat/>
     <w:pPr>
@@ -41164,8 +41238,8 @@
     </w:pPr>
     <w:rPr/>
   </w:style>
-  <w:style w:type="paragraph" w:styleId="HeaderRight">
-    <w:name w:val="Header Right"/>
+  <w:style w:type="paragraph" w:styleId="HeaderRightuser">
+    <w:name w:val="Header Right (user)"/>
     <w:basedOn w:val="Header"/>
     <w:qFormat/>
     <w:pPr>

</xml_diff>